<commit_message>
docs: Adicionando novas sessões na monografia (Estrutura de grupos e OUs + requisitos de segurança)
</commit_message>
<xml_diff>
--- a/docs/docs/Faculdade de Tecnologia Padre Danilo José de Oliveira Ohl.docx
+++ b/docs/docs/Faculdade de Tecnologia Padre Danilo José de Oliveira Ohl.docx
@@ -1559,7 +1559,7 @@
           <w:r>
             <w:fldChar w:fldCharType="separate"/>
           </w:r>
-          <w:hyperlink w:anchor="_Toc237900482" w:history="1">
+          <w:hyperlink w:anchor="_Toc238051048" w:history="1">
             <w:r>
               <w:rPr>
                 <w:rStyle w:val="Hyperlink"/>
@@ -1586,7 +1586,7 @@
                 <w:noProof/>
                 <w:webHidden/>
               </w:rPr>
-              <w:instrText xml:space="preserve"> PAGEREF _Toc237900482 \h </w:instrText>
+              <w:instrText xml:space="preserve"> PAGEREF _Toc238051048 \h </w:instrText>
             </w:r>
             <w:r>
               <w:rPr>
@@ -1630,7 +1630,7 @@
               <w:color w:val="auto"/>
             </w:rPr>
           </w:pPr>
-          <w:hyperlink w:anchor="_Toc237900483" w:history="1">
+          <w:hyperlink w:anchor="_Toc238051049" w:history="1">
             <w:r>
               <w:rPr>
                 <w:rStyle w:val="Hyperlink"/>
@@ -1672,7 +1672,7 @@
                 <w:noProof/>
                 <w:webHidden/>
               </w:rPr>
-              <w:instrText xml:space="preserve"> PAGEREF _Toc237900483 \h </w:instrText>
+              <w:instrText xml:space="preserve"> PAGEREF _Toc238051049 \h </w:instrText>
             </w:r>
             <w:r>
               <w:rPr>
@@ -1716,7 +1716,7 @@
               <w:color w:val="auto"/>
             </w:rPr>
           </w:pPr>
-          <w:hyperlink w:anchor="_Toc237900484" w:history="1">
+          <w:hyperlink w:anchor="_Toc238051050" w:history="1">
             <w:r>
               <w:rPr>
                 <w:rStyle w:val="Hyperlink"/>
@@ -1758,7 +1758,7 @@
                 <w:noProof/>
                 <w:webHidden/>
               </w:rPr>
-              <w:instrText xml:space="preserve"> PAGEREF _Toc237900484 \h </w:instrText>
+              <w:instrText xml:space="preserve"> PAGEREF _Toc238051050 \h </w:instrText>
             </w:r>
             <w:r>
               <w:rPr>
@@ -1802,7 +1802,7 @@
               <w:color w:val="auto"/>
             </w:rPr>
           </w:pPr>
-          <w:hyperlink w:anchor="_Toc237900485" w:history="1">
+          <w:hyperlink w:anchor="_Toc238051051" w:history="1">
             <w:r>
               <w:rPr>
                 <w:rStyle w:val="Hyperlink"/>
@@ -1844,7 +1844,7 @@
                 <w:noProof/>
                 <w:webHidden/>
               </w:rPr>
-              <w:instrText xml:space="preserve"> PAGEREF _Toc237900485 \h </w:instrText>
+              <w:instrText xml:space="preserve"> PAGEREF _Toc238051051 \h </w:instrText>
             </w:r>
             <w:r>
               <w:rPr>
@@ -1888,7 +1888,7 @@
               <w:color w:val="auto"/>
             </w:rPr>
           </w:pPr>
-          <w:hyperlink w:anchor="_Toc237900486" w:history="1">
+          <w:hyperlink w:anchor="_Toc238051052" w:history="1">
             <w:r>
               <w:rPr>
                 <w:rStyle w:val="Hyperlink"/>
@@ -1930,7 +1930,7 @@
                 <w:noProof/>
                 <w:webHidden/>
               </w:rPr>
-              <w:instrText xml:space="preserve"> PAGEREF _Toc237900486 \h </w:instrText>
+              <w:instrText xml:space="preserve"> PAGEREF _Toc238051052 \h </w:instrText>
             </w:r>
             <w:r>
               <w:rPr>
@@ -1968,30 +1968,18 @@
               <w:tab w:val="right" w:leader="dot" w:pos="8560"/>
             </w:tabs>
             <w:rPr>
+              <w:rFonts w:asciiTheme="minorHAnsi" w:eastAsiaTheme="minorEastAsia" w:hAnsiTheme="minorHAnsi" w:cstheme="minorBidi"/>
               <w:noProof/>
+              <w:color w:val="auto"/>
             </w:rPr>
           </w:pPr>
-          <w:hyperlink w:anchor="_Toc237900487" w:history="1">
+          <w:hyperlink w:anchor="_Toc238051053" w:history="1">
             <w:r>
               <w:rPr>
                 <w:rStyle w:val="Hyperlink"/>
                 <w:noProof/>
               </w:rPr>
-              <w:t>4.1 Objetivo d</w:t>
-            </w:r>
-            <w:r>
-              <w:rPr>
-                <w:rStyle w:val="Hyperlink"/>
-                <w:noProof/>
-              </w:rPr>
-              <w:t>a</w:t>
-            </w:r>
-            <w:r>
-              <w:rPr>
-                <w:rStyle w:val="Hyperlink"/>
-                <w:noProof/>
-              </w:rPr>
-              <w:t xml:space="preserve"> definição de perfis</w:t>
+              <w:t>4.1 Objetivo da definição de perfis</w:t>
             </w:r>
             <w:r>
               <w:rPr>
@@ -2012,7 +2000,7 @@
                 <w:noProof/>
                 <w:webHidden/>
               </w:rPr>
-              <w:instrText xml:space="preserve"> PAGEREF _Toc237900487 \h </w:instrText>
+              <w:instrText xml:space="preserve"> PAGEREF _Toc238051053 \h </w:instrText>
             </w:r>
             <w:r>
               <w:rPr>
@@ -2050,10 +2038,12 @@
               <w:tab w:val="right" w:leader="dot" w:pos="8560"/>
             </w:tabs>
             <w:rPr>
+              <w:rFonts w:asciiTheme="minorHAnsi" w:eastAsiaTheme="minorEastAsia" w:hAnsiTheme="minorHAnsi" w:cstheme="minorBidi"/>
               <w:noProof/>
+              <w:color w:val="auto"/>
             </w:rPr>
           </w:pPr>
-          <w:hyperlink w:anchor="_Toc237900488" w:history="1">
+          <w:hyperlink w:anchor="_Toc238051054" w:history="1">
             <w:r>
               <w:rPr>
                 <w:rStyle w:val="Hyperlink"/>
@@ -2080,7 +2070,7 @@
                 <w:noProof/>
                 <w:webHidden/>
               </w:rPr>
-              <w:instrText xml:space="preserve"> PAGEREF _Toc237900488 \h </w:instrText>
+              <w:instrText xml:space="preserve"> PAGEREF _Toc238051054 \h </w:instrText>
             </w:r>
             <w:r>
               <w:rPr>
@@ -2118,10 +2108,12 @@
               <w:tab w:val="right" w:leader="dot" w:pos="8560"/>
             </w:tabs>
             <w:rPr>
+              <w:rFonts w:asciiTheme="minorHAnsi" w:eastAsiaTheme="minorEastAsia" w:hAnsiTheme="minorHAnsi" w:cstheme="minorBidi"/>
               <w:noProof/>
+              <w:color w:val="auto"/>
             </w:rPr>
           </w:pPr>
-          <w:hyperlink w:anchor="_Toc237900489" w:history="1">
+          <w:hyperlink w:anchor="_Toc238051055" w:history="1">
             <w:r>
               <w:rPr>
                 <w:rStyle w:val="Hyperlink"/>
@@ -2148,7 +2140,7 @@
                 <w:noProof/>
                 <w:webHidden/>
               </w:rPr>
-              <w:instrText xml:space="preserve"> PAGEREF _Toc237900489 \h </w:instrText>
+              <w:instrText xml:space="preserve"> PAGEREF _Toc238051055 \h </w:instrText>
             </w:r>
             <w:r>
               <w:rPr>
@@ -2186,10 +2178,12 @@
               <w:tab w:val="right" w:leader="dot" w:pos="8560"/>
             </w:tabs>
             <w:rPr>
+              <w:rFonts w:asciiTheme="minorHAnsi" w:eastAsiaTheme="minorEastAsia" w:hAnsiTheme="minorHAnsi" w:cstheme="minorBidi"/>
               <w:noProof/>
+              <w:color w:val="auto"/>
             </w:rPr>
           </w:pPr>
-          <w:hyperlink w:anchor="_Toc237900490" w:history="1">
+          <w:hyperlink w:anchor="_Toc238051056" w:history="1">
             <w:r>
               <w:rPr>
                 <w:rStyle w:val="Hyperlink"/>
@@ -2216,7 +2210,7 @@
                 <w:noProof/>
                 <w:webHidden/>
               </w:rPr>
-              <w:instrText xml:space="preserve"> PAGEREF _Toc237900490 \h </w:instrText>
+              <w:instrText xml:space="preserve"> PAGEREF _Toc238051056 \h </w:instrText>
             </w:r>
             <w:r>
               <w:rPr>
@@ -2236,7 +2230,7 @@
                 <w:noProof/>
                 <w:webHidden/>
               </w:rPr>
-              <w:t>14</w:t>
+              <w:t>13</w:t>
             </w:r>
             <w:r>
               <w:rPr>
@@ -2254,10 +2248,12 @@
               <w:tab w:val="right" w:leader="dot" w:pos="8560"/>
             </w:tabs>
             <w:rPr>
+              <w:rFonts w:asciiTheme="minorHAnsi" w:eastAsiaTheme="minorEastAsia" w:hAnsiTheme="minorHAnsi" w:cstheme="minorBidi"/>
               <w:noProof/>
+              <w:color w:val="auto"/>
             </w:rPr>
           </w:pPr>
-          <w:hyperlink w:anchor="_Toc237900491" w:history="1">
+          <w:hyperlink w:anchor="_Toc238051057" w:history="1">
             <w:r>
               <w:rPr>
                 <w:rStyle w:val="Hyperlink"/>
@@ -2284,7 +2280,7 @@
                 <w:noProof/>
                 <w:webHidden/>
               </w:rPr>
-              <w:instrText xml:space="preserve"> PAGEREF _Toc237900491 \h </w:instrText>
+              <w:instrText xml:space="preserve"> PAGEREF _Toc238051057 \h </w:instrText>
             </w:r>
             <w:r>
               <w:rPr>
@@ -2305,6 +2301,178 @@
                 <w:webHidden/>
               </w:rPr>
               <w:t>14</w:t>
+            </w:r>
+            <w:r>
+              <w:rPr>
+                <w:noProof/>
+                <w:webHidden/>
+              </w:rPr>
+              <w:fldChar w:fldCharType="end"/>
+            </w:r>
+          </w:hyperlink>
+        </w:p>
+        <w:p>
+          <w:pPr>
+            <w:pStyle w:val="TOC1"/>
+            <w:tabs>
+              <w:tab w:val="left" w:pos="480"/>
+              <w:tab w:val="right" w:leader="dot" w:pos="8560"/>
+            </w:tabs>
+            <w:rPr>
+              <w:rFonts w:asciiTheme="minorHAnsi" w:eastAsiaTheme="minorEastAsia" w:hAnsiTheme="minorHAnsi" w:cstheme="minorBidi"/>
+              <w:noProof/>
+              <w:color w:val="auto"/>
+            </w:rPr>
+          </w:pPr>
+          <w:hyperlink w:anchor="_Toc238051058" w:history="1">
+            <w:r>
+              <w:rPr>
+                <w:rStyle w:val="Hyperlink"/>
+                <w:noProof/>
+              </w:rPr>
+              <w:t>5.</w:t>
+            </w:r>
+            <w:r>
+              <w:rPr>
+                <w:rFonts w:asciiTheme="minorHAnsi" w:eastAsiaTheme="minorEastAsia" w:hAnsiTheme="minorHAnsi" w:cstheme="minorBidi"/>
+                <w:noProof/>
+                <w:color w:val="auto"/>
+              </w:rPr>
+              <w:tab/>
+            </w:r>
+            <w:r>
+              <w:rPr>
+                <w:rStyle w:val="Hyperlink"/>
+                <w:noProof/>
+              </w:rPr>
+              <w:t>Requisitos de Segurança</w:t>
+            </w:r>
+            <w:r>
+              <w:rPr>
+                <w:noProof/>
+                <w:webHidden/>
+              </w:rPr>
+              <w:tab/>
+            </w:r>
+            <w:r>
+              <w:rPr>
+                <w:noProof/>
+                <w:webHidden/>
+              </w:rPr>
+              <w:fldChar w:fldCharType="begin"/>
+            </w:r>
+            <w:r>
+              <w:rPr>
+                <w:noProof/>
+                <w:webHidden/>
+              </w:rPr>
+              <w:instrText xml:space="preserve"> PAGEREF _Toc238051058 \h </w:instrText>
+            </w:r>
+            <w:r>
+              <w:rPr>
+                <w:noProof/>
+                <w:webHidden/>
+              </w:rPr>
+            </w:r>
+            <w:r>
+              <w:rPr>
+                <w:noProof/>
+                <w:webHidden/>
+              </w:rPr>
+              <w:fldChar w:fldCharType="separate"/>
+            </w:r>
+            <w:r>
+              <w:rPr>
+                <w:noProof/>
+                <w:webHidden/>
+              </w:rPr>
+              <w:t>15</w:t>
+            </w:r>
+            <w:r>
+              <w:rPr>
+                <w:noProof/>
+                <w:webHidden/>
+              </w:rPr>
+              <w:fldChar w:fldCharType="end"/>
+            </w:r>
+          </w:hyperlink>
+        </w:p>
+        <w:p>
+          <w:pPr>
+            <w:pStyle w:val="TOC1"/>
+            <w:tabs>
+              <w:tab w:val="left" w:pos="480"/>
+              <w:tab w:val="right" w:leader="dot" w:pos="8560"/>
+            </w:tabs>
+            <w:rPr>
+              <w:rFonts w:asciiTheme="minorHAnsi" w:eastAsiaTheme="minorEastAsia" w:hAnsiTheme="minorHAnsi" w:cstheme="minorBidi"/>
+              <w:noProof/>
+              <w:color w:val="auto"/>
+            </w:rPr>
+          </w:pPr>
+          <w:hyperlink w:anchor="_Toc238051059" w:history="1">
+            <w:r>
+              <w:rPr>
+                <w:rStyle w:val="Hyperlink"/>
+                <w:noProof/>
+              </w:rPr>
+              <w:t>6.</w:t>
+            </w:r>
+            <w:r>
+              <w:rPr>
+                <w:rFonts w:asciiTheme="minorHAnsi" w:eastAsiaTheme="minorEastAsia" w:hAnsiTheme="minorHAnsi" w:cstheme="minorBidi"/>
+                <w:noProof/>
+                <w:color w:val="auto"/>
+              </w:rPr>
+              <w:tab/>
+            </w:r>
+            <w:r>
+              <w:rPr>
+                <w:rStyle w:val="Hyperlink"/>
+                <w:noProof/>
+              </w:rPr>
+              <w:t>Estrutura de grupos e Ous</w:t>
+            </w:r>
+            <w:r>
+              <w:rPr>
+                <w:noProof/>
+                <w:webHidden/>
+              </w:rPr>
+              <w:tab/>
+            </w:r>
+            <w:r>
+              <w:rPr>
+                <w:noProof/>
+                <w:webHidden/>
+              </w:rPr>
+              <w:fldChar w:fldCharType="begin"/>
+            </w:r>
+            <w:r>
+              <w:rPr>
+                <w:noProof/>
+                <w:webHidden/>
+              </w:rPr>
+              <w:instrText xml:space="preserve"> PAGEREF _Toc238051059 \h </w:instrText>
+            </w:r>
+            <w:r>
+              <w:rPr>
+                <w:noProof/>
+                <w:webHidden/>
+              </w:rPr>
+            </w:r>
+            <w:r>
+              <w:rPr>
+                <w:noProof/>
+                <w:webHidden/>
+              </w:rPr>
+              <w:fldChar w:fldCharType="separate"/>
+            </w:r>
+            <w:r>
+              <w:rPr>
+                <w:noProof/>
+                <w:webHidden/>
+              </w:rPr>
+              <w:t>17</w:t>
             </w:r>
             <w:r>
               <w:rPr>
@@ -2588,7 +2756,7 @@
     <w:p>
       <w:pPr>
         <w:spacing w:after="0" w:line="259" w:lineRule="auto"/>
-        <w:ind w:left="3540" w:firstLine="0"/>
+        <w:ind w:left="0" w:firstLine="0"/>
         <w:rPr>
           <w:b/>
           <w:bCs/>
@@ -2598,42 +2766,9 @@
     </w:p>
     <w:p>
       <w:pPr>
-        <w:spacing w:after="0" w:line="259" w:lineRule="auto"/>
-        <w:ind w:left="3540" w:firstLine="0"/>
-        <w:rPr>
-          <w:b/>
-          <w:bCs/>
-          <w:lang w:val="en-US"/>
-        </w:rPr>
-      </w:pPr>
-    </w:p>
-    <w:p>
-      <w:pPr>
-        <w:spacing w:after="0" w:line="259" w:lineRule="auto"/>
-        <w:ind w:left="3540" w:firstLine="0"/>
-        <w:rPr>
-          <w:b/>
-          <w:bCs/>
-          <w:lang w:val="en-US"/>
-        </w:rPr>
-      </w:pPr>
-    </w:p>
-    <w:p>
-      <w:pPr>
-        <w:spacing w:after="0" w:line="259" w:lineRule="auto"/>
-        <w:ind w:left="3540" w:firstLine="0"/>
-        <w:rPr>
-          <w:b/>
-          <w:bCs/>
-          <w:lang w:val="en-US"/>
-        </w:rPr>
-      </w:pPr>
-    </w:p>
-    <w:p>
-      <w:pPr>
         <w:pStyle w:val="Heading1"/>
       </w:pPr>
-      <w:bookmarkStart w:id="0" w:name="_Toc237900482"/>
+      <w:bookmarkStart w:id="0" w:name="_Toc238051048"/>
       <w:r>
         <w:lastRenderedPageBreak/>
         <w:t>INTRODUÇÃO</w:t>
@@ -2720,7 +2855,7 @@
           <w:numId w:val="3"/>
         </w:numPr>
       </w:pPr>
-      <w:bookmarkStart w:id="1" w:name="_Toc237900483"/>
+      <w:bookmarkStart w:id="1" w:name="_Toc238051049"/>
       <w:r>
         <w:lastRenderedPageBreak/>
         <w:t>Mapeamento dos setores da faculdade</w:t>
@@ -3979,7 +4114,7 @@
           <w:numId w:val="3"/>
         </w:numPr>
       </w:pPr>
-      <w:bookmarkStart w:id="2" w:name="_Toc237900484"/>
+      <w:bookmarkStart w:id="2" w:name="_Toc238051050"/>
       <w:r>
         <w:t>Mapeamento da Estrutura de Unidades Organizacionais</w:t>
       </w:r>
@@ -4794,7 +4929,7 @@
           <w:numId w:val="3"/>
         </w:numPr>
       </w:pPr>
-      <w:bookmarkStart w:id="3" w:name="_Toc237900485"/>
+      <w:bookmarkStart w:id="3" w:name="_Toc238051051"/>
       <w:r>
         <w:lastRenderedPageBreak/>
         <w:t>LEVANTAMENTO DA INFRAESTRUTURA DE SERVIDORES E REDE</w:t>
@@ -5000,7 +5135,7 @@
         </w:numPr>
         <w:ind w:left="360" w:firstLine="0"/>
       </w:pPr>
-      <w:bookmarkStart w:id="4" w:name="_Toc237900486"/>
+      <w:bookmarkStart w:id="4" w:name="_Toc238051052"/>
       <w:r>
         <w:lastRenderedPageBreak/>
         <w:t>Identificando perfis de usuário</w:t>
@@ -5015,7 +5150,7 @@
       <w:pPr>
         <w:pStyle w:val="Heading2"/>
       </w:pPr>
-      <w:bookmarkStart w:id="5" w:name="_Toc237900487"/>
+      <w:bookmarkStart w:id="5" w:name="_Toc238051053"/>
       <w:r>
         <w:t xml:space="preserve">4.1 </w:t>
       </w:r>
@@ -5040,7 +5175,7 @@
       <w:r>
         <w:tab/>
       </w:r>
-      <w:bookmarkStart w:id="6" w:name="_Toc237900488"/>
+      <w:bookmarkStart w:id="6" w:name="_Toc238051054"/>
       <w:r>
         <w:t>4.2. Perfil de alunos</w:t>
       </w:r>
@@ -5059,7 +5194,7 @@
       <w:r>
         <w:tab/>
       </w:r>
-      <w:bookmarkStart w:id="7" w:name="_Toc237900489"/>
+      <w:bookmarkStart w:id="7" w:name="_Toc238051055"/>
       <w:r>
         <w:t>4.3. Perfil de professores</w:t>
       </w:r>
@@ -5075,7 +5210,7 @@
       <w:pPr>
         <w:pStyle w:val="Heading2"/>
       </w:pPr>
-      <w:bookmarkStart w:id="8" w:name="_Toc237900490"/>
+      <w:bookmarkStart w:id="8" w:name="_Toc238051056"/>
       <w:r>
         <w:t>4.4. Perfil Administrativo</w:t>
       </w:r>
@@ -5094,7 +5229,7 @@
       <w:r>
         <w:tab/>
       </w:r>
-      <w:bookmarkStart w:id="9" w:name="_Toc237900491"/>
+      <w:bookmarkStart w:id="9" w:name="_Toc238051057"/>
       <w:r>
         <w:t>4.5 Diretrizes de segurança e política de senha</w:t>
       </w:r>
@@ -5112,13 +5247,794 @@
     <w:p/>
     <w:p/>
     <w:p/>
-    <w:p>
-      <w:pPr>
-        <w:pStyle w:val="ListParagraph"/>
-        <w:ind w:left="2484" w:firstLine="0"/>
-      </w:pPr>
-    </w:p>
-    <w:p/>
+    <w:p/>
+    <w:p/>
+    <w:p/>
+    <w:p/>
+    <w:p/>
+    <w:p/>
+    <w:p/>
+    <w:p/>
+    <w:p/>
+    <w:p/>
+    <w:p/>
+    <w:p/>
+    <w:p/>
+    <w:p/>
+    <w:p/>
+    <w:p/>
+    <w:p/>
+    <w:p/>
+    <w:p/>
+    <w:p/>
+    <w:p/>
+    <w:p/>
+    <w:p/>
+    <w:p/>
+    <w:p/>
+    <w:p/>
+    <w:p/>
+    <w:p/>
+    <w:p>
+      <w:pPr>
+        <w:ind w:left="0" w:firstLine="0"/>
+      </w:pPr>
+    </w:p>
+    <w:p>
+      <w:pPr>
+        <w:pStyle w:val="Heading1"/>
+        <w:numPr>
+          <w:ilvl w:val="0"/>
+          <w:numId w:val="3"/>
+        </w:numPr>
+      </w:pPr>
+      <w:bookmarkStart w:id="10" w:name="_Toc238051058"/>
+      <w:r>
+        <w:lastRenderedPageBreak/>
+        <w:t>Requisitos de Segurança</w:t>
+      </w:r>
+      <w:bookmarkEnd w:id="10"/>
+    </w:p>
+    <w:p/>
+    <w:p>
+      <w:r>
+        <w:t xml:space="preserve">A definição de requisitos de segurança no Active Directory é uma etapa crítica para garantir a integridade, confidencialidade e disponibilidade dos recursos institucionais. De acordo com a documentação oficial da </w:t>
+      </w:r>
+      <w:r>
+        <w:rPr>
+          <w:b/>
+          <w:bCs/>
+        </w:rPr>
+        <w:t>Microsoft Learn</w:t>
+      </w:r>
+      <w:r>
+        <w:t xml:space="preserve">, a configuração de políticas de segurança deve seguir princípios como </w:t>
+      </w:r>
+      <w:r>
+        <w:rPr>
+          <w:b/>
+          <w:bCs/>
+        </w:rPr>
+        <w:t>complexidade de senhas</w:t>
+      </w:r>
+      <w:r>
+        <w:t xml:space="preserve">, </w:t>
+      </w:r>
+      <w:r>
+        <w:rPr>
+          <w:b/>
+          <w:bCs/>
+        </w:rPr>
+        <w:t>bloqueio de contas após tentativas inválidas</w:t>
+      </w:r>
+      <w:r>
+        <w:t xml:space="preserve">, </w:t>
+      </w:r>
+      <w:r>
+        <w:rPr>
+          <w:b/>
+          <w:bCs/>
+        </w:rPr>
+        <w:t>auditoria de acessos</w:t>
+      </w:r>
+      <w:r>
+        <w:t xml:space="preserve"> e </w:t>
+      </w:r>
+      <w:r>
+        <w:rPr>
+          <w:b/>
+          <w:bCs/>
+        </w:rPr>
+        <w:t>aplicação do princípio do menor privilégio</w:t>
+      </w:r>
+      <w:r>
+        <w:t xml:space="preserve">. Essas medidas são complementadas por recomendações de órgãos internacionais como o </w:t>
+      </w:r>
+      <w:r>
+        <w:rPr>
+          <w:b/>
+          <w:bCs/>
+        </w:rPr>
+        <w:t>NIST</w:t>
+      </w:r>
+      <w:r>
+        <w:t xml:space="preserve"> e normas da </w:t>
+      </w:r>
+      <w:r>
+        <w:rPr>
+          <w:b/>
+          <w:bCs/>
+        </w:rPr>
+        <w:t>ISO/IEC 27001</w:t>
+      </w:r>
+      <w:r>
+        <w:t>, que reforçam a importância de controles técnicos e administrativos para ambientes corporativos e educacionais.</w:t>
+      </w:r>
+    </w:p>
+    <w:p>
+      <w:r>
+        <w:t>Os requisitos definidos para este projeto incluem:</w:t>
+      </w:r>
+    </w:p>
+    <w:p>
+      <w:pPr>
+        <w:numPr>
+          <w:ilvl w:val="0"/>
+          <w:numId w:val="8"/>
+        </w:numPr>
+      </w:pPr>
+      <w:r>
+        <w:rPr>
+          <w:b/>
+          <w:bCs/>
+        </w:rPr>
+        <w:t>Política de senhas fortes</w:t>
+      </w:r>
+      <w:r>
+        <w:t xml:space="preserve">: exigência de no mínimo 12 caracteres, incluindo letras maiúsculas, minúsculas, números e símbolos, com troca obrigatória no primeiro acesso e expiração periódica. Essa prática é recomendada pela Microsoft Learn como parte das </w:t>
+      </w:r>
+      <w:r>
+        <w:rPr>
+          <w:b/>
+          <w:bCs/>
+        </w:rPr>
+        <w:t>Account Policies</w:t>
+      </w:r>
+      <w:r>
+        <w:t>, sendo considerada a primeira barreira contra acessos indevidos.</w:t>
+      </w:r>
+    </w:p>
+    <w:p>
+      <w:pPr>
+        <w:numPr>
+          <w:ilvl w:val="0"/>
+          <w:numId w:val="8"/>
+        </w:numPr>
+      </w:pPr>
+      <w:r>
+        <w:rPr>
+          <w:b/>
+          <w:bCs/>
+        </w:rPr>
+        <w:t>Bloqueio de contas</w:t>
+      </w:r>
+      <w:r>
+        <w:t>: implementação de bloqueio automático após cinco tentativas consecutivas de login mal-sucedidas, prevenindo ataques de força bruta.</w:t>
+      </w:r>
+    </w:p>
+    <w:p>
+      <w:pPr>
+        <w:numPr>
+          <w:ilvl w:val="0"/>
+          <w:numId w:val="8"/>
+        </w:numPr>
+      </w:pPr>
+      <w:r>
+        <w:rPr>
+          <w:b/>
+          <w:bCs/>
+        </w:rPr>
+        <w:t>Restrições de personalização e ferramentas administrativas</w:t>
+      </w:r>
+      <w:r>
+        <w:t>: bloqueio de acesso ao Editor de Registro, Prompt de Comando, Painel de Controle e alterações na área de trabalho, evitando que usuários modifiquem configurações críticas.</w:t>
+      </w:r>
+    </w:p>
+    <w:p>
+      <w:pPr>
+        <w:numPr>
+          <w:ilvl w:val="0"/>
+          <w:numId w:val="8"/>
+        </w:numPr>
+      </w:pPr>
+      <w:r>
+        <w:rPr>
+          <w:b/>
+          <w:bCs/>
+        </w:rPr>
+        <w:t>Auditoria de acessos</w:t>
+      </w:r>
+      <w:r>
+        <w:t>: registro detalhado de logins, falhas de autenticação e acessos a recursos críticos, com geração de relatórios periódicos para análise da equipe de TI.</w:t>
+      </w:r>
+    </w:p>
+    <w:p>
+      <w:pPr>
+        <w:numPr>
+          <w:ilvl w:val="0"/>
+          <w:numId w:val="8"/>
+        </w:numPr>
+      </w:pPr>
+      <w:r>
+        <w:rPr>
+          <w:b/>
+          <w:bCs/>
+        </w:rPr>
+        <w:t>Controle de softwares e dispositivos</w:t>
+      </w:r>
+      <w:r>
+        <w:t>: bloqueio da instalação de programas sem privilégios administrativos e restrição ao uso de dispositivos externos não autorizados, reduzindo riscos de malware e vazamento de dados.</w:t>
+      </w:r>
+    </w:p>
+    <w:p>
+      <w:pPr>
+        <w:numPr>
+          <w:ilvl w:val="0"/>
+          <w:numId w:val="8"/>
+        </w:numPr>
+      </w:pPr>
+      <w:r>
+        <w:rPr>
+          <w:b/>
+          <w:bCs/>
+        </w:rPr>
+        <w:t>Sessões ociosas</w:t>
+      </w:r>
+      <w:r>
+        <w:t>: bloqueio automático após período de inatividade, prevenindo uso indevido de máquinas deixadas abertas.</w:t>
+      </w:r>
+    </w:p>
+    <w:p>
+      <w:pPr>
+        <w:numPr>
+          <w:ilvl w:val="0"/>
+          <w:numId w:val="8"/>
+        </w:numPr>
+      </w:pPr>
+      <w:r>
+        <w:rPr>
+          <w:b/>
+          <w:bCs/>
+        </w:rPr>
+        <w:t>Atualizações automáticas</w:t>
+      </w:r>
+      <w:r>
+        <w:t>: aplicação obrigatória de patches e correções de segurança, conforme orientações da Microsoft Learn sobre manutenção contínua de sistemas.</w:t>
+      </w:r>
+    </w:p>
+    <w:p>
+      <w:pPr>
+        <w:numPr>
+          <w:ilvl w:val="0"/>
+          <w:numId w:val="8"/>
+        </w:numPr>
+      </w:pPr>
+      <w:r>
+        <w:rPr>
+          <w:b/>
+          <w:bCs/>
+        </w:rPr>
+        <w:t>Gestão de privilégios</w:t>
+      </w:r>
+      <w:r>
+        <w:t>: separação de contas administrativas das contas de uso diário e aplicação do princípio do menor privilégio, garantindo que cada usuário tenha apenas o acesso necessário.</w:t>
+      </w:r>
+    </w:p>
+    <w:p>
+      <w:pPr>
+        <w:numPr>
+          <w:ilvl w:val="0"/>
+          <w:numId w:val="8"/>
+        </w:numPr>
+      </w:pPr>
+      <w:r>
+        <w:rPr>
+          <w:b/>
+          <w:bCs/>
+        </w:rPr>
+        <w:t>Proteção avançada de credenciais</w:t>
+      </w:r>
+      <w:r>
+        <w:t xml:space="preserve">: recomendação do uso de </w:t>
+      </w:r>
+      <w:r>
+        <w:rPr>
+          <w:b/>
+          <w:bCs/>
+        </w:rPr>
+        <w:t>Credential Guard</w:t>
+      </w:r>
+      <w:r>
+        <w:t xml:space="preserve"> e do grupo </w:t>
+      </w:r>
+      <w:r>
+        <w:rPr>
+          <w:b/>
+          <w:bCs/>
+        </w:rPr>
+        <w:t>Usuários Protegidos</w:t>
+      </w:r>
+      <w:r>
+        <w:t xml:space="preserve">, conforme indicado pela Microsoft Learn, para mitigar ataques como </w:t>
+      </w:r>
+      <w:r>
+        <w:rPr>
+          <w:i/>
+          <w:iCs/>
+        </w:rPr>
+        <w:t>pass-the-hash</w:t>
+      </w:r>
+      <w:r>
+        <w:t xml:space="preserve"> e roubo de credenciais em memória.</w:t>
+      </w:r>
+    </w:p>
+    <w:p>
+      <w:r>
+        <w:lastRenderedPageBreak/>
+        <w:t xml:space="preserve">Essas políticas foram definidas com base em fontes técnicas confiáveis, como </w:t>
+      </w:r>
+      <w:r>
+        <w:rPr>
+          <w:b/>
+          <w:bCs/>
+        </w:rPr>
+        <w:t>Microsoft Learn</w:t>
+      </w:r>
+      <w:r>
+        <w:t xml:space="preserve">, </w:t>
+      </w:r>
+      <w:r>
+        <w:rPr>
+          <w:b/>
+          <w:bCs/>
+        </w:rPr>
+        <w:t>NIST</w:t>
+      </w:r>
+      <w:r>
+        <w:t xml:space="preserve">, </w:t>
+      </w:r>
+      <w:r>
+        <w:rPr>
+          <w:b/>
+          <w:bCs/>
+        </w:rPr>
+        <w:t>ISO/IEC 27001</w:t>
+      </w:r>
+      <w:r>
+        <w:t xml:space="preserve"> e literatura acadêmica disponível em bases como </w:t>
+      </w:r>
+      <w:r>
+        <w:rPr>
+          <w:b/>
+          <w:bCs/>
+        </w:rPr>
+        <w:t>IEEE Xplore</w:t>
+      </w:r>
+      <w:r>
+        <w:t xml:space="preserve">, </w:t>
+      </w:r>
+      <w:r>
+        <w:rPr>
+          <w:b/>
+          <w:bCs/>
+        </w:rPr>
+        <w:t>ACM Digital Library</w:t>
+      </w:r>
+      <w:r>
+        <w:t xml:space="preserve"> e </w:t>
+      </w:r>
+      <w:r>
+        <w:rPr>
+          <w:b/>
+          <w:bCs/>
+        </w:rPr>
+        <w:t>Portal de Periódicos CAPES</w:t>
+      </w:r>
+      <w:r>
+        <w:t xml:space="preserve">. A adoção dessas medidas assegura que o Active Directory não apenas centralize a autenticação, mas também estabeleça um </w:t>
+      </w:r>
+      <w:r>
+        <w:rPr>
+          <w:b/>
+          <w:bCs/>
+        </w:rPr>
+        <w:t>padrão mínimo de proteção robusto</w:t>
+      </w:r>
+      <w:r>
+        <w:t>, alinhado às melhores práticas internacionais e adaptado ao contexto institucional.</w:t>
+      </w:r>
+    </w:p>
+    <w:p/>
+    <w:p/>
+    <w:p/>
+    <w:p/>
+    <w:p/>
+    <w:p/>
+    <w:p/>
+    <w:p/>
+    <w:p/>
+    <w:p/>
+    <w:p/>
+    <w:p/>
+    <w:p/>
+    <w:p/>
+    <w:p/>
+    <w:p/>
+    <w:p/>
+    <w:p/>
+    <w:p/>
+    <w:p/>
+    <w:p/>
+    <w:p/>
+    <w:p/>
+    <w:p/>
+    <w:p/>
+    <w:p/>
+    <w:p/>
+    <w:p>
+      <w:pPr>
+        <w:pStyle w:val="Heading1"/>
+        <w:ind w:left="0" w:firstLine="0"/>
+        <w:jc w:val="both"/>
+      </w:pPr>
+    </w:p>
+    <w:p>
+      <w:pPr>
+        <w:pStyle w:val="Heading1"/>
+        <w:numPr>
+          <w:ilvl w:val="0"/>
+          <w:numId w:val="3"/>
+        </w:numPr>
+      </w:pPr>
+      <w:bookmarkStart w:id="11" w:name="_Toc238051059"/>
+      <w:r>
+        <w:t>Estrutura de grupos e Ous</w:t>
+      </w:r>
+      <w:bookmarkEnd w:id="11"/>
+    </w:p>
+    <w:p/>
+    <w:p>
+      <w:r>
+        <w:t xml:space="preserve">A organização lógica dos usuários e recursos dentro do Active Directory é fundamental para garantir a eficiência administrativa e a aplicação consistente das políticas de segurança. Conforme orientações da </w:t>
+      </w:r>
+      <w:r>
+        <w:rPr>
+          <w:b/>
+          <w:bCs/>
+        </w:rPr>
+        <w:t>Microsoft Learn</w:t>
+      </w:r>
+      <w:r>
+        <w:t xml:space="preserve"> e normas internacionais de gestão da informação (ISO/IEC 27001, NIST), a estrutura de </w:t>
+      </w:r>
+      <w:r>
+        <w:rPr>
+          <w:b/>
+          <w:bCs/>
+        </w:rPr>
+        <w:t>Organizational Units (OU)</w:t>
+      </w:r>
+      <w:r>
+        <w:t xml:space="preserve"> deve refletir a hierarquia institucional, permitindo que cada perfil seja gerenciado de forma independente e segura.</w:t>
+      </w:r>
+    </w:p>
+    <w:p>
+      <w:r>
+        <w:t>No projeto da Faculdade de Tecnologia Padre Danilo José, a estrutura de OU foi definida da seguinte forma:</w:t>
+      </w:r>
+    </w:p>
+    <w:p>
+      <w:pPr>
+        <w:numPr>
+          <w:ilvl w:val="0"/>
+          <w:numId w:val="9"/>
+        </w:numPr>
+      </w:pPr>
+      <w:r>
+        <w:rPr>
+          <w:b/>
+          <w:bCs/>
+        </w:rPr>
+        <w:t>OU=Usuários</w:t>
+      </w:r>
+      <w:r>
+        <w:t xml:space="preserve">: subdividida em </w:t>
+      </w:r>
+      <w:r>
+        <w:rPr>
+          <w:b/>
+          <w:bCs/>
+        </w:rPr>
+        <w:t>Alunos</w:t>
+      </w:r>
+      <w:r>
+        <w:t xml:space="preserve">, </w:t>
+      </w:r>
+      <w:r>
+        <w:rPr>
+          <w:b/>
+          <w:bCs/>
+        </w:rPr>
+        <w:t>Professores</w:t>
+      </w:r>
+      <w:r>
+        <w:t xml:space="preserve">, </w:t>
+      </w:r>
+      <w:r>
+        <w:rPr>
+          <w:b/>
+          <w:bCs/>
+        </w:rPr>
+        <w:t>Administrativo</w:t>
+      </w:r>
+      <w:r>
+        <w:t xml:space="preserve"> e </w:t>
+      </w:r>
+      <w:r>
+        <w:rPr>
+          <w:b/>
+          <w:bCs/>
+        </w:rPr>
+        <w:t>TI</w:t>
+      </w:r>
+      <w:r>
+        <w:t>, cada qual com suas respectivas ramificações.</w:t>
+      </w:r>
+    </w:p>
+    <w:p>
+      <w:pPr>
+        <w:numPr>
+          <w:ilvl w:val="1"/>
+          <w:numId w:val="9"/>
+        </w:numPr>
+      </w:pPr>
+      <w:r>
+        <w:t xml:space="preserve">Em </w:t>
+      </w:r>
+      <w:r>
+        <w:rPr>
+          <w:b/>
+          <w:bCs/>
+        </w:rPr>
+        <w:t>Alunos</w:t>
+      </w:r>
+      <w:r>
+        <w:t xml:space="preserve"> e </w:t>
+      </w:r>
+      <w:r>
+        <w:rPr>
+          <w:b/>
+          <w:bCs/>
+        </w:rPr>
+        <w:t>Professores</w:t>
+      </w:r>
+      <w:r>
+        <w:t>, há subdivisões por curso (GTI, GEV, GNP), garantindo que cada turma e disciplina possua seus próprios recursos e permissões.</w:t>
+      </w:r>
+    </w:p>
+    <w:p>
+      <w:pPr>
+        <w:numPr>
+          <w:ilvl w:val="1"/>
+          <w:numId w:val="9"/>
+        </w:numPr>
+      </w:pPr>
+      <w:r>
+        <w:t xml:space="preserve">Em </w:t>
+      </w:r>
+      <w:r>
+        <w:rPr>
+          <w:b/>
+          <w:bCs/>
+        </w:rPr>
+        <w:t>Administrativo</w:t>
+      </w:r>
+      <w:r>
+        <w:t>, foram criadas unidades específicas para setores como Congregação, Coordenação, Secretaria, RH, Biblioteca, CPA e CIPA, assegurando segregação lógica e controle granular de acessos.</w:t>
+      </w:r>
+    </w:p>
+    <w:p>
+      <w:pPr>
+        <w:numPr>
+          <w:ilvl w:val="1"/>
+          <w:numId w:val="9"/>
+        </w:numPr>
+      </w:pPr>
+      <w:r>
+        <w:t xml:space="preserve">Em </w:t>
+      </w:r>
+      <w:r>
+        <w:rPr>
+          <w:b/>
+          <w:bCs/>
+        </w:rPr>
+        <w:t>TI</w:t>
+      </w:r>
+      <w:r>
+        <w:t>, foram definidas unidades para Servidores e Suporte, responsáveis pela manutenção e administração do domínio.</w:t>
+      </w:r>
+    </w:p>
+    <w:p>
+      <w:pPr>
+        <w:numPr>
+          <w:ilvl w:val="0"/>
+          <w:numId w:val="9"/>
+        </w:numPr>
+      </w:pPr>
+      <w:r>
+        <w:rPr>
+          <w:b/>
+          <w:bCs/>
+        </w:rPr>
+        <w:t>OU=Computadores</w:t>
+      </w:r>
+      <w:r>
+        <w:t xml:space="preserve">: subdividida em </w:t>
+      </w:r>
+      <w:r>
+        <w:rPr>
+          <w:b/>
+          <w:bCs/>
+        </w:rPr>
+        <w:t>Salas de Aula</w:t>
+      </w:r>
+      <w:r>
+        <w:t xml:space="preserve">, </w:t>
+      </w:r>
+      <w:r>
+        <w:rPr>
+          <w:b/>
+          <w:bCs/>
+        </w:rPr>
+        <w:t>Laboratórios</w:t>
+      </w:r>
+      <w:r>
+        <w:t xml:space="preserve"> (TI, Hardware e outros) e </w:t>
+      </w:r>
+      <w:r>
+        <w:rPr>
+          <w:b/>
+          <w:bCs/>
+        </w:rPr>
+        <w:t>Administração</w:t>
+      </w:r>
+      <w:r>
+        <w:t>, permitindo aplicar políticas específicas a cada ambiente físico.</w:t>
+      </w:r>
+    </w:p>
+    <w:p>
+      <w:r>
+        <w:t xml:space="preserve">Além das OU, foram criados </w:t>
+      </w:r>
+      <w:r>
+        <w:rPr>
+          <w:b/>
+          <w:bCs/>
+        </w:rPr>
+        <w:t>grupos de segurança</w:t>
+      </w:r>
+      <w:r>
+        <w:t xml:space="preserve"> e </w:t>
+      </w:r>
+      <w:r>
+        <w:rPr>
+          <w:b/>
+          <w:bCs/>
+        </w:rPr>
+        <w:t>grupos de distribuição</w:t>
+      </w:r>
+      <w:r>
+        <w:t>. Os grupos de segurança controlam permissões de acesso a pastas, sistemas e impressoras, enquanto os grupos de distribuição são utilizados para comunicação institucional, como envio de comunicados por curso ou setor. Essa separação garante que a gestão de acessos seja feita de forma clara e auditável.</w:t>
+      </w:r>
+    </w:p>
+    <w:p>
+      <w:r>
+        <w:t>A adoção dessa estrutura traz benefícios diretos:</w:t>
+      </w:r>
+    </w:p>
+    <w:p>
+      <w:pPr>
+        <w:numPr>
+          <w:ilvl w:val="0"/>
+          <w:numId w:val="10"/>
+        </w:numPr>
+      </w:pPr>
+      <w:r>
+        <w:t xml:space="preserve">Facilita a aplicação de </w:t>
+      </w:r>
+      <w:r>
+        <w:rPr>
+          <w:b/>
+          <w:bCs/>
+        </w:rPr>
+        <w:t>Group Policies (GPOs)</w:t>
+      </w:r>
+      <w:r>
+        <w:t xml:space="preserve"> específicas por setor ou perfil.</w:t>
+      </w:r>
+    </w:p>
+    <w:p>
+      <w:pPr>
+        <w:numPr>
+          <w:ilvl w:val="0"/>
+          <w:numId w:val="10"/>
+        </w:numPr>
+      </w:pPr>
+      <w:r>
+        <w:t xml:space="preserve">Permite </w:t>
+      </w:r>
+      <w:r>
+        <w:rPr>
+          <w:b/>
+          <w:bCs/>
+        </w:rPr>
+        <w:t>delegação de administração</w:t>
+      </w:r>
+      <w:r>
+        <w:t xml:space="preserve"> sem comprometer o domínio inteiro.</w:t>
+      </w:r>
+    </w:p>
+    <w:p>
+      <w:pPr>
+        <w:numPr>
+          <w:ilvl w:val="0"/>
+          <w:numId w:val="10"/>
+        </w:numPr>
+      </w:pPr>
+      <w:r>
+        <w:t xml:space="preserve">Garante </w:t>
+      </w:r>
+      <w:r>
+        <w:rPr>
+          <w:b/>
+          <w:bCs/>
+        </w:rPr>
+        <w:t>segregação lógica</w:t>
+      </w:r>
+      <w:r>
+        <w:t xml:space="preserve"> entre alunos, professores, administrativos e TI.</w:t>
+      </w:r>
+    </w:p>
+    <w:p>
+      <w:pPr>
+        <w:numPr>
+          <w:ilvl w:val="0"/>
+          <w:numId w:val="10"/>
+        </w:numPr>
+      </w:pPr>
+      <w:r>
+        <w:t xml:space="preserve">Simplifica processos de </w:t>
+      </w:r>
+      <w:r>
+        <w:rPr>
+          <w:b/>
+          <w:bCs/>
+        </w:rPr>
+        <w:t>auditoria e manutenção futura</w:t>
+      </w:r>
+      <w:r>
+        <w:t>, assegurando conformidade com normas de segurança e governança de TI.</w:t>
+      </w:r>
+    </w:p>
+    <w:p>
+      <w:r>
+        <w:t xml:space="preserve">Assim, a estrutura de OU e grupos definida para o Active Directory da instituição não apenas organiza os recursos de forma eficiente, mas também fortalece a </w:t>
+      </w:r>
+      <w:r>
+        <w:lastRenderedPageBreak/>
+        <w:t>segurança e a governança, alinhando-se às melhores práticas recomendadas pela Microsoft e por padrões internacionais.</w:t>
+      </w:r>
+    </w:p>
     <w:p/>
     <w:sectPr>
       <w:headerReference w:type="even" r:id="rId8"/>
@@ -5767,6 +6683,304 @@
     </w:lvl>
   </w:abstractNum>
   <w:abstractNum w:abstractNumId="3" w15:restartNumberingAfterBreak="0">
+    <w:nsid w:val="3C334103"/>
+    <w:multiLevelType w:val="multilevel"/>
+    <w:tmpl w:val="871CA32E"/>
+    <w:lvl w:ilvl="0">
+      <w:start w:val="1"/>
+      <w:numFmt w:val="bullet"/>
+      <w:lvlText w:val=""/>
+      <w:lvlJc w:val="left"/>
+      <w:pPr>
+        <w:tabs>
+          <w:tab w:val="num" w:pos="720"/>
+        </w:tabs>
+        <w:ind w:left="720" w:hanging="360"/>
+      </w:pPr>
+      <w:rPr>
+        <w:rFonts w:ascii="Symbol" w:hAnsi="Symbol" w:hint="default"/>
+        <w:sz w:val="20"/>
+      </w:rPr>
+    </w:lvl>
+    <w:lvl w:ilvl="1">
+      <w:start w:val="1"/>
+      <w:numFmt w:val="bullet"/>
+      <w:lvlText w:val="o"/>
+      <w:lvlJc w:val="left"/>
+      <w:pPr>
+        <w:tabs>
+          <w:tab w:val="num" w:pos="1440"/>
+        </w:tabs>
+        <w:ind w:left="1440" w:hanging="360"/>
+      </w:pPr>
+      <w:rPr>
+        <w:rFonts w:ascii="Courier New" w:hAnsi="Courier New" w:hint="default"/>
+        <w:sz w:val="20"/>
+      </w:rPr>
+    </w:lvl>
+    <w:lvl w:ilvl="2" w:tentative="1">
+      <w:start w:val="1"/>
+      <w:numFmt w:val="bullet"/>
+      <w:lvlText w:val=""/>
+      <w:lvlJc w:val="left"/>
+      <w:pPr>
+        <w:tabs>
+          <w:tab w:val="num" w:pos="2160"/>
+        </w:tabs>
+        <w:ind w:left="2160" w:hanging="360"/>
+      </w:pPr>
+      <w:rPr>
+        <w:rFonts w:ascii="Wingdings" w:hAnsi="Wingdings" w:hint="default"/>
+        <w:sz w:val="20"/>
+      </w:rPr>
+    </w:lvl>
+    <w:lvl w:ilvl="3" w:tentative="1">
+      <w:start w:val="1"/>
+      <w:numFmt w:val="bullet"/>
+      <w:lvlText w:val=""/>
+      <w:lvlJc w:val="left"/>
+      <w:pPr>
+        <w:tabs>
+          <w:tab w:val="num" w:pos="2880"/>
+        </w:tabs>
+        <w:ind w:left="2880" w:hanging="360"/>
+      </w:pPr>
+      <w:rPr>
+        <w:rFonts w:ascii="Wingdings" w:hAnsi="Wingdings" w:hint="default"/>
+        <w:sz w:val="20"/>
+      </w:rPr>
+    </w:lvl>
+    <w:lvl w:ilvl="4" w:tentative="1">
+      <w:start w:val="1"/>
+      <w:numFmt w:val="bullet"/>
+      <w:lvlText w:val=""/>
+      <w:lvlJc w:val="left"/>
+      <w:pPr>
+        <w:tabs>
+          <w:tab w:val="num" w:pos="3600"/>
+        </w:tabs>
+        <w:ind w:left="3600" w:hanging="360"/>
+      </w:pPr>
+      <w:rPr>
+        <w:rFonts w:ascii="Wingdings" w:hAnsi="Wingdings" w:hint="default"/>
+        <w:sz w:val="20"/>
+      </w:rPr>
+    </w:lvl>
+    <w:lvl w:ilvl="5" w:tentative="1">
+      <w:start w:val="1"/>
+      <w:numFmt w:val="bullet"/>
+      <w:lvlText w:val=""/>
+      <w:lvlJc w:val="left"/>
+      <w:pPr>
+        <w:tabs>
+          <w:tab w:val="num" w:pos="4320"/>
+        </w:tabs>
+        <w:ind w:left="4320" w:hanging="360"/>
+      </w:pPr>
+      <w:rPr>
+        <w:rFonts w:ascii="Wingdings" w:hAnsi="Wingdings" w:hint="default"/>
+        <w:sz w:val="20"/>
+      </w:rPr>
+    </w:lvl>
+    <w:lvl w:ilvl="6" w:tentative="1">
+      <w:start w:val="1"/>
+      <w:numFmt w:val="bullet"/>
+      <w:lvlText w:val=""/>
+      <w:lvlJc w:val="left"/>
+      <w:pPr>
+        <w:tabs>
+          <w:tab w:val="num" w:pos="5040"/>
+        </w:tabs>
+        <w:ind w:left="5040" w:hanging="360"/>
+      </w:pPr>
+      <w:rPr>
+        <w:rFonts w:ascii="Wingdings" w:hAnsi="Wingdings" w:hint="default"/>
+        <w:sz w:val="20"/>
+      </w:rPr>
+    </w:lvl>
+    <w:lvl w:ilvl="7" w:tentative="1">
+      <w:start w:val="1"/>
+      <w:numFmt w:val="bullet"/>
+      <w:lvlText w:val=""/>
+      <w:lvlJc w:val="left"/>
+      <w:pPr>
+        <w:tabs>
+          <w:tab w:val="num" w:pos="5760"/>
+        </w:tabs>
+        <w:ind w:left="5760" w:hanging="360"/>
+      </w:pPr>
+      <w:rPr>
+        <w:rFonts w:ascii="Wingdings" w:hAnsi="Wingdings" w:hint="default"/>
+        <w:sz w:val="20"/>
+      </w:rPr>
+    </w:lvl>
+    <w:lvl w:ilvl="8" w:tentative="1">
+      <w:start w:val="1"/>
+      <w:numFmt w:val="bullet"/>
+      <w:lvlText w:val=""/>
+      <w:lvlJc w:val="left"/>
+      <w:pPr>
+        <w:tabs>
+          <w:tab w:val="num" w:pos="6480"/>
+        </w:tabs>
+        <w:ind w:left="6480" w:hanging="360"/>
+      </w:pPr>
+      <w:rPr>
+        <w:rFonts w:ascii="Wingdings" w:hAnsi="Wingdings" w:hint="default"/>
+        <w:sz w:val="20"/>
+      </w:rPr>
+    </w:lvl>
+  </w:abstractNum>
+  <w:abstractNum w:abstractNumId="4" w15:restartNumberingAfterBreak="0">
+    <w:nsid w:val="3FA26364"/>
+    <w:multiLevelType w:val="multilevel"/>
+    <w:tmpl w:val="7102D8A2"/>
+    <w:lvl w:ilvl="0">
+      <w:start w:val="1"/>
+      <w:numFmt w:val="bullet"/>
+      <w:lvlText w:val=""/>
+      <w:lvlJc w:val="left"/>
+      <w:pPr>
+        <w:tabs>
+          <w:tab w:val="num" w:pos="720"/>
+        </w:tabs>
+        <w:ind w:left="720" w:hanging="360"/>
+      </w:pPr>
+      <w:rPr>
+        <w:rFonts w:ascii="Symbol" w:hAnsi="Symbol" w:hint="default"/>
+        <w:sz w:val="20"/>
+      </w:rPr>
+    </w:lvl>
+    <w:lvl w:ilvl="1" w:tentative="1">
+      <w:start w:val="1"/>
+      <w:numFmt w:val="bullet"/>
+      <w:lvlText w:val="o"/>
+      <w:lvlJc w:val="left"/>
+      <w:pPr>
+        <w:tabs>
+          <w:tab w:val="num" w:pos="1440"/>
+        </w:tabs>
+        <w:ind w:left="1440" w:hanging="360"/>
+      </w:pPr>
+      <w:rPr>
+        <w:rFonts w:ascii="Courier New" w:hAnsi="Courier New" w:hint="default"/>
+        <w:sz w:val="20"/>
+      </w:rPr>
+    </w:lvl>
+    <w:lvl w:ilvl="2" w:tentative="1">
+      <w:start w:val="1"/>
+      <w:numFmt w:val="bullet"/>
+      <w:lvlText w:val=""/>
+      <w:lvlJc w:val="left"/>
+      <w:pPr>
+        <w:tabs>
+          <w:tab w:val="num" w:pos="2160"/>
+        </w:tabs>
+        <w:ind w:left="2160" w:hanging="360"/>
+      </w:pPr>
+      <w:rPr>
+        <w:rFonts w:ascii="Wingdings" w:hAnsi="Wingdings" w:hint="default"/>
+        <w:sz w:val="20"/>
+      </w:rPr>
+    </w:lvl>
+    <w:lvl w:ilvl="3" w:tentative="1">
+      <w:start w:val="1"/>
+      <w:numFmt w:val="bullet"/>
+      <w:lvlText w:val=""/>
+      <w:lvlJc w:val="left"/>
+      <w:pPr>
+        <w:tabs>
+          <w:tab w:val="num" w:pos="2880"/>
+        </w:tabs>
+        <w:ind w:left="2880" w:hanging="360"/>
+      </w:pPr>
+      <w:rPr>
+        <w:rFonts w:ascii="Wingdings" w:hAnsi="Wingdings" w:hint="default"/>
+        <w:sz w:val="20"/>
+      </w:rPr>
+    </w:lvl>
+    <w:lvl w:ilvl="4" w:tentative="1">
+      <w:start w:val="1"/>
+      <w:numFmt w:val="bullet"/>
+      <w:lvlText w:val=""/>
+      <w:lvlJc w:val="left"/>
+      <w:pPr>
+        <w:tabs>
+          <w:tab w:val="num" w:pos="3600"/>
+        </w:tabs>
+        <w:ind w:left="3600" w:hanging="360"/>
+      </w:pPr>
+      <w:rPr>
+        <w:rFonts w:ascii="Wingdings" w:hAnsi="Wingdings" w:hint="default"/>
+        <w:sz w:val="20"/>
+      </w:rPr>
+    </w:lvl>
+    <w:lvl w:ilvl="5" w:tentative="1">
+      <w:start w:val="1"/>
+      <w:numFmt w:val="bullet"/>
+      <w:lvlText w:val=""/>
+      <w:lvlJc w:val="left"/>
+      <w:pPr>
+        <w:tabs>
+          <w:tab w:val="num" w:pos="4320"/>
+        </w:tabs>
+        <w:ind w:left="4320" w:hanging="360"/>
+      </w:pPr>
+      <w:rPr>
+        <w:rFonts w:ascii="Wingdings" w:hAnsi="Wingdings" w:hint="default"/>
+        <w:sz w:val="20"/>
+      </w:rPr>
+    </w:lvl>
+    <w:lvl w:ilvl="6" w:tentative="1">
+      <w:start w:val="1"/>
+      <w:numFmt w:val="bullet"/>
+      <w:lvlText w:val=""/>
+      <w:lvlJc w:val="left"/>
+      <w:pPr>
+        <w:tabs>
+          <w:tab w:val="num" w:pos="5040"/>
+        </w:tabs>
+        <w:ind w:left="5040" w:hanging="360"/>
+      </w:pPr>
+      <w:rPr>
+        <w:rFonts w:ascii="Wingdings" w:hAnsi="Wingdings" w:hint="default"/>
+        <w:sz w:val="20"/>
+      </w:rPr>
+    </w:lvl>
+    <w:lvl w:ilvl="7" w:tentative="1">
+      <w:start w:val="1"/>
+      <w:numFmt w:val="bullet"/>
+      <w:lvlText w:val=""/>
+      <w:lvlJc w:val="left"/>
+      <w:pPr>
+        <w:tabs>
+          <w:tab w:val="num" w:pos="5760"/>
+        </w:tabs>
+        <w:ind w:left="5760" w:hanging="360"/>
+      </w:pPr>
+      <w:rPr>
+        <w:rFonts w:ascii="Wingdings" w:hAnsi="Wingdings" w:hint="default"/>
+        <w:sz w:val="20"/>
+      </w:rPr>
+    </w:lvl>
+    <w:lvl w:ilvl="8" w:tentative="1">
+      <w:start w:val="1"/>
+      <w:numFmt w:val="bullet"/>
+      <w:lvlText w:val=""/>
+      <w:lvlJc w:val="left"/>
+      <w:pPr>
+        <w:tabs>
+          <w:tab w:val="num" w:pos="6480"/>
+        </w:tabs>
+        <w:ind w:left="6480" w:hanging="360"/>
+      </w:pPr>
+      <w:rPr>
+        <w:rFonts w:ascii="Wingdings" w:hAnsi="Wingdings" w:hint="default"/>
+        <w:sz w:val="20"/>
+      </w:rPr>
+    </w:lvl>
+  </w:abstractNum>
+  <w:abstractNum w:abstractNumId="5" w15:restartNumberingAfterBreak="0">
     <w:nsid w:val="4809326F"/>
     <w:multiLevelType w:val="hybridMultilevel"/>
     <w:tmpl w:val="EDAA36C8"/>
@@ -5978,7 +7192,7 @@
       </w:rPr>
     </w:lvl>
   </w:abstractNum>
-  <w:abstractNum w:abstractNumId="4" w15:restartNumberingAfterBreak="0">
+  <w:abstractNum w:abstractNumId="6" w15:restartNumberingAfterBreak="0">
     <w:nsid w:val="4AFB3D85"/>
     <w:multiLevelType w:val="hybridMultilevel"/>
     <w:tmpl w:val="92E4DC3C"/>
@@ -6067,7 +7281,7 @@
       </w:pPr>
     </w:lvl>
   </w:abstractNum>
-  <w:abstractNum w:abstractNumId="5" w15:restartNumberingAfterBreak="0">
+  <w:abstractNum w:abstractNumId="7" w15:restartNumberingAfterBreak="0">
     <w:nsid w:val="575A637C"/>
     <w:multiLevelType w:val="hybridMultilevel"/>
     <w:tmpl w:val="63146F94"/>
@@ -6153,7 +7367,156 @@
       </w:pPr>
     </w:lvl>
   </w:abstractNum>
-  <w:abstractNum w:abstractNumId="6" w15:restartNumberingAfterBreak="0">
+  <w:abstractNum w:abstractNumId="8" w15:restartNumberingAfterBreak="0">
+    <w:nsid w:val="5F5F1046"/>
+    <w:multiLevelType w:val="multilevel"/>
+    <w:tmpl w:val="F69674B0"/>
+    <w:lvl w:ilvl="0">
+      <w:start w:val="1"/>
+      <w:numFmt w:val="bullet"/>
+      <w:lvlText w:val=""/>
+      <w:lvlJc w:val="left"/>
+      <w:pPr>
+        <w:tabs>
+          <w:tab w:val="num" w:pos="720"/>
+        </w:tabs>
+        <w:ind w:left="720" w:hanging="360"/>
+      </w:pPr>
+      <w:rPr>
+        <w:rFonts w:ascii="Symbol" w:hAnsi="Symbol" w:hint="default"/>
+        <w:sz w:val="20"/>
+      </w:rPr>
+    </w:lvl>
+    <w:lvl w:ilvl="1" w:tentative="1">
+      <w:start w:val="1"/>
+      <w:numFmt w:val="bullet"/>
+      <w:lvlText w:val="o"/>
+      <w:lvlJc w:val="left"/>
+      <w:pPr>
+        <w:tabs>
+          <w:tab w:val="num" w:pos="1440"/>
+        </w:tabs>
+        <w:ind w:left="1440" w:hanging="360"/>
+      </w:pPr>
+      <w:rPr>
+        <w:rFonts w:ascii="Courier New" w:hAnsi="Courier New" w:hint="default"/>
+        <w:sz w:val="20"/>
+      </w:rPr>
+    </w:lvl>
+    <w:lvl w:ilvl="2" w:tentative="1">
+      <w:start w:val="1"/>
+      <w:numFmt w:val="bullet"/>
+      <w:lvlText w:val=""/>
+      <w:lvlJc w:val="left"/>
+      <w:pPr>
+        <w:tabs>
+          <w:tab w:val="num" w:pos="2160"/>
+        </w:tabs>
+        <w:ind w:left="2160" w:hanging="360"/>
+      </w:pPr>
+      <w:rPr>
+        <w:rFonts w:ascii="Wingdings" w:hAnsi="Wingdings" w:hint="default"/>
+        <w:sz w:val="20"/>
+      </w:rPr>
+    </w:lvl>
+    <w:lvl w:ilvl="3" w:tentative="1">
+      <w:start w:val="1"/>
+      <w:numFmt w:val="bullet"/>
+      <w:lvlText w:val=""/>
+      <w:lvlJc w:val="left"/>
+      <w:pPr>
+        <w:tabs>
+          <w:tab w:val="num" w:pos="2880"/>
+        </w:tabs>
+        <w:ind w:left="2880" w:hanging="360"/>
+      </w:pPr>
+      <w:rPr>
+        <w:rFonts w:ascii="Wingdings" w:hAnsi="Wingdings" w:hint="default"/>
+        <w:sz w:val="20"/>
+      </w:rPr>
+    </w:lvl>
+    <w:lvl w:ilvl="4" w:tentative="1">
+      <w:start w:val="1"/>
+      <w:numFmt w:val="bullet"/>
+      <w:lvlText w:val=""/>
+      <w:lvlJc w:val="left"/>
+      <w:pPr>
+        <w:tabs>
+          <w:tab w:val="num" w:pos="3600"/>
+        </w:tabs>
+        <w:ind w:left="3600" w:hanging="360"/>
+      </w:pPr>
+      <w:rPr>
+        <w:rFonts w:ascii="Wingdings" w:hAnsi="Wingdings" w:hint="default"/>
+        <w:sz w:val="20"/>
+      </w:rPr>
+    </w:lvl>
+    <w:lvl w:ilvl="5" w:tentative="1">
+      <w:start w:val="1"/>
+      <w:numFmt w:val="bullet"/>
+      <w:lvlText w:val=""/>
+      <w:lvlJc w:val="left"/>
+      <w:pPr>
+        <w:tabs>
+          <w:tab w:val="num" w:pos="4320"/>
+        </w:tabs>
+        <w:ind w:left="4320" w:hanging="360"/>
+      </w:pPr>
+      <w:rPr>
+        <w:rFonts w:ascii="Wingdings" w:hAnsi="Wingdings" w:hint="default"/>
+        <w:sz w:val="20"/>
+      </w:rPr>
+    </w:lvl>
+    <w:lvl w:ilvl="6" w:tentative="1">
+      <w:start w:val="1"/>
+      <w:numFmt w:val="bullet"/>
+      <w:lvlText w:val=""/>
+      <w:lvlJc w:val="left"/>
+      <w:pPr>
+        <w:tabs>
+          <w:tab w:val="num" w:pos="5040"/>
+        </w:tabs>
+        <w:ind w:left="5040" w:hanging="360"/>
+      </w:pPr>
+      <w:rPr>
+        <w:rFonts w:ascii="Wingdings" w:hAnsi="Wingdings" w:hint="default"/>
+        <w:sz w:val="20"/>
+      </w:rPr>
+    </w:lvl>
+    <w:lvl w:ilvl="7" w:tentative="1">
+      <w:start w:val="1"/>
+      <w:numFmt w:val="bullet"/>
+      <w:lvlText w:val=""/>
+      <w:lvlJc w:val="left"/>
+      <w:pPr>
+        <w:tabs>
+          <w:tab w:val="num" w:pos="5760"/>
+        </w:tabs>
+        <w:ind w:left="5760" w:hanging="360"/>
+      </w:pPr>
+      <w:rPr>
+        <w:rFonts w:ascii="Wingdings" w:hAnsi="Wingdings" w:hint="default"/>
+        <w:sz w:val="20"/>
+      </w:rPr>
+    </w:lvl>
+    <w:lvl w:ilvl="8" w:tentative="1">
+      <w:start w:val="1"/>
+      <w:numFmt w:val="bullet"/>
+      <w:lvlText w:val=""/>
+      <w:lvlJc w:val="left"/>
+      <w:pPr>
+        <w:tabs>
+          <w:tab w:val="num" w:pos="6480"/>
+        </w:tabs>
+        <w:ind w:left="6480" w:hanging="360"/>
+      </w:pPr>
+      <w:rPr>
+        <w:rFonts w:ascii="Wingdings" w:hAnsi="Wingdings" w:hint="default"/>
+        <w:sz w:val="20"/>
+      </w:rPr>
+    </w:lvl>
+  </w:abstractNum>
+  <w:abstractNum w:abstractNumId="9" w15:restartNumberingAfterBreak="0">
     <w:nsid w:val="6B3222D5"/>
     <w:multiLevelType w:val="multilevel"/>
     <w:tmpl w:val="F0243014"/>
@@ -6306,22 +7669,31 @@
     <w:abstractNumId w:val="0"/>
   </w:num>
   <w:num w:numId="2" w16cid:durableId="1899438238">
-    <w:abstractNumId w:val="3"/>
+    <w:abstractNumId w:val="5"/>
   </w:num>
   <w:num w:numId="3" w16cid:durableId="446317888">
     <w:abstractNumId w:val="2"/>
   </w:num>
   <w:num w:numId="4" w16cid:durableId="316812812">
-    <w:abstractNumId w:val="4"/>
+    <w:abstractNumId w:val="6"/>
   </w:num>
   <w:num w:numId="5" w16cid:durableId="2107534834">
-    <w:abstractNumId w:val="6"/>
+    <w:abstractNumId w:val="9"/>
   </w:num>
   <w:num w:numId="6" w16cid:durableId="1770198717">
     <w:abstractNumId w:val="1"/>
   </w:num>
   <w:num w:numId="7" w16cid:durableId="944921588">
-    <w:abstractNumId w:val="5"/>
+    <w:abstractNumId w:val="7"/>
+  </w:num>
+  <w:num w:numId="8" w16cid:durableId="931546427">
+    <w:abstractNumId w:val="4"/>
+  </w:num>
+  <w:num w:numId="9" w16cid:durableId="1129938157">
+    <w:abstractNumId w:val="3"/>
+  </w:num>
+  <w:num w:numId="10" w16cid:durableId="1913076791">
+    <w:abstractNumId w:val="8"/>
   </w:num>
 </w:numbering>
 </file>

</xml_diff>

<commit_message>
docs: atualização da monografia
</commit_message>
<xml_diff>
--- a/docs/docs/Faculdade de Tecnologia Padre Danilo José de Oliveira Ohl.docx
+++ b/docs/docs/Faculdade de Tecnologia Padre Danilo José de Oliveira Ohl.docx
@@ -1952,21 +1952,7 @@
                 <w:rStyle w:val="Hyperlink"/>
                 <w:noProof/>
               </w:rPr>
-              <w:t>Ide</w:t>
-            </w:r>
-            <w:r>
-              <w:rPr>
-                <w:rStyle w:val="Hyperlink"/>
-                <w:noProof/>
-              </w:rPr>
-              <w:t>n</w:t>
-            </w:r>
-            <w:r>
-              <w:rPr>
-                <w:rStyle w:val="Hyperlink"/>
-                <w:noProof/>
-              </w:rPr>
-              <w:t>tificando perfis de usuários</w:t>
+              <w:t>Identificando perfis de usuários</w:t>
             </w:r>
             <w:r>
               <w:rPr>
@@ -2488,21 +2474,7 @@
                 <w:rStyle w:val="Hyperlink"/>
                 <w:noProof/>
               </w:rPr>
-              <w:t xml:space="preserve">Estrutura de </w:t>
-            </w:r>
-            <w:r>
-              <w:rPr>
-                <w:rStyle w:val="Hyperlink"/>
-                <w:noProof/>
-              </w:rPr>
-              <w:t>g</w:t>
-            </w:r>
-            <w:r>
-              <w:rPr>
-                <w:rStyle w:val="Hyperlink"/>
-                <w:noProof/>
-              </w:rPr>
-              <w:t>rupos e Ous</w:t>
+              <w:t>Estrutura de grupos e Ous</w:t>
             </w:r>
             <w:r>
               <w:rPr>
@@ -2966,101 +2938,35 @@
     </w:p>
     <w:p>
       <w:r>
-        <w:t>O mapeamento dos setores da instituição foi realizado a partir das informações disponibilizadas no site oficial da Faculdade de Tecnologia (FATEC), complementadas pelas informações fornecidas pelo cliente responsável pelo acompanhamento do projeto. Esse levantamento teve como objetivo compreender a estrutura organizacional da instituição e identificar os diferentes setores e perfis que deverão ser considerados na organização do ambiente de Active Directory.</w:t>
-      </w:r>
-    </w:p>
-    <w:p>
-      <w:r>
-        <w:t xml:space="preserve">A estrutura identificada foi dividida em quatro grupos principais: </w:t>
-      </w:r>
-      <w:r>
-        <w:rPr>
-          <w:b/>
-          <w:bCs/>
-        </w:rPr>
-        <w:t>Administração, Tecnologia da Informação, Docentes e Discentes</w:t>
-      </w:r>
-      <w:r>
-        <w:t>. Essa divisão permite representar os diferentes perfis presentes na instituição e servirá como base para as próximas etapas do projeto, principalmente para o planejamento da estrutura de Unidades Organizacionais (OUs), definição de grupos e estabelecimento das permissões de acesso.</w:t>
-      </w:r>
-    </w:p>
-    <w:p>
-      <w:r>
-        <w:t xml:space="preserve">O setor de </w:t>
-      </w:r>
-      <w:r>
-        <w:rPr>
-          <w:b/>
-          <w:bCs/>
-        </w:rPr>
-        <w:t>Administração</w:t>
-      </w:r>
-      <w:r>
-        <w:t xml:space="preserve"> é composto pela Congregação, Coordenação da FATEC, Chefia de Serviços Administrativos, Coordenadorias de Cursos, Orientação de Polo, Núcleo Docente Estruturante (NDE), Corpo Docente, Auxiliares Docentes, Corpo Técnico-Administrativo, Comissão Própria de Avaliação (CPA), Comissão Interna de Prevenção de Acidentes (CIPA), Serviço de Atendimento ao Cliente (SAC), Serviço de Assistência ao Discente (SAD) e Biblioteca.</w:t>
-      </w:r>
-    </w:p>
-    <w:p>
-      <w:r>
-        <w:t xml:space="preserve">A área de </w:t>
-      </w:r>
-      <w:r>
-        <w:rPr>
-          <w:b/>
-          <w:bCs/>
-        </w:rPr>
-        <w:t>Tecnologia da Informação</w:t>
-      </w:r>
-      <w:r>
-        <w:t xml:space="preserve"> foi organizada considerando os setores de Servidores e Suporte. Esses setores possuem funções relacionadas à manutenção, administração e suporte da infraestrutura tecnológica da instituição.</w:t>
-      </w:r>
-    </w:p>
-    <w:p>
-      <w:r>
-        <w:t xml:space="preserve">Os perfis </w:t>
-      </w:r>
-      <w:r>
-        <w:rPr>
-          <w:b/>
-          <w:bCs/>
-        </w:rPr>
-        <w:t>Docente</w:t>
-      </w:r>
-      <w:r>
-        <w:t xml:space="preserve"> e </w:t>
-      </w:r>
-      <w:r>
-        <w:rPr>
-          <w:b/>
-          <w:bCs/>
-        </w:rPr>
-        <w:t>Discente</w:t>
-      </w:r>
-      <w:r>
-        <w:t xml:space="preserve"> foram organizados de acordo com os cursos identificados na instituição: </w:t>
-      </w:r>
-      <w:r>
-        <w:rPr>
-          <w:b/>
-          <w:bCs/>
-        </w:rPr>
-        <w:t>Gestão da Tecnologia da Informação, Gestão de Eventos e Gestão de Negócios e Pessoas</w:t>
-      </w:r>
-      <w:r>
-        <w:t>. Essa organização permite diferenciar usuários conforme sua função e vínculo acadêmico, facilitando posteriormente a definição de grupos, permissões e políticas específicas.</w:t>
-      </w:r>
-    </w:p>
-    <w:p>
-      <w:r>
-        <w:t>Todos os setores identificados foram considerados no levantamento, não havendo, nesta etapa, nenhum setor definido como prioritário ou sujeito a tratamento diferenciado. Dessa forma, o resultado do mapeamento estabelece uma visão geral da estrutura organizacional da instituição e fornece a base necessária para a continuidade do projeto, especialmente nas etapas relacionadas ao mapeamento da estrutura de OUs, definição de permissões e organização dos usuários no ambiente de Active Directory.</w:t>
-      </w:r>
-    </w:p>
-    <w:p/>
+        <w:t xml:space="preserve">A Fatec Barueri possui uma estrutura organizacional composta por setores administrativos, órgãos colegiados e cursos superiores de tecnologia. Para garantir segurança, padronização e controle de acessos, cada área foi mapeada e vinculada a domínios específicos do Active Directory. Os setores administrativos e órgãos colegiados são integrados ao domínio </w:t>
+      </w:r>
+      <w:r>
+        <w:rPr>
+          <w:b/>
+          <w:bCs/>
+        </w:rPr>
+        <w:t>AD-ADM</w:t>
+      </w:r>
+      <w:r>
+        <w:t xml:space="preserve">, responsável pela gestão corporativa e institucional. Já os cursos superiores, que envolvem professores e alunos, são vinculados ao domínio </w:t>
+      </w:r>
+      <w:r>
+        <w:rPr>
+          <w:b/>
+          <w:bCs/>
+        </w:rPr>
+        <w:t>AD-ACAD</w:t>
+      </w:r>
+      <w:r>
+        <w:t>, garantindo políticas diferenciadas para o ambiente acadêmico. Essa divisão reflete a lógica de rede da instituição, onde a VLAN 10 atende ao ambiente administrativo e a VLAN 20 ao ambiente acadêmico, assegurando isolamento e conformidade com as práticas de governança de TI.</w:t>
+      </w:r>
+    </w:p>
     <w:p/>
     <w:p/>
     <w:p/>
     <w:tbl>
       <w:tblPr>
-        <w:tblW w:w="8647" w:type="dxa"/>
+        <w:tblW w:w="0" w:type="auto"/>
         <w:tblCellSpacing w:w="15" w:type="dxa"/>
         <w:tblBorders>
           <w:top w:val="single" w:sz="4" w:space="0" w:color="auto"/>
@@ -3079,10 +2985,10 @@
         <w:tblLook w:val="04A0" w:firstRow="1" w:lastRow="0" w:firstColumn="1" w:lastColumn="0" w:noHBand="0" w:noVBand="1"/>
       </w:tblPr>
       <w:tblGrid>
-        <w:gridCol w:w="2835"/>
-        <w:gridCol w:w="1911"/>
-        <w:gridCol w:w="1775"/>
-        <w:gridCol w:w="2126"/>
+        <w:gridCol w:w="2013"/>
+        <w:gridCol w:w="3160"/>
+        <w:gridCol w:w="2037"/>
+        <w:gridCol w:w="1350"/>
       </w:tblGrid>
       <w:tr>
         <w:trPr>
@@ -3091,7 +2997,7 @@
         </w:trPr>
         <w:tc>
           <w:tcPr>
-            <w:tcW w:w="2790" w:type="dxa"/>
+            <w:tcW w:w="0" w:type="auto"/>
             <w:vAlign w:val="center"/>
             <w:hideMark/>
           </w:tcPr>
@@ -3107,14 +3013,13 @@
                 <w:b/>
                 <w:bCs/>
               </w:rPr>
-              <w:lastRenderedPageBreak/>
               <w:t>Categoria</w:t>
             </w:r>
           </w:p>
         </w:tc>
         <w:tc>
           <w:tcPr>
-            <w:tcW w:w="1881" w:type="dxa"/>
+            <w:tcW w:w="0" w:type="auto"/>
             <w:vAlign w:val="center"/>
             <w:hideMark/>
           </w:tcPr>
@@ -3136,7 +3041,7 @@
         </w:tc>
         <w:tc>
           <w:tcPr>
-            <w:tcW w:w="1745" w:type="dxa"/>
+            <w:tcW w:w="0" w:type="auto"/>
             <w:vAlign w:val="center"/>
             <w:hideMark/>
           </w:tcPr>
@@ -3158,7 +3063,7 @@
         </w:tc>
         <w:tc>
           <w:tcPr>
-            <w:tcW w:w="2081" w:type="dxa"/>
+            <w:tcW w:w="0" w:type="auto"/>
             <w:vAlign w:val="center"/>
             <w:hideMark/>
           </w:tcPr>
@@ -3185,7 +3090,7 @@
         </w:trPr>
         <w:tc>
           <w:tcPr>
-            <w:tcW w:w="2790" w:type="dxa"/>
+            <w:tcW w:w="0" w:type="auto"/>
             <w:vAlign w:val="center"/>
             <w:hideMark/>
           </w:tcPr>
@@ -3196,47 +3101,80 @@
                 <w:bCs/>
               </w:rPr>
             </w:pPr>
-            <w:r>
-              <w:rPr>
-                <w:b/>
-                <w:bCs/>
-              </w:rPr>
-              <w:t>Setores Administrativos</w:t>
-            </w:r>
+            <w:hyperlink r:id="rId8" w:history="1">
+              <w:r>
+                <w:rPr>
+                  <w:rStyle w:val="Hyperlink"/>
+                  <w:b/>
+                  <w:bCs/>
+                </w:rPr>
+                <w:t>Setores Administrativos</w:t>
+              </w:r>
+            </w:hyperlink>
           </w:p>
         </w:tc>
         <w:tc>
           <w:tcPr>
-            <w:tcW w:w="1881" w:type="dxa"/>
+            <w:tcW w:w="0" w:type="auto"/>
             <w:vAlign w:val="center"/>
             <w:hideMark/>
           </w:tcPr>
           <w:p>
-            <w:r>
+            <w:pPr>
+              <w:rPr>
+                <w:b/>
+                <w:bCs/>
+              </w:rPr>
+            </w:pPr>
+            <w:r>
+              <w:rPr>
+                <w:b/>
+                <w:bCs/>
+              </w:rPr>
               <w:t>Direção</w:t>
             </w:r>
           </w:p>
         </w:tc>
         <w:tc>
           <w:tcPr>
-            <w:tcW w:w="1745" w:type="dxa"/>
+            <w:tcW w:w="0" w:type="auto"/>
             <w:vAlign w:val="center"/>
             <w:hideMark/>
           </w:tcPr>
           <w:p>
-            <w:r>
+            <w:pPr>
+              <w:rPr>
+                <w:b/>
+                <w:bCs/>
+              </w:rPr>
+            </w:pPr>
+            <w:r>
+              <w:rPr>
+                <w:b/>
+                <w:bCs/>
+              </w:rPr>
               <w:t>Gestores</w:t>
             </w:r>
           </w:p>
         </w:tc>
         <w:tc>
           <w:tcPr>
-            <w:tcW w:w="2081" w:type="dxa"/>
+            <w:tcW w:w="0" w:type="auto"/>
             <w:vAlign w:val="center"/>
             <w:hideMark/>
           </w:tcPr>
           <w:p>
-            <w:r>
+            <w:pPr>
+              <w:rPr>
+                <w:b/>
+                <w:bCs/>
+              </w:rPr>
+            </w:pPr>
+            <w:r>
+              <w:rPr>
+                <w:b/>
+                <w:bCs/>
+              </w:rPr>
               <w:t>AD-ADM</w:t>
             </w:r>
           </w:p>
@@ -3248,44 +3186,81 @@
         </w:trPr>
         <w:tc>
           <w:tcPr>
-            <w:tcW w:w="2790" w:type="dxa"/>
-            <w:vAlign w:val="center"/>
-            <w:hideMark/>
-          </w:tcPr>
-          <w:p/>
-        </w:tc>
-        <w:tc>
-          <w:tcPr>
-            <w:tcW w:w="1881" w:type="dxa"/>
+            <w:tcW w:w="0" w:type="auto"/>
             <w:vAlign w:val="center"/>
             <w:hideMark/>
           </w:tcPr>
           <w:p>
-            <w:r>
-              <w:t>Serviços Administrativos</w:t>
-            </w:r>
+            <w:pPr>
+              <w:rPr>
+                <w:b/>
+                <w:bCs/>
+              </w:rPr>
+            </w:pPr>
           </w:p>
         </w:tc>
         <w:tc>
           <w:tcPr>
-            <w:tcW w:w="1745" w:type="dxa"/>
+            <w:tcW w:w="0" w:type="auto"/>
             <w:vAlign w:val="center"/>
             <w:hideMark/>
           </w:tcPr>
           <w:p>
-            <w:r>
-              <w:t>Funcionários administrativos</w:t>
+            <w:pPr>
+              <w:rPr>
+                <w:b/>
+                <w:bCs/>
+              </w:rPr>
+            </w:pPr>
+            <w:r>
+              <w:rPr>
+                <w:b/>
+                <w:bCs/>
+              </w:rPr>
+              <w:t>Serviços Administrativos</w:t>
             </w:r>
           </w:p>
         </w:tc>
         <w:tc>
           <w:tcPr>
-            <w:tcW w:w="2081" w:type="dxa"/>
+            <w:tcW w:w="0" w:type="auto"/>
             <w:vAlign w:val="center"/>
             <w:hideMark/>
           </w:tcPr>
           <w:p>
-            <w:r>
+            <w:pPr>
+              <w:rPr>
+                <w:b/>
+                <w:bCs/>
+              </w:rPr>
+            </w:pPr>
+            <w:r>
+              <w:rPr>
+                <w:b/>
+                <w:bCs/>
+              </w:rPr>
+              <w:t>Funcionários administrativos</w:t>
+            </w:r>
+          </w:p>
+        </w:tc>
+        <w:tc>
+          <w:tcPr>
+            <w:tcW w:w="0" w:type="auto"/>
+            <w:vAlign w:val="center"/>
+            <w:hideMark/>
+          </w:tcPr>
+          <w:p>
+            <w:pPr>
+              <w:rPr>
+                <w:b/>
+                <w:bCs/>
+              </w:rPr>
+            </w:pPr>
+            <w:r>
+              <w:rPr>
+                <w:b/>
+                <w:bCs/>
+              </w:rPr>
               <w:t>AD-ADM</w:t>
             </w:r>
           </w:p>
@@ -3297,44 +3272,81 @@
         </w:trPr>
         <w:tc>
           <w:tcPr>
-            <w:tcW w:w="2790" w:type="dxa"/>
-            <w:vAlign w:val="center"/>
-            <w:hideMark/>
-          </w:tcPr>
-          <w:p/>
-        </w:tc>
-        <w:tc>
-          <w:tcPr>
-            <w:tcW w:w="1881" w:type="dxa"/>
+            <w:tcW w:w="0" w:type="auto"/>
             <w:vAlign w:val="center"/>
             <w:hideMark/>
           </w:tcPr>
           <w:p>
-            <w:r>
-              <w:t>Serviços Acadêmicos</w:t>
-            </w:r>
+            <w:pPr>
+              <w:rPr>
+                <w:b/>
+                <w:bCs/>
+              </w:rPr>
+            </w:pPr>
           </w:p>
         </w:tc>
         <w:tc>
           <w:tcPr>
-            <w:tcW w:w="1745" w:type="dxa"/>
+            <w:tcW w:w="0" w:type="auto"/>
             <w:vAlign w:val="center"/>
             <w:hideMark/>
           </w:tcPr>
           <w:p>
-            <w:r>
-              <w:t>Secretaria Acadêmica</w:t>
+            <w:pPr>
+              <w:rPr>
+                <w:b/>
+                <w:bCs/>
+              </w:rPr>
+            </w:pPr>
+            <w:r>
+              <w:rPr>
+                <w:b/>
+                <w:bCs/>
+              </w:rPr>
+              <w:t>Serviços Acadêmicos</w:t>
             </w:r>
           </w:p>
         </w:tc>
         <w:tc>
           <w:tcPr>
-            <w:tcW w:w="2081" w:type="dxa"/>
+            <w:tcW w:w="0" w:type="auto"/>
             <w:vAlign w:val="center"/>
             <w:hideMark/>
           </w:tcPr>
           <w:p>
-            <w:r>
+            <w:pPr>
+              <w:rPr>
+                <w:b/>
+                <w:bCs/>
+              </w:rPr>
+            </w:pPr>
+            <w:r>
+              <w:rPr>
+                <w:b/>
+                <w:bCs/>
+              </w:rPr>
+              <w:t>Secretaria Acadêmica</w:t>
+            </w:r>
+          </w:p>
+        </w:tc>
+        <w:tc>
+          <w:tcPr>
+            <w:tcW w:w="0" w:type="auto"/>
+            <w:vAlign w:val="center"/>
+            <w:hideMark/>
+          </w:tcPr>
+          <w:p>
+            <w:pPr>
+              <w:rPr>
+                <w:b/>
+                <w:bCs/>
+              </w:rPr>
+            </w:pPr>
+            <w:r>
+              <w:rPr>
+                <w:b/>
+                <w:bCs/>
+              </w:rPr>
               <w:t>AD-ADM</w:t>
             </w:r>
           </w:p>
@@ -3346,44 +3358,81 @@
         </w:trPr>
         <w:tc>
           <w:tcPr>
-            <w:tcW w:w="2790" w:type="dxa"/>
-            <w:vAlign w:val="center"/>
-            <w:hideMark/>
-          </w:tcPr>
-          <w:p/>
-        </w:tc>
-        <w:tc>
-          <w:tcPr>
-            <w:tcW w:w="1881" w:type="dxa"/>
+            <w:tcW w:w="0" w:type="auto"/>
             <w:vAlign w:val="center"/>
             <w:hideMark/>
           </w:tcPr>
           <w:p>
-            <w:r>
-              <w:t>Biblioteca</w:t>
-            </w:r>
+            <w:pPr>
+              <w:rPr>
+                <w:b/>
+                <w:bCs/>
+              </w:rPr>
+            </w:pPr>
           </w:p>
         </w:tc>
         <w:tc>
           <w:tcPr>
-            <w:tcW w:w="1745" w:type="dxa"/>
+            <w:tcW w:w="0" w:type="auto"/>
             <w:vAlign w:val="center"/>
             <w:hideMark/>
           </w:tcPr>
           <w:p>
-            <w:r>
-              <w:t>Funcionários da biblioteca</w:t>
+            <w:pPr>
+              <w:rPr>
+                <w:b/>
+                <w:bCs/>
+              </w:rPr>
+            </w:pPr>
+            <w:r>
+              <w:rPr>
+                <w:b/>
+                <w:bCs/>
+              </w:rPr>
+              <w:t>Biblioteca</w:t>
             </w:r>
           </w:p>
         </w:tc>
         <w:tc>
           <w:tcPr>
-            <w:tcW w:w="2081" w:type="dxa"/>
+            <w:tcW w:w="0" w:type="auto"/>
             <w:vAlign w:val="center"/>
             <w:hideMark/>
           </w:tcPr>
           <w:p>
-            <w:r>
+            <w:pPr>
+              <w:rPr>
+                <w:b/>
+                <w:bCs/>
+              </w:rPr>
+            </w:pPr>
+            <w:r>
+              <w:rPr>
+                <w:b/>
+                <w:bCs/>
+              </w:rPr>
+              <w:t>Funcionários da biblioteca</w:t>
+            </w:r>
+          </w:p>
+        </w:tc>
+        <w:tc>
+          <w:tcPr>
+            <w:tcW w:w="0" w:type="auto"/>
+            <w:vAlign w:val="center"/>
+            <w:hideMark/>
+          </w:tcPr>
+          <w:p>
+            <w:pPr>
+              <w:rPr>
+                <w:b/>
+                <w:bCs/>
+              </w:rPr>
+            </w:pPr>
+            <w:r>
+              <w:rPr>
+                <w:b/>
+                <w:bCs/>
+              </w:rPr>
               <w:t>AD-ADM</w:t>
             </w:r>
           </w:p>
@@ -3395,44 +3444,81 @@
         </w:trPr>
         <w:tc>
           <w:tcPr>
-            <w:tcW w:w="2790" w:type="dxa"/>
-            <w:vAlign w:val="center"/>
-            <w:hideMark/>
-          </w:tcPr>
-          <w:p/>
-        </w:tc>
-        <w:tc>
-          <w:tcPr>
-            <w:tcW w:w="1881" w:type="dxa"/>
+            <w:tcW w:w="0" w:type="auto"/>
             <w:vAlign w:val="center"/>
             <w:hideMark/>
           </w:tcPr>
           <w:p>
-            <w:r>
-              <w:t>Suporte de TI</w:t>
-            </w:r>
+            <w:pPr>
+              <w:rPr>
+                <w:b/>
+                <w:bCs/>
+              </w:rPr>
+            </w:pPr>
           </w:p>
         </w:tc>
         <w:tc>
           <w:tcPr>
-            <w:tcW w:w="1745" w:type="dxa"/>
+            <w:tcW w:w="0" w:type="auto"/>
             <w:vAlign w:val="center"/>
             <w:hideMark/>
           </w:tcPr>
           <w:p>
-            <w:r>
-              <w:t>Técnicos e analistas</w:t>
+            <w:pPr>
+              <w:rPr>
+                <w:b/>
+                <w:bCs/>
+              </w:rPr>
+            </w:pPr>
+            <w:r>
+              <w:rPr>
+                <w:b/>
+                <w:bCs/>
+              </w:rPr>
+              <w:t>Suporte de TI</w:t>
             </w:r>
           </w:p>
         </w:tc>
         <w:tc>
           <w:tcPr>
-            <w:tcW w:w="2081" w:type="dxa"/>
+            <w:tcW w:w="0" w:type="auto"/>
             <w:vAlign w:val="center"/>
             <w:hideMark/>
           </w:tcPr>
           <w:p>
-            <w:r>
+            <w:pPr>
+              <w:rPr>
+                <w:b/>
+                <w:bCs/>
+              </w:rPr>
+            </w:pPr>
+            <w:r>
+              <w:rPr>
+                <w:b/>
+                <w:bCs/>
+              </w:rPr>
+              <w:t>Técnicos e analistas</w:t>
+            </w:r>
+          </w:p>
+        </w:tc>
+        <w:tc>
+          <w:tcPr>
+            <w:tcW w:w="0" w:type="auto"/>
+            <w:vAlign w:val="center"/>
+            <w:hideMark/>
+          </w:tcPr>
+          <w:p>
+            <w:pPr>
+              <w:rPr>
+                <w:b/>
+                <w:bCs/>
+              </w:rPr>
+            </w:pPr>
+            <w:r>
+              <w:rPr>
+                <w:b/>
+                <w:bCs/>
+              </w:rPr>
               <w:t>AD-ADM</w:t>
             </w:r>
           </w:p>
@@ -3444,44 +3530,81 @@
         </w:trPr>
         <w:tc>
           <w:tcPr>
-            <w:tcW w:w="2790" w:type="dxa"/>
-            <w:vAlign w:val="center"/>
-            <w:hideMark/>
-          </w:tcPr>
-          <w:p/>
-        </w:tc>
-        <w:tc>
-          <w:tcPr>
-            <w:tcW w:w="1881" w:type="dxa"/>
+            <w:tcW w:w="0" w:type="auto"/>
             <w:vAlign w:val="center"/>
             <w:hideMark/>
           </w:tcPr>
           <w:p>
-            <w:r>
-              <w:t>NAP</w:t>
-            </w:r>
+            <w:pPr>
+              <w:rPr>
+                <w:b/>
+                <w:bCs/>
+              </w:rPr>
+            </w:pPr>
           </w:p>
         </w:tc>
         <w:tc>
           <w:tcPr>
-            <w:tcW w:w="1745" w:type="dxa"/>
+            <w:tcW w:w="0" w:type="auto"/>
             <w:vAlign w:val="center"/>
             <w:hideMark/>
           </w:tcPr>
           <w:p>
-            <w:r>
-              <w:t>Equipe pedagógica</w:t>
+            <w:pPr>
+              <w:rPr>
+                <w:b/>
+                <w:bCs/>
+              </w:rPr>
+            </w:pPr>
+            <w:r>
+              <w:rPr>
+                <w:b/>
+                <w:bCs/>
+              </w:rPr>
+              <w:t>NAP</w:t>
             </w:r>
           </w:p>
         </w:tc>
         <w:tc>
           <w:tcPr>
-            <w:tcW w:w="2081" w:type="dxa"/>
+            <w:tcW w:w="0" w:type="auto"/>
             <w:vAlign w:val="center"/>
             <w:hideMark/>
           </w:tcPr>
           <w:p>
-            <w:r>
+            <w:pPr>
+              <w:rPr>
+                <w:b/>
+                <w:bCs/>
+              </w:rPr>
+            </w:pPr>
+            <w:r>
+              <w:rPr>
+                <w:b/>
+                <w:bCs/>
+              </w:rPr>
+              <w:t>Equipe pedagógica</w:t>
+            </w:r>
+          </w:p>
+        </w:tc>
+        <w:tc>
+          <w:tcPr>
+            <w:tcW w:w="0" w:type="auto"/>
+            <w:vAlign w:val="center"/>
+            <w:hideMark/>
+          </w:tcPr>
+          <w:p>
+            <w:pPr>
+              <w:rPr>
+                <w:b/>
+                <w:bCs/>
+              </w:rPr>
+            </w:pPr>
+            <w:r>
+              <w:rPr>
+                <w:b/>
+                <w:bCs/>
+              </w:rPr>
               <w:t>AD-ADM</w:t>
             </w:r>
           </w:p>
@@ -3493,7 +3616,7 @@
         </w:trPr>
         <w:tc>
           <w:tcPr>
-            <w:tcW w:w="2790" w:type="dxa"/>
+            <w:tcW w:w="0" w:type="auto"/>
             <w:vAlign w:val="center"/>
             <w:hideMark/>
           </w:tcPr>
@@ -3504,47 +3627,80 @@
                 <w:bCs/>
               </w:rPr>
             </w:pPr>
-            <w:r>
-              <w:rPr>
-                <w:b/>
-                <w:bCs/>
-              </w:rPr>
-              <w:t>Cursos Superiores</w:t>
-            </w:r>
+            <w:hyperlink r:id="rId9" w:history="1">
+              <w:r>
+                <w:rPr>
+                  <w:rStyle w:val="Hyperlink"/>
+                  <w:b/>
+                  <w:bCs/>
+                </w:rPr>
+                <w:t>Cursos Superiores</w:t>
+              </w:r>
+            </w:hyperlink>
           </w:p>
         </w:tc>
         <w:tc>
           <w:tcPr>
-            <w:tcW w:w="1881" w:type="dxa"/>
+            <w:tcW w:w="0" w:type="auto"/>
             <w:vAlign w:val="center"/>
             <w:hideMark/>
           </w:tcPr>
           <w:p>
-            <w:r>
-              <w:t>GTI</w:t>
+            <w:pPr>
+              <w:rPr>
+                <w:b/>
+                <w:bCs/>
+              </w:rPr>
+            </w:pPr>
+            <w:r>
+              <w:rPr>
+                <w:b/>
+                <w:bCs/>
+              </w:rPr>
+              <w:t>GTI, GEV, GNP, GRH, DMD, Comércio Exterior, Gestão de Comércio Eletrônico, Transporte Terrestre, Gestão Empresarial EaD</w:t>
             </w:r>
           </w:p>
         </w:tc>
         <w:tc>
           <w:tcPr>
-            <w:tcW w:w="1745" w:type="dxa"/>
+            <w:tcW w:w="0" w:type="auto"/>
             <w:vAlign w:val="center"/>
             <w:hideMark/>
           </w:tcPr>
           <w:p>
-            <w:r>
+            <w:pPr>
+              <w:rPr>
+                <w:b/>
+                <w:bCs/>
+              </w:rPr>
+            </w:pPr>
+            <w:r>
+              <w:rPr>
+                <w:b/>
+                <w:bCs/>
+              </w:rPr>
               <w:t>Professores / Alunos</w:t>
             </w:r>
           </w:p>
         </w:tc>
         <w:tc>
           <w:tcPr>
-            <w:tcW w:w="2081" w:type="dxa"/>
+            <w:tcW w:w="0" w:type="auto"/>
             <w:vAlign w:val="center"/>
             <w:hideMark/>
           </w:tcPr>
           <w:p>
-            <w:r>
+            <w:pPr>
+              <w:rPr>
+                <w:b/>
+                <w:bCs/>
+              </w:rPr>
+            </w:pPr>
+            <w:r>
+              <w:rPr>
+                <w:b/>
+                <w:bCs/>
+              </w:rPr>
               <w:t>AD-ACAD</w:t>
             </w:r>
           </w:p>
@@ -3556,45 +3712,92 @@
         </w:trPr>
         <w:tc>
           <w:tcPr>
-            <w:tcW w:w="2790" w:type="dxa"/>
-            <w:vAlign w:val="center"/>
-            <w:hideMark/>
-          </w:tcPr>
-          <w:p/>
-        </w:tc>
-        <w:tc>
-          <w:tcPr>
-            <w:tcW w:w="1881" w:type="dxa"/>
+            <w:tcW w:w="0" w:type="auto"/>
             <w:vAlign w:val="center"/>
             <w:hideMark/>
           </w:tcPr>
           <w:p>
-            <w:r>
-              <w:t>GEV</w:t>
-            </w:r>
+            <w:pPr>
+              <w:rPr>
+                <w:b/>
+                <w:bCs/>
+              </w:rPr>
+            </w:pPr>
+            <w:hyperlink r:id="rId10" w:history="1">
+              <w:r>
+                <w:rPr>
+                  <w:rStyle w:val="Hyperlink"/>
+                  <w:b/>
+                  <w:bCs/>
+                </w:rPr>
+                <w:t>Órgãos e Comissões</w:t>
+              </w:r>
+            </w:hyperlink>
           </w:p>
         </w:tc>
         <w:tc>
           <w:tcPr>
-            <w:tcW w:w="1745" w:type="dxa"/>
+            <w:tcW w:w="0" w:type="auto"/>
             <w:vAlign w:val="center"/>
             <w:hideMark/>
           </w:tcPr>
           <w:p>
-            <w:r>
-              <w:t>Professores / Alunos</w:t>
+            <w:pPr>
+              <w:rPr>
+                <w:b/>
+                <w:bCs/>
+              </w:rPr>
+            </w:pPr>
+            <w:r>
+              <w:rPr>
+                <w:b/>
+                <w:bCs/>
+              </w:rPr>
+              <w:t>Congregação</w:t>
             </w:r>
           </w:p>
         </w:tc>
         <w:tc>
           <w:tcPr>
-            <w:tcW w:w="2081" w:type="dxa"/>
+            <w:tcW w:w="0" w:type="auto"/>
             <w:vAlign w:val="center"/>
             <w:hideMark/>
           </w:tcPr>
           <w:p>
-            <w:r>
-              <w:t>AD-ACAD</w:t>
+            <w:pPr>
+              <w:rPr>
+                <w:b/>
+                <w:bCs/>
+              </w:rPr>
+            </w:pPr>
+            <w:r>
+              <w:rPr>
+                <w:b/>
+                <w:bCs/>
+              </w:rPr>
+              <w:t>Membros colegiados</w:t>
+            </w:r>
+          </w:p>
+        </w:tc>
+        <w:tc>
+          <w:tcPr>
+            <w:tcW w:w="0" w:type="auto"/>
+            <w:vAlign w:val="center"/>
+            <w:hideMark/>
+          </w:tcPr>
+          <w:p>
+            <w:pPr>
+              <w:rPr>
+                <w:b/>
+                <w:bCs/>
+              </w:rPr>
+            </w:pPr>
+            <w:r>
+              <w:rPr>
+                <w:b/>
+                <w:bCs/>
+              </w:rPr>
+              <w:t>AD-ADM</w:t>
             </w:r>
           </w:p>
         </w:tc>
@@ -3605,45 +3808,82 @@
         </w:trPr>
         <w:tc>
           <w:tcPr>
-            <w:tcW w:w="2790" w:type="dxa"/>
-            <w:vAlign w:val="center"/>
-            <w:hideMark/>
-          </w:tcPr>
-          <w:p/>
-        </w:tc>
-        <w:tc>
-          <w:tcPr>
-            <w:tcW w:w="1881" w:type="dxa"/>
+            <w:tcW w:w="0" w:type="auto"/>
             <w:vAlign w:val="center"/>
             <w:hideMark/>
           </w:tcPr>
           <w:p>
-            <w:r>
-              <w:t>GNP</w:t>
-            </w:r>
+            <w:pPr>
+              <w:rPr>
+                <w:b/>
+                <w:bCs/>
+              </w:rPr>
+            </w:pPr>
           </w:p>
         </w:tc>
         <w:tc>
           <w:tcPr>
-            <w:tcW w:w="1745" w:type="dxa"/>
+            <w:tcW w:w="0" w:type="auto"/>
             <w:vAlign w:val="center"/>
             <w:hideMark/>
           </w:tcPr>
           <w:p>
-            <w:r>
-              <w:t>Professores / Alunos</w:t>
+            <w:pPr>
+              <w:rPr>
+                <w:b/>
+                <w:bCs/>
+              </w:rPr>
+            </w:pPr>
+            <w:r>
+              <w:rPr>
+                <w:b/>
+                <w:bCs/>
+              </w:rPr>
+              <w:t>CPA</w:t>
             </w:r>
           </w:p>
         </w:tc>
         <w:tc>
           <w:tcPr>
-            <w:tcW w:w="2081" w:type="dxa"/>
+            <w:tcW w:w="0" w:type="auto"/>
             <w:vAlign w:val="center"/>
             <w:hideMark/>
           </w:tcPr>
           <w:p>
-            <w:r>
-              <w:t>AD-ACAD</w:t>
+            <w:pPr>
+              <w:rPr>
+                <w:b/>
+                <w:bCs/>
+              </w:rPr>
+            </w:pPr>
+            <w:r>
+              <w:rPr>
+                <w:b/>
+                <w:bCs/>
+              </w:rPr>
+              <w:t>Avaliadores institucionais</w:t>
+            </w:r>
+          </w:p>
+        </w:tc>
+        <w:tc>
+          <w:tcPr>
+            <w:tcW w:w="0" w:type="auto"/>
+            <w:vAlign w:val="center"/>
+            <w:hideMark/>
+          </w:tcPr>
+          <w:p>
+            <w:pPr>
+              <w:rPr>
+                <w:b/>
+                <w:bCs/>
+              </w:rPr>
+            </w:pPr>
+            <w:r>
+              <w:rPr>
+                <w:b/>
+                <w:bCs/>
+              </w:rPr>
+              <w:t>AD-ADM</w:t>
             </w:r>
           </w:p>
         </w:tc>
@@ -3654,45 +3894,82 @@
         </w:trPr>
         <w:tc>
           <w:tcPr>
-            <w:tcW w:w="2790" w:type="dxa"/>
-            <w:vAlign w:val="center"/>
-            <w:hideMark/>
-          </w:tcPr>
-          <w:p/>
-        </w:tc>
-        <w:tc>
-          <w:tcPr>
-            <w:tcW w:w="1881" w:type="dxa"/>
+            <w:tcW w:w="0" w:type="auto"/>
             <w:vAlign w:val="center"/>
             <w:hideMark/>
           </w:tcPr>
           <w:p>
-            <w:r>
-              <w:t>GRH</w:t>
-            </w:r>
+            <w:pPr>
+              <w:rPr>
+                <w:b/>
+                <w:bCs/>
+              </w:rPr>
+            </w:pPr>
           </w:p>
         </w:tc>
         <w:tc>
           <w:tcPr>
-            <w:tcW w:w="1745" w:type="dxa"/>
+            <w:tcW w:w="0" w:type="auto"/>
             <w:vAlign w:val="center"/>
             <w:hideMark/>
           </w:tcPr>
           <w:p>
-            <w:r>
-              <w:t>Professores / Alunos</w:t>
+            <w:pPr>
+              <w:rPr>
+                <w:b/>
+                <w:bCs/>
+              </w:rPr>
+            </w:pPr>
+            <w:r>
+              <w:rPr>
+                <w:b/>
+                <w:bCs/>
+              </w:rPr>
+              <w:t>CIPA</w:t>
             </w:r>
           </w:p>
         </w:tc>
         <w:tc>
           <w:tcPr>
-            <w:tcW w:w="2081" w:type="dxa"/>
+            <w:tcW w:w="0" w:type="auto"/>
             <w:vAlign w:val="center"/>
             <w:hideMark/>
           </w:tcPr>
           <w:p>
-            <w:r>
-              <w:t>AD-ACAD</w:t>
+            <w:pPr>
+              <w:rPr>
+                <w:b/>
+                <w:bCs/>
+              </w:rPr>
+            </w:pPr>
+            <w:r>
+              <w:rPr>
+                <w:b/>
+                <w:bCs/>
+              </w:rPr>
+              <w:t>Representantes</w:t>
+            </w:r>
+          </w:p>
+        </w:tc>
+        <w:tc>
+          <w:tcPr>
+            <w:tcW w:w="0" w:type="auto"/>
+            <w:vAlign w:val="center"/>
+            <w:hideMark/>
+          </w:tcPr>
+          <w:p>
+            <w:pPr>
+              <w:rPr>
+                <w:b/>
+                <w:bCs/>
+              </w:rPr>
+            </w:pPr>
+            <w:r>
+              <w:rPr>
+                <w:b/>
+                <w:bCs/>
+              </w:rPr>
+              <w:t>AD-ADM</w:t>
             </w:r>
           </w:p>
         </w:tc>
@@ -3703,252 +3980,7 @@
         </w:trPr>
         <w:tc>
           <w:tcPr>
-            <w:tcW w:w="2790" w:type="dxa"/>
-            <w:vAlign w:val="center"/>
-            <w:hideMark/>
-          </w:tcPr>
-          <w:p/>
-        </w:tc>
-        <w:tc>
-          <w:tcPr>
-            <w:tcW w:w="1881" w:type="dxa"/>
-            <w:vAlign w:val="center"/>
-            <w:hideMark/>
-          </w:tcPr>
-          <w:p>
-            <w:r>
-              <w:t>DMD</w:t>
-            </w:r>
-          </w:p>
-        </w:tc>
-        <w:tc>
-          <w:tcPr>
-            <w:tcW w:w="1745" w:type="dxa"/>
-            <w:vAlign w:val="center"/>
-            <w:hideMark/>
-          </w:tcPr>
-          <w:p>
-            <w:r>
-              <w:t>Professores / Alunos</w:t>
-            </w:r>
-          </w:p>
-        </w:tc>
-        <w:tc>
-          <w:tcPr>
-            <w:tcW w:w="2081" w:type="dxa"/>
-            <w:vAlign w:val="center"/>
-            <w:hideMark/>
-          </w:tcPr>
-          <w:p>
-            <w:r>
-              <w:t>AD-ACAD</w:t>
-            </w:r>
-          </w:p>
-        </w:tc>
-      </w:tr>
-      <w:tr>
-        <w:trPr>
-          <w:tblCellSpacing w:w="15" w:type="dxa"/>
-        </w:trPr>
-        <w:tc>
-          <w:tcPr>
-            <w:tcW w:w="2790" w:type="dxa"/>
-            <w:vAlign w:val="center"/>
-            <w:hideMark/>
-          </w:tcPr>
-          <w:p/>
-        </w:tc>
-        <w:tc>
-          <w:tcPr>
-            <w:tcW w:w="1881" w:type="dxa"/>
-            <w:vAlign w:val="center"/>
-            <w:hideMark/>
-          </w:tcPr>
-          <w:p>
-            <w:r>
-              <w:t>Comércio Exterior</w:t>
-            </w:r>
-          </w:p>
-        </w:tc>
-        <w:tc>
-          <w:tcPr>
-            <w:tcW w:w="1745" w:type="dxa"/>
-            <w:vAlign w:val="center"/>
-            <w:hideMark/>
-          </w:tcPr>
-          <w:p>
-            <w:r>
-              <w:t>Professores / Alunos</w:t>
-            </w:r>
-          </w:p>
-        </w:tc>
-        <w:tc>
-          <w:tcPr>
-            <w:tcW w:w="2081" w:type="dxa"/>
-            <w:vAlign w:val="center"/>
-            <w:hideMark/>
-          </w:tcPr>
-          <w:p>
-            <w:r>
-              <w:t>AD-ACAD</w:t>
-            </w:r>
-          </w:p>
-        </w:tc>
-      </w:tr>
-      <w:tr>
-        <w:trPr>
-          <w:tblCellSpacing w:w="15" w:type="dxa"/>
-        </w:trPr>
-        <w:tc>
-          <w:tcPr>
-            <w:tcW w:w="2790" w:type="dxa"/>
-            <w:vAlign w:val="center"/>
-            <w:hideMark/>
-          </w:tcPr>
-          <w:p/>
-        </w:tc>
-        <w:tc>
-          <w:tcPr>
-            <w:tcW w:w="1881" w:type="dxa"/>
-            <w:vAlign w:val="center"/>
-            <w:hideMark/>
-          </w:tcPr>
-          <w:p>
-            <w:r>
-              <w:t>Gestão de Comércio Eletrônico</w:t>
-            </w:r>
-          </w:p>
-        </w:tc>
-        <w:tc>
-          <w:tcPr>
-            <w:tcW w:w="1745" w:type="dxa"/>
-            <w:vAlign w:val="center"/>
-            <w:hideMark/>
-          </w:tcPr>
-          <w:p>
-            <w:r>
-              <w:t>Professores / Alunos</w:t>
-            </w:r>
-          </w:p>
-        </w:tc>
-        <w:tc>
-          <w:tcPr>
-            <w:tcW w:w="2081" w:type="dxa"/>
-            <w:vAlign w:val="center"/>
-            <w:hideMark/>
-          </w:tcPr>
-          <w:p>
-            <w:r>
-              <w:t>AD-ACAD</w:t>
-            </w:r>
-          </w:p>
-        </w:tc>
-      </w:tr>
-      <w:tr>
-        <w:trPr>
-          <w:tblCellSpacing w:w="15" w:type="dxa"/>
-        </w:trPr>
-        <w:tc>
-          <w:tcPr>
-            <w:tcW w:w="2790" w:type="dxa"/>
-            <w:vAlign w:val="center"/>
-            <w:hideMark/>
-          </w:tcPr>
-          <w:p/>
-        </w:tc>
-        <w:tc>
-          <w:tcPr>
-            <w:tcW w:w="1881" w:type="dxa"/>
-            <w:vAlign w:val="center"/>
-            <w:hideMark/>
-          </w:tcPr>
-          <w:p>
-            <w:r>
-              <w:t>Transporte Terrestre</w:t>
-            </w:r>
-          </w:p>
-        </w:tc>
-        <w:tc>
-          <w:tcPr>
-            <w:tcW w:w="1745" w:type="dxa"/>
-            <w:vAlign w:val="center"/>
-            <w:hideMark/>
-          </w:tcPr>
-          <w:p>
-            <w:r>
-              <w:t>Professores / Alunos</w:t>
-            </w:r>
-          </w:p>
-        </w:tc>
-        <w:tc>
-          <w:tcPr>
-            <w:tcW w:w="2081" w:type="dxa"/>
-            <w:vAlign w:val="center"/>
-            <w:hideMark/>
-          </w:tcPr>
-          <w:p>
-            <w:r>
-              <w:t>AD-ACAD</w:t>
-            </w:r>
-          </w:p>
-        </w:tc>
-      </w:tr>
-      <w:tr>
-        <w:trPr>
-          <w:tblCellSpacing w:w="15" w:type="dxa"/>
-        </w:trPr>
-        <w:tc>
-          <w:tcPr>
-            <w:tcW w:w="2790" w:type="dxa"/>
-            <w:vAlign w:val="center"/>
-            <w:hideMark/>
-          </w:tcPr>
-          <w:p/>
-        </w:tc>
-        <w:tc>
-          <w:tcPr>
-            <w:tcW w:w="1881" w:type="dxa"/>
-            <w:vAlign w:val="center"/>
-            <w:hideMark/>
-          </w:tcPr>
-          <w:p>
-            <w:r>
-              <w:t>Gestão Empresarial EaD</w:t>
-            </w:r>
-          </w:p>
-        </w:tc>
-        <w:tc>
-          <w:tcPr>
-            <w:tcW w:w="1745" w:type="dxa"/>
-            <w:vAlign w:val="center"/>
-            <w:hideMark/>
-          </w:tcPr>
-          <w:p>
-            <w:r>
-              <w:t>Professores / Alunos</w:t>
-            </w:r>
-          </w:p>
-        </w:tc>
-        <w:tc>
-          <w:tcPr>
-            <w:tcW w:w="2081" w:type="dxa"/>
-            <w:vAlign w:val="center"/>
-            <w:hideMark/>
-          </w:tcPr>
-          <w:p>
-            <w:r>
-              <w:t>AD-ACAD</w:t>
-            </w:r>
-          </w:p>
-        </w:tc>
-      </w:tr>
-      <w:tr>
-        <w:trPr>
-          <w:tblCellSpacing w:w="15" w:type="dxa"/>
-        </w:trPr>
-        <w:tc>
-          <w:tcPr>
-            <w:tcW w:w="2790" w:type="dxa"/>
+            <w:tcW w:w="0" w:type="auto"/>
             <w:vAlign w:val="center"/>
             <w:hideMark/>
           </w:tcPr>
@@ -3959,197 +3991,70 @@
                 <w:bCs/>
               </w:rPr>
             </w:pPr>
-            <w:r>
-              <w:rPr>
-                <w:b/>
-                <w:bCs/>
-              </w:rPr>
-              <w:t>Órgãos e Comissões</w:t>
-            </w:r>
           </w:p>
         </w:tc>
         <w:tc>
           <w:tcPr>
-            <w:tcW w:w="1881" w:type="dxa"/>
-            <w:vAlign w:val="center"/>
-            <w:hideMark/>
-          </w:tcPr>
-          <w:p>
-            <w:r>
-              <w:t>Congregação</w:t>
-            </w:r>
-          </w:p>
-        </w:tc>
-        <w:tc>
-          <w:tcPr>
-            <w:tcW w:w="1745" w:type="dxa"/>
-            <w:vAlign w:val="center"/>
-            <w:hideMark/>
-          </w:tcPr>
-          <w:p>
-            <w:r>
-              <w:t>Membros colegiados</w:t>
-            </w:r>
-          </w:p>
-        </w:tc>
-        <w:tc>
-          <w:tcPr>
-            <w:tcW w:w="2081" w:type="dxa"/>
-            <w:vAlign w:val="center"/>
-            <w:hideMark/>
-          </w:tcPr>
-          <w:p>
-            <w:r>
-              <w:t>AD-ADM</w:t>
-            </w:r>
-          </w:p>
-        </w:tc>
-      </w:tr>
-      <w:tr>
-        <w:trPr>
-          <w:tblCellSpacing w:w="15" w:type="dxa"/>
-        </w:trPr>
-        <w:tc>
-          <w:tcPr>
-            <w:tcW w:w="2790" w:type="dxa"/>
-            <w:vAlign w:val="center"/>
-            <w:hideMark/>
-          </w:tcPr>
-          <w:p/>
-        </w:tc>
-        <w:tc>
-          <w:tcPr>
-            <w:tcW w:w="1881" w:type="dxa"/>
-            <w:vAlign w:val="center"/>
-            <w:hideMark/>
-          </w:tcPr>
-          <w:p>
-            <w:r>
-              <w:t>CPA</w:t>
-            </w:r>
-          </w:p>
-        </w:tc>
-        <w:tc>
-          <w:tcPr>
-            <w:tcW w:w="1745" w:type="dxa"/>
-            <w:vAlign w:val="center"/>
-            <w:hideMark/>
-          </w:tcPr>
-          <w:p>
-            <w:r>
-              <w:t>Avaliadores institucionais</w:t>
-            </w:r>
-          </w:p>
-        </w:tc>
-        <w:tc>
-          <w:tcPr>
-            <w:tcW w:w="2081" w:type="dxa"/>
-            <w:vAlign w:val="center"/>
-            <w:hideMark/>
-          </w:tcPr>
-          <w:p>
-            <w:r>
-              <w:t>AD-ADM</w:t>
-            </w:r>
-          </w:p>
-        </w:tc>
-      </w:tr>
-      <w:tr>
-        <w:trPr>
-          <w:tblCellSpacing w:w="15" w:type="dxa"/>
-        </w:trPr>
-        <w:tc>
-          <w:tcPr>
-            <w:tcW w:w="2790" w:type="dxa"/>
-            <w:vAlign w:val="center"/>
-            <w:hideMark/>
-          </w:tcPr>
-          <w:p/>
-        </w:tc>
-        <w:tc>
-          <w:tcPr>
-            <w:tcW w:w="1881" w:type="dxa"/>
-            <w:vAlign w:val="center"/>
-            <w:hideMark/>
-          </w:tcPr>
-          <w:p>
-            <w:r>
-              <w:t>CIPA</w:t>
-            </w:r>
-          </w:p>
-        </w:tc>
-        <w:tc>
-          <w:tcPr>
-            <w:tcW w:w="1745" w:type="dxa"/>
-            <w:vAlign w:val="center"/>
-            <w:hideMark/>
-          </w:tcPr>
-          <w:p>
-            <w:r>
-              <w:t>Representantes</w:t>
-            </w:r>
-          </w:p>
-        </w:tc>
-        <w:tc>
-          <w:tcPr>
-            <w:tcW w:w="2081" w:type="dxa"/>
-            <w:vAlign w:val="center"/>
-            <w:hideMark/>
-          </w:tcPr>
-          <w:p>
-            <w:r>
-              <w:t>AD-ADM</w:t>
-            </w:r>
-          </w:p>
-        </w:tc>
-      </w:tr>
-      <w:tr>
-        <w:trPr>
-          <w:tblCellSpacing w:w="15" w:type="dxa"/>
-        </w:trPr>
-        <w:tc>
-          <w:tcPr>
-            <w:tcW w:w="2790" w:type="dxa"/>
-            <w:vAlign w:val="center"/>
-            <w:hideMark/>
-          </w:tcPr>
-          <w:p/>
-        </w:tc>
-        <w:tc>
-          <w:tcPr>
-            <w:tcW w:w="1881" w:type="dxa"/>
-            <w:vAlign w:val="center"/>
-            <w:hideMark/>
-          </w:tcPr>
-          <w:p>
-            <w:r>
-              <w:t>NDE</w:t>
-            </w:r>
-          </w:p>
-        </w:tc>
-        <w:tc>
-          <w:tcPr>
-            <w:tcW w:w="1745" w:type="dxa"/>
-            <w:vAlign w:val="center"/>
-            <w:hideMark/>
-          </w:tcPr>
-          <w:p>
-            <w:r>
-              <w:t>Professores responsáveis</w:t>
-            </w:r>
-          </w:p>
-        </w:tc>
-        <w:tc>
-          <w:tcPr>
-            <w:tcW w:w="2081" w:type="dxa"/>
+            <w:tcW w:w="0" w:type="auto"/>
             <w:vAlign w:val="center"/>
             <w:hideMark/>
           </w:tcPr>
           <w:p>
             <w:pPr>
-              <w:keepNext/>
+              <w:rPr>
+                <w:b/>
+                <w:bCs/>
+              </w:rPr>
             </w:pPr>
             <w:r>
+              <w:rPr>
+                <w:b/>
+                <w:bCs/>
+              </w:rPr>
+              <w:t>NDE</w:t>
+            </w:r>
+          </w:p>
+        </w:tc>
+        <w:tc>
+          <w:tcPr>
+            <w:tcW w:w="0" w:type="auto"/>
+            <w:vAlign w:val="center"/>
+            <w:hideMark/>
+          </w:tcPr>
+          <w:p>
+            <w:pPr>
+              <w:rPr>
+                <w:b/>
+                <w:bCs/>
+              </w:rPr>
+            </w:pPr>
+            <w:r>
+              <w:rPr>
+                <w:b/>
+                <w:bCs/>
+              </w:rPr>
+              <w:t>Professores responsáveis</w:t>
+            </w:r>
+          </w:p>
+        </w:tc>
+        <w:tc>
+          <w:tcPr>
+            <w:tcW w:w="0" w:type="auto"/>
+            <w:vAlign w:val="center"/>
+            <w:hideMark/>
+          </w:tcPr>
+          <w:p>
+            <w:pPr>
+              <w:rPr>
+                <w:b/>
+                <w:bCs/>
+              </w:rPr>
+            </w:pPr>
+            <w:r>
+              <w:rPr>
+                <w:b/>
+                <w:bCs/>
+              </w:rPr>
               <w:t>AD-ADM</w:t>
             </w:r>
           </w:p>
@@ -4159,6 +4064,7 @@
     <w:p>
       <w:pPr>
         <w:pStyle w:val="Caption"/>
+        <w:ind w:left="0" w:firstLine="0"/>
       </w:pPr>
       <w:r>
         <w:t xml:space="preserve">Tabela </w:t>
@@ -4185,6 +4091,8 @@
         <w:t xml:space="preserve"> - Tabela dos setores</w:t>
       </w:r>
     </w:p>
+    <w:p/>
+    <w:p/>
     <w:p/>
     <w:p/>
     <w:p/>
@@ -5285,85 +5193,43 @@
     <w:p/>
     <w:p>
       <w:r>
-        <w:t>Política de Senhas Fortes</w:t>
-      </w:r>
-      <w:r>
-        <w:t xml:space="preserve">: </w:t>
-      </w:r>
-      <w:r>
-        <w:t>A senha inicial de cada usuário será gerada automaticamente, com troca obrigatória no primeiro acesso. Todas as senhas terão expiração periódica definida em 90 dias e deverão atender a critérios de complexidade mínima, incluindo ao menos 12 caracteres, com letras maiúsculas, minúsculas, números e símbolos.</w:t>
-      </w:r>
-    </w:p>
-    <w:p/>
-    <w:p>
-      <w:r>
-        <w:t>Bloqueio de Contas</w:t>
-      </w:r>
-      <w:r>
-        <w:t xml:space="preserve">: </w:t>
-      </w:r>
-      <w:r>
-        <w:t>As contas serão bloqueadas automaticamente após cinco tentativas consecutivas de login mal-sucedidas, prevenindo ataques de força bruta e acessos indevidos.</w:t>
-      </w:r>
-    </w:p>
-    <w:p/>
-    <w:p>
-      <w:r>
-        <w:t>Restrições Administrativas</w:t>
-      </w:r>
-      <w:r>
-        <w:t xml:space="preserve">: </w:t>
-      </w:r>
-      <w:r>
-        <w:t>Nas máquinas públicas e laboratórios, o acesso ao Editor de Registro, ao Prompt de Comando e ao Painel de Controle será bloqueado, além de serem impedidas alterações na área de trabalho. Essas medidas evitam modificações críticas não autorizadas.</w:t>
-      </w:r>
-    </w:p>
-    <w:p/>
-    <w:p>
-      <w:r>
-        <w:t>Auditoria de Acessos</w:t>
-      </w:r>
-      <w:r>
-        <w:t xml:space="preserve">: </w:t>
-      </w:r>
-      <w:r>
-        <w:t>Todos os logins, falhas de autenticação e acessos a recursos críticos serão registrados em logs detalhados. Relatórios periódicos serão disponibilizados para análise da equipe de TI, garantindo rastreabilidade e transparência.</w:t>
-      </w:r>
-    </w:p>
-    <w:p/>
-    <w:p>
-      <w:r>
-        <w:t>Controle de Softwares</w:t>
-      </w:r>
-      <w:r>
-        <w:t xml:space="preserve">: </w:t>
-      </w:r>
-      <w:r>
-        <w:t>A instalação de programas sem privilégios administrativos será bloqueada, reduzindo riscos de malware e alterações indevidas. Dispositivos externos permanecem autorizados, mas sujeitos a monitoramento futuro.</w:t>
-      </w:r>
-    </w:p>
-    <w:p/>
-    <w:p>
-      <w:r>
-        <w:t>Sessões Ociosas</w:t>
-      </w:r>
-      <w:r>
-        <w:t xml:space="preserve">: </w:t>
-      </w:r>
-      <w:r>
-        <w:t>Para evitar uso indevido de máquinas abertas em laboratórios, será aplicado bloqueio automático após 1 hora de inatividade, equilibrando segurança e usabilidade.</w:t>
-      </w:r>
-    </w:p>
-    <w:p/>
-    <w:p>
-      <w:r>
-        <w:t>Atualizações Automáticas</w:t>
-      </w:r>
-      <w:r>
-        <w:t xml:space="preserve">: </w:t>
-      </w:r>
-      <w:r>
-        <w:t>Nos computadores administrativos, vinculados ao Windows Server (AD-ADM), as atualizações serão aplicadas via GPO e Windows Update for Business.</w:t>
+        <w:t>Política de Senhas Fortes: A senha inicial de cada usuário será gerada automaticamente, com troca obrigatória no primeiro acesso. Todas as senhas terão expiração periódica definida em 90 dias e deverão atender a critérios de complexidade mínima, incluindo ao menos 12 caracteres, com letras maiúsculas, minúsculas, números e símbolos.</w:t>
+      </w:r>
+    </w:p>
+    <w:p/>
+    <w:p>
+      <w:r>
+        <w:t>Bloqueio de Contas: As contas serão bloqueadas automaticamente após cinco tentativas consecutivas de login mal-sucedidas, prevenindo ataques de força bruta e acessos indevidos.</w:t>
+      </w:r>
+    </w:p>
+    <w:p/>
+    <w:p>
+      <w:r>
+        <w:t>Restrições Administrativas: Nas máquinas públicas e laboratórios, o acesso ao Editor de Registro, ao Prompt de Comando e ao Painel de Controle será bloqueado, além de serem impedidas alterações na área de trabalho. Essas medidas evitam modificações críticas não autorizadas.</w:t>
+      </w:r>
+    </w:p>
+    <w:p/>
+    <w:p>
+      <w:r>
+        <w:t>Auditoria de Acessos: Todos os logins, falhas de autenticação e acessos a recursos críticos serão registrados em logs detalhados. Relatórios periódicos serão disponibilizados para análise da equipe de TI, garantindo rastreabilidade e transparência.</w:t>
+      </w:r>
+    </w:p>
+    <w:p/>
+    <w:p>
+      <w:r>
+        <w:t>Controle de Softwares: A instalação de programas sem privilégios administrativos será bloqueada, reduzindo riscos de malware e alterações indevidas. Dispositivos externos permanecem autorizados, mas sujeitos a monitoramento futuro.</w:t>
+      </w:r>
+    </w:p>
+    <w:p/>
+    <w:p>
+      <w:r>
+        <w:t>Sessões Ociosas: Para evitar uso indevido de máquinas abertas em laboratórios, será aplicado bloqueio automático após 1 hora de inatividade, equilibrando segurança e usabilidade.</w:t>
+      </w:r>
+    </w:p>
+    <w:p/>
+    <w:p>
+      <w:r>
+        <w:t>Atualizações Automáticas: Nos computadores administrativos, vinculados ao Windows Server (AD-ADM), as atualizações serão aplicadas via GPO e Windows Update for Business.</w:t>
       </w:r>
     </w:p>
     <w:p>
@@ -5808,7 +5674,7 @@
                     </pic:cNvPicPr>
                   </pic:nvPicPr>
                   <pic:blipFill>
-                    <a:blip r:embed="rId8">
+                    <a:blip r:embed="rId11">
                       <a:extLst>
                         <a:ext uri="{28A0092B-C50C-407E-A947-70E740481C1C}">
                           <a14:useLocalDpi xmlns:a14="http://schemas.microsoft.com/office/drawing/2010/main" val="0"/>
@@ -5841,9 +5707,9 @@
       </w:r>
     </w:p>
     <w:sectPr>
-      <w:headerReference w:type="even" r:id="rId9"/>
-      <w:headerReference w:type="default" r:id="rId10"/>
-      <w:headerReference w:type="first" r:id="rId11"/>
+      <w:headerReference w:type="even" r:id="rId12"/>
+      <w:headerReference w:type="default" r:id="rId13"/>
+      <w:headerReference w:type="first" r:id="rId14"/>
       <w:pgSz w:w="11906" w:h="16838"/>
       <w:pgMar w:top="1426" w:right="1634" w:bottom="1483" w:left="1702" w:header="716" w:footer="720" w:gutter="0"/>
       <w:cols w:space="720"/>

</xml_diff>

<commit_message>
doc: atualização da monografia
</commit_message>
<xml_diff>
--- a/docs/docs/Faculdade de Tecnologia Padre Danilo José de Oliveira Ohl.docx
+++ b/docs/docs/Faculdade de Tecnologia Padre Danilo José de Oliveira Ohl.docx
@@ -1529,7 +1529,7 @@
           <w:r>
             <w:fldChar w:fldCharType="separate"/>
           </w:r>
-          <w:hyperlink w:anchor="_Toc238152511" w:history="1">
+          <w:hyperlink w:anchor="_Toc238763052" w:history="1">
             <w:r>
               <w:rPr>
                 <w:rStyle w:val="Hyperlink"/>
@@ -1556,7 +1556,7 @@
                 <w:noProof/>
                 <w:webHidden/>
               </w:rPr>
-              <w:instrText xml:space="preserve"> PAGEREF _Toc238152511 \h </w:instrText>
+              <w:instrText xml:space="preserve"> PAGEREF _Toc238763052 \h </w:instrText>
             </w:r>
             <w:r>
               <w:rPr>
@@ -1600,7 +1600,7 @@
               <w:color w:val="auto"/>
             </w:rPr>
           </w:pPr>
-          <w:hyperlink w:anchor="_Toc238152512" w:history="1">
+          <w:hyperlink w:anchor="_Toc238763053" w:history="1">
             <w:r>
               <w:rPr>
                 <w:rStyle w:val="Hyperlink"/>
@@ -1642,7 +1642,7 @@
                 <w:noProof/>
                 <w:webHidden/>
               </w:rPr>
-              <w:instrText xml:space="preserve"> PAGEREF _Toc238152512 \h </w:instrText>
+              <w:instrText xml:space="preserve"> PAGEREF _Toc238763053 \h </w:instrText>
             </w:r>
             <w:r>
               <w:rPr>
@@ -1686,7 +1686,7 @@
               <w:color w:val="auto"/>
             </w:rPr>
           </w:pPr>
-          <w:hyperlink w:anchor="_Toc238152513" w:history="1">
+          <w:hyperlink w:anchor="_Toc238763054" w:history="1">
             <w:r>
               <w:rPr>
                 <w:rStyle w:val="Hyperlink"/>
@@ -1728,7 +1728,7 @@
                 <w:noProof/>
                 <w:webHidden/>
               </w:rPr>
-              <w:instrText xml:space="preserve"> PAGEREF _Toc238152513 \h </w:instrText>
+              <w:instrText xml:space="preserve"> PAGEREF _Toc238763054 \h </w:instrText>
             </w:r>
             <w:r>
               <w:rPr>
@@ -1772,7 +1772,7 @@
               <w:color w:val="auto"/>
             </w:rPr>
           </w:pPr>
-          <w:hyperlink w:anchor="_Toc238152514" w:history="1">
+          <w:hyperlink w:anchor="_Toc238763055" w:history="1">
             <w:r>
               <w:rPr>
                 <w:rStyle w:val="Hyperlink"/>
@@ -1814,7 +1814,7 @@
                 <w:noProof/>
                 <w:webHidden/>
               </w:rPr>
-              <w:instrText xml:space="preserve"> PAGEREF _Toc238152514 \h </w:instrText>
+              <w:instrText xml:space="preserve"> PAGEREF _Toc238763055 \h </w:instrText>
             </w:r>
             <w:r>
               <w:rPr>
@@ -1834,7 +1834,7 @@
                 <w:noProof/>
                 <w:webHidden/>
               </w:rPr>
-              <w:t>12</w:t>
+              <w:t>10</w:t>
             </w:r>
             <w:r>
               <w:rPr>
@@ -1858,7 +1858,7 @@
               <w:color w:val="auto"/>
             </w:rPr>
           </w:pPr>
-          <w:hyperlink w:anchor="_Toc238152515" w:history="1">
+          <w:hyperlink w:anchor="_Toc238763056" w:history="1">
             <w:r>
               <w:rPr>
                 <w:rStyle w:val="Hyperlink"/>
@@ -1879,7 +1879,7 @@
                 <w:rStyle w:val="Hyperlink"/>
                 <w:noProof/>
               </w:rPr>
-              <w:t>Levantamento da infraestrutura de servidores e rede</w:t>
+              <w:t>Infraestrutura de servidores e rede</w:t>
             </w:r>
             <w:r>
               <w:rPr>
@@ -1900,7 +1900,7 @@
                 <w:noProof/>
                 <w:webHidden/>
               </w:rPr>
-              <w:instrText xml:space="preserve"> PAGEREF _Toc238152515 \h </w:instrText>
+              <w:instrText xml:space="preserve"> PAGEREF _Toc238763056 \h </w:instrText>
             </w:r>
             <w:r>
               <w:rPr>
@@ -1920,7 +1920,7 @@
                 <w:noProof/>
                 <w:webHidden/>
               </w:rPr>
-              <w:t>14</w:t>
+              <w:t>12</w:t>
             </w:r>
             <w:r>
               <w:rPr>
@@ -1944,7 +1944,7 @@
               <w:color w:val="auto"/>
             </w:rPr>
           </w:pPr>
-          <w:hyperlink w:anchor="_Toc238152516" w:history="1">
+          <w:hyperlink w:anchor="_Toc238763057" w:history="1">
             <w:r>
               <w:rPr>
                 <w:rStyle w:val="Hyperlink"/>
@@ -1986,7 +1986,7 @@
                 <w:noProof/>
                 <w:webHidden/>
               </w:rPr>
-              <w:instrText xml:space="preserve"> PAGEREF _Toc238152516 \h </w:instrText>
+              <w:instrText xml:space="preserve"> PAGEREF _Toc238763057 \h </w:instrText>
             </w:r>
             <w:r>
               <w:rPr>
@@ -2006,7 +2006,7 @@
                 <w:noProof/>
                 <w:webHidden/>
               </w:rPr>
-              <w:t>16</w:t>
+              <w:t>14</w:t>
             </w:r>
             <w:r>
               <w:rPr>
@@ -2029,7 +2029,7 @@
               <w:color w:val="auto"/>
             </w:rPr>
           </w:pPr>
-          <w:hyperlink w:anchor="_Toc238152517" w:history="1">
+          <w:hyperlink w:anchor="_Toc238763058" w:history="1">
             <w:r>
               <w:rPr>
                 <w:rStyle w:val="Hyperlink"/>
@@ -2056,7 +2056,7 @@
                 <w:noProof/>
                 <w:webHidden/>
               </w:rPr>
-              <w:instrText xml:space="preserve"> PAGEREF _Toc238152517 \h </w:instrText>
+              <w:instrText xml:space="preserve"> PAGEREF _Toc238763058 \h </w:instrText>
             </w:r>
             <w:r>
               <w:rPr>
@@ -2076,7 +2076,7 @@
                 <w:noProof/>
                 <w:webHidden/>
               </w:rPr>
-              <w:t>16</w:t>
+              <w:t>14</w:t>
             </w:r>
             <w:r>
               <w:rPr>
@@ -2099,7 +2099,7 @@
               <w:color w:val="auto"/>
             </w:rPr>
           </w:pPr>
-          <w:hyperlink w:anchor="_Toc238152518" w:history="1">
+          <w:hyperlink w:anchor="_Toc238763059" w:history="1">
             <w:r>
               <w:rPr>
                 <w:rStyle w:val="Hyperlink"/>
@@ -2126,7 +2126,7 @@
                 <w:noProof/>
                 <w:webHidden/>
               </w:rPr>
-              <w:instrText xml:space="preserve"> PAGEREF _Toc238152518 \h </w:instrText>
+              <w:instrText xml:space="preserve"> PAGEREF _Toc238763059 \h </w:instrText>
             </w:r>
             <w:r>
               <w:rPr>
@@ -2146,7 +2146,7 @@
                 <w:noProof/>
                 <w:webHidden/>
               </w:rPr>
-              <w:t>16</w:t>
+              <w:t>14</w:t>
             </w:r>
             <w:r>
               <w:rPr>
@@ -2169,7 +2169,7 @@
               <w:color w:val="auto"/>
             </w:rPr>
           </w:pPr>
-          <w:hyperlink w:anchor="_Toc238152519" w:history="1">
+          <w:hyperlink w:anchor="_Toc238763060" w:history="1">
             <w:r>
               <w:rPr>
                 <w:rStyle w:val="Hyperlink"/>
@@ -2196,7 +2196,7 @@
                 <w:noProof/>
                 <w:webHidden/>
               </w:rPr>
-              <w:instrText xml:space="preserve"> PAGEREF _Toc238152519 \h </w:instrText>
+              <w:instrText xml:space="preserve"> PAGEREF _Toc238763060 \h </w:instrText>
             </w:r>
             <w:r>
               <w:rPr>
@@ -2216,7 +2216,7 @@
                 <w:noProof/>
                 <w:webHidden/>
               </w:rPr>
-              <w:t>16</w:t>
+              <w:t>14</w:t>
             </w:r>
             <w:r>
               <w:rPr>
@@ -2239,7 +2239,7 @@
               <w:color w:val="auto"/>
             </w:rPr>
           </w:pPr>
-          <w:hyperlink w:anchor="_Toc238152520" w:history="1">
+          <w:hyperlink w:anchor="_Toc238763061" w:history="1">
             <w:r>
               <w:rPr>
                 <w:rStyle w:val="Hyperlink"/>
@@ -2266,7 +2266,7 @@
                 <w:noProof/>
                 <w:webHidden/>
               </w:rPr>
-              <w:instrText xml:space="preserve"> PAGEREF _Toc238152520 \h </w:instrText>
+              <w:instrText xml:space="preserve"> PAGEREF _Toc238763061 \h </w:instrText>
             </w:r>
             <w:r>
               <w:rPr>
@@ -2286,7 +2286,7 @@
                 <w:noProof/>
                 <w:webHidden/>
               </w:rPr>
-              <w:t>16</w:t>
+              <w:t>14</w:t>
             </w:r>
             <w:r>
               <w:rPr>
@@ -2309,7 +2309,7 @@
               <w:color w:val="auto"/>
             </w:rPr>
           </w:pPr>
-          <w:hyperlink w:anchor="_Toc238152521" w:history="1">
+          <w:hyperlink w:anchor="_Toc238763062" w:history="1">
             <w:r>
               <w:rPr>
                 <w:rStyle w:val="Hyperlink"/>
@@ -2336,7 +2336,7 @@
                 <w:noProof/>
                 <w:webHidden/>
               </w:rPr>
-              <w:instrText xml:space="preserve"> PAGEREF _Toc238152521 \h </w:instrText>
+              <w:instrText xml:space="preserve"> PAGEREF _Toc238763062 \h </w:instrText>
             </w:r>
             <w:r>
               <w:rPr>
@@ -2356,7 +2356,7 @@
                 <w:noProof/>
                 <w:webHidden/>
               </w:rPr>
-              <w:t>17</w:t>
+              <w:t>15</w:t>
             </w:r>
             <w:r>
               <w:rPr>
@@ -2380,7 +2380,7 @@
               <w:color w:val="auto"/>
             </w:rPr>
           </w:pPr>
-          <w:hyperlink w:anchor="_Toc238152522" w:history="1">
+          <w:hyperlink w:anchor="_Toc238763063" w:history="1">
             <w:r>
               <w:rPr>
                 <w:rStyle w:val="Hyperlink"/>
@@ -2401,7 +2401,7 @@
                 <w:rStyle w:val="Hyperlink"/>
                 <w:noProof/>
               </w:rPr>
-              <w:t>Requisitos de Segurança</w:t>
+              <w:t>Políticas de Segurança</w:t>
             </w:r>
             <w:r>
               <w:rPr>
@@ -2422,7 +2422,7 @@
                 <w:noProof/>
                 <w:webHidden/>
               </w:rPr>
-              <w:instrText xml:space="preserve"> PAGEREF _Toc238152522 \h </w:instrText>
+              <w:instrText xml:space="preserve"> PAGEREF _Toc238763063 \h </w:instrText>
             </w:r>
             <w:r>
               <w:rPr>
@@ -2442,7 +2442,7 @@
                 <w:noProof/>
                 <w:webHidden/>
               </w:rPr>
-              <w:t>18</w:t>
+              <w:t>16</w:t>
             </w:r>
             <w:r>
               <w:rPr>
@@ -2466,7 +2466,7 @@
               <w:color w:val="auto"/>
             </w:rPr>
           </w:pPr>
-          <w:hyperlink w:anchor="_Toc238152523" w:history="1">
+          <w:hyperlink w:anchor="_Toc238763064" w:history="1">
             <w:r>
               <w:rPr>
                 <w:rStyle w:val="Hyperlink"/>
@@ -2508,7 +2508,7 @@
                 <w:noProof/>
                 <w:webHidden/>
               </w:rPr>
-              <w:instrText xml:space="preserve"> PAGEREF _Toc238152523 \h </w:instrText>
+              <w:instrText xml:space="preserve"> PAGEREF _Toc238763064 \h </w:instrText>
             </w:r>
             <w:r>
               <w:rPr>
@@ -2528,7 +2528,179 @@
                 <w:noProof/>
                 <w:webHidden/>
               </w:rPr>
+              <w:t>18</w:t>
+            </w:r>
+            <w:r>
+              <w:rPr>
+                <w:noProof/>
+                <w:webHidden/>
+              </w:rPr>
+              <w:fldChar w:fldCharType="end"/>
+            </w:r>
+          </w:hyperlink>
+        </w:p>
+        <w:p>
+          <w:pPr>
+            <w:pStyle w:val="TOC1"/>
+            <w:tabs>
+              <w:tab w:val="left" w:pos="480"/>
+              <w:tab w:val="right" w:leader="dot" w:pos="8560"/>
+            </w:tabs>
+            <w:rPr>
+              <w:rFonts w:asciiTheme="minorHAnsi" w:eastAsiaTheme="minorEastAsia" w:hAnsiTheme="minorHAnsi" w:cstheme="minorBidi"/>
+              <w:noProof/>
+              <w:color w:val="auto"/>
+            </w:rPr>
+          </w:pPr>
+          <w:hyperlink w:anchor="_Toc238763065" w:history="1">
+            <w:r>
+              <w:rPr>
+                <w:rStyle w:val="Hyperlink"/>
+                <w:noProof/>
+              </w:rPr>
+              <w:t>8.</w:t>
+            </w:r>
+            <w:r>
+              <w:rPr>
+                <w:rFonts w:asciiTheme="minorHAnsi" w:eastAsiaTheme="minorEastAsia" w:hAnsiTheme="minorHAnsi" w:cstheme="minorBidi"/>
+                <w:noProof/>
+                <w:color w:val="auto"/>
+              </w:rPr>
+              <w:tab/>
+            </w:r>
+            <w:r>
+              <w:rPr>
+                <w:rStyle w:val="Hyperlink"/>
+                <w:noProof/>
+              </w:rPr>
+              <w:t>Requisitos de Segurança</w:t>
+            </w:r>
+            <w:r>
+              <w:rPr>
+                <w:noProof/>
+                <w:webHidden/>
+              </w:rPr>
+              <w:tab/>
+            </w:r>
+            <w:r>
+              <w:rPr>
+                <w:noProof/>
+                <w:webHidden/>
+              </w:rPr>
+              <w:fldChar w:fldCharType="begin"/>
+            </w:r>
+            <w:r>
+              <w:rPr>
+                <w:noProof/>
+                <w:webHidden/>
+              </w:rPr>
+              <w:instrText xml:space="preserve"> PAGEREF _Toc238763065 \h </w:instrText>
+            </w:r>
+            <w:r>
+              <w:rPr>
+                <w:noProof/>
+                <w:webHidden/>
+              </w:rPr>
+            </w:r>
+            <w:r>
+              <w:rPr>
+                <w:noProof/>
+                <w:webHidden/>
+              </w:rPr>
+              <w:fldChar w:fldCharType="separate"/>
+            </w:r>
+            <w:r>
+              <w:rPr>
+                <w:noProof/>
+                <w:webHidden/>
+              </w:rPr>
               <w:t>20</w:t>
+            </w:r>
+            <w:r>
+              <w:rPr>
+                <w:noProof/>
+                <w:webHidden/>
+              </w:rPr>
+              <w:fldChar w:fldCharType="end"/>
+            </w:r>
+          </w:hyperlink>
+        </w:p>
+        <w:p>
+          <w:pPr>
+            <w:pStyle w:val="TOC1"/>
+            <w:tabs>
+              <w:tab w:val="left" w:pos="480"/>
+              <w:tab w:val="right" w:leader="dot" w:pos="8560"/>
+            </w:tabs>
+            <w:rPr>
+              <w:rFonts w:asciiTheme="minorHAnsi" w:eastAsiaTheme="minorEastAsia" w:hAnsiTheme="minorHAnsi" w:cstheme="minorBidi"/>
+              <w:noProof/>
+              <w:color w:val="auto"/>
+            </w:rPr>
+          </w:pPr>
+          <w:hyperlink w:anchor="_Toc238763066" w:history="1">
+            <w:r>
+              <w:rPr>
+                <w:rStyle w:val="Hyperlink"/>
+                <w:noProof/>
+              </w:rPr>
+              <w:t>9.</w:t>
+            </w:r>
+            <w:r>
+              <w:rPr>
+                <w:rFonts w:asciiTheme="minorHAnsi" w:eastAsiaTheme="minorEastAsia" w:hAnsiTheme="minorHAnsi" w:cstheme="minorBidi"/>
+                <w:noProof/>
+                <w:color w:val="auto"/>
+              </w:rPr>
+              <w:tab/>
+            </w:r>
+            <w:r>
+              <w:rPr>
+                <w:rStyle w:val="Hyperlink"/>
+                <w:noProof/>
+              </w:rPr>
+              <w:t>Políticas de segurança (GPOs)</w:t>
+            </w:r>
+            <w:r>
+              <w:rPr>
+                <w:noProof/>
+                <w:webHidden/>
+              </w:rPr>
+              <w:tab/>
+            </w:r>
+            <w:r>
+              <w:rPr>
+                <w:noProof/>
+                <w:webHidden/>
+              </w:rPr>
+              <w:fldChar w:fldCharType="begin"/>
+            </w:r>
+            <w:r>
+              <w:rPr>
+                <w:noProof/>
+                <w:webHidden/>
+              </w:rPr>
+              <w:instrText xml:space="preserve"> PAGEREF _Toc238763066 \h </w:instrText>
+            </w:r>
+            <w:r>
+              <w:rPr>
+                <w:noProof/>
+                <w:webHidden/>
+              </w:rPr>
+            </w:r>
+            <w:r>
+              <w:rPr>
+                <w:noProof/>
+                <w:webHidden/>
+              </w:rPr>
+              <w:fldChar w:fldCharType="separate"/>
+            </w:r>
+            <w:r>
+              <w:rPr>
+                <w:noProof/>
+                <w:webHidden/>
+              </w:rPr>
+              <w:t>21</w:t>
             </w:r>
             <w:r>
               <w:rPr>
@@ -2768,29 +2940,7 @@
     <w:p>
       <w:pPr>
         <w:spacing w:after="0" w:line="259" w:lineRule="auto"/>
-        <w:ind w:left="3540" w:firstLine="0"/>
-        <w:rPr>
-          <w:b/>
-          <w:bCs/>
-          <w:lang w:val="en-US"/>
-        </w:rPr>
-      </w:pPr>
-    </w:p>
-    <w:p>
-      <w:pPr>
-        <w:spacing w:after="0" w:line="259" w:lineRule="auto"/>
-        <w:ind w:left="3540" w:firstLine="0"/>
-        <w:rPr>
-          <w:b/>
-          <w:bCs/>
-          <w:lang w:val="en-US"/>
-        </w:rPr>
-      </w:pPr>
-    </w:p>
-    <w:p>
-      <w:pPr>
-        <w:spacing w:after="0" w:line="259" w:lineRule="auto"/>
-        <w:ind w:left="3540" w:firstLine="0"/>
+        <w:ind w:left="0" w:firstLine="0"/>
         <w:rPr>
           <w:b/>
           <w:bCs/>
@@ -2813,51 +2963,50 @@
       <w:pPr>
         <w:pStyle w:val="Heading1"/>
       </w:pPr>
-      <w:bookmarkStart w:id="0" w:name="_Toc238152511"/>
+      <w:bookmarkStart w:id="0" w:name="_Toc238763052"/>
+      <w:r>
+        <w:t>INTRODUÇÃO</w:t>
+      </w:r>
+      <w:bookmarkEnd w:id="0"/>
+    </w:p>
+    <w:p/>
+    <w:p>
+      <w:r>
+        <w:t>A utilização da Tecnologia da Informação tornou-se indispensável para o funcionamento das instituições de ensino. Recursos como computadores, servidores, redes, sistemas acadêmicos e administrativos dependem de uma infraestrutura organizada e de mecanismos eficientes para o gerenciamento de usuários e permissões. À medida que aumenta a quantidade de usuários, equipamentos e serviços disponíveis, torna-se necessário adotar soluções que permitam centralizar e padronizar a administração desses recursos.</w:t>
+      </w:r>
+    </w:p>
+    <w:p>
+      <w:r>
+        <w:t>Nesse contexto, o Active Directory é uma ferramenta utilizada para o gerenciamento centralizado de identidades, usuários, computadores e recursos de rede. Por meio de sua estrutura, é possível organizar os elementos de um ambiente computacional, controlar permissões de acesso e aplicar políticas de segurança de acordo com as necessidades de cada grupo de usuários.</w:t>
+      </w:r>
+    </w:p>
+    <w:p>
+      <w:r>
+        <w:t>Em uma instituição de ensino, existem diferentes setores e perfis que possuem necessidades distintas de acesso aos recursos tecnológicos. Entre eles estão os setores administrativos, a equipe de Tecnologia da Informação, docentes e discentes. Além disso, cada grupo pode apresentar diferentes níveis de responsabilidade e necessidade de acesso a sistemas, computadores e informações, tornando necessária uma estrutura organizada para o gerenciamento dessas contas e permissões.</w:t>
+      </w:r>
+    </w:p>
+    <w:p>
+      <w:r>
+        <w:t>A infraestrutura analisada neste projeto possui servidores responsáveis por diferentes serviços, incluindo ambientes de autenticação e gerenciamento, monitoramento, inventário, segurança e backup. A rede também apresenta segmentação por VLANs, separando ambientes administrativos, acadêmicos, de rede sem fio e de gerenciamento. Dessa forma, a organização adequada do Active Directory deve considerar não apenas os usuários da instituição, mas também sua estrutura organizacional e tecnológica.</w:t>
+      </w:r>
+    </w:p>
+    <w:p>
+      <w:r>
+        <w:t>Diante desse cenário, este trabalho tem como foco o levantamento e a organização dos processos relacionados ao gerenciamento do ambiente de Active Directory da instituição. Para isso, são realizadas atividades de mapeamento dos setores, identificação dos perfis de usuários, levantamento de requisitos funcionais e não funcionais, definição da estrutura de Unidades Organizacionais (OUs), grupos e permissões de acesso.</w:t>
+      </w:r>
+    </w:p>
+    <w:p>
+      <w:r>
+        <w:t>Além disso, o projeto aborda aspectos relacionados à segurança da informação, como políticas de senha, controle de privilégios, gerenciamento do ciclo de vida das contas e auditoria das atividades realizadas no ambiente. Também são utilizados diagramas UML para representar os processos e facilitar a compreensão das interações entre os diferentes atores envolvidos no gerenciamento das contas e recursos.</w:t>
+      </w:r>
+    </w:p>
+    <w:p>
+      <w:r>
+        <w:t xml:space="preserve">Portanto, o desenvolvimento deste trabalho busca contribuir para uma gestão mais estruturada do ambiente tecnológico da instituição, estabelecendo uma base para a padronização dos processos de administração de usuários, </w:t>
+      </w:r>
       <w:r>
         <w:lastRenderedPageBreak/>
-        <w:t>INTRODUÇÃO</w:t>
-      </w:r>
-      <w:bookmarkEnd w:id="0"/>
-    </w:p>
-    <w:p/>
-    <w:p>
-      <w:r>
-        <w:t>A utilização da Tecnologia da Informação tornou-se indispensável para o funcionamento das instituições de ensino. Recursos como computadores, servidores, redes, sistemas acadêmicos e administrativos dependem de uma infraestrutura organizada e de mecanismos eficientes para o gerenciamento de usuários e permissões. À medida que aumenta a quantidade de usuários, equipamentos e serviços disponíveis, torna-se necessário adotar soluções que permitam centralizar e padronizar a administração desses recursos.</w:t>
-      </w:r>
-    </w:p>
-    <w:p>
-      <w:r>
-        <w:t>Nesse contexto, o Active Directory é uma ferramenta utilizada para o gerenciamento centralizado de identidades, usuários, computadores e recursos de rede. Por meio de sua estrutura, é possível organizar os elementos de um ambiente computacional, controlar permissões de acesso e aplicar políticas de segurança de acordo com as necessidades de cada grupo de usuários.</w:t>
-      </w:r>
-    </w:p>
-    <w:p>
-      <w:r>
-        <w:t>Em uma instituição de ensino, existem diferentes setores e perfis que possuem necessidades distintas de acesso aos recursos tecnológicos. Entre eles estão os setores administrativos, a equipe de Tecnologia da Informação, docentes e discentes. Além disso, cada grupo pode apresentar diferentes níveis de responsabilidade e necessidade de acesso a sistemas, computadores e informações, tornando necessária uma estrutura organizada para o gerenciamento dessas contas e permissões.</w:t>
-      </w:r>
-    </w:p>
-    <w:p>
-      <w:r>
-        <w:t>A infraestrutura analisada neste projeto possui servidores responsáveis por diferentes serviços, incluindo ambientes de autenticação e gerenciamento, monitoramento, inventário, segurança e backup. A rede também apresenta segmentação por VLANs, separando ambientes administrativos, acadêmicos, de rede sem fio e de gerenciamento. Dessa forma, a organização adequada do Active Directory deve considerar não apenas os usuários da instituição, mas também sua estrutura organizacional e tecnológica.</w:t>
-      </w:r>
-    </w:p>
-    <w:p>
-      <w:r>
-        <w:t>Diante desse cenário, este trabalho tem como foco o levantamento e a organização dos processos relacionados ao gerenciamento do ambiente de Active Directory da instituição. Para isso, são realizadas atividades de mapeamento dos setores, identificação dos perfis de usuários, levantamento de requisitos funcionais e não funcionais, definição da estrutura de Unidades Organizacionais (OUs), grupos e permissões de acesso.</w:t>
-      </w:r>
-    </w:p>
-    <w:p>
-      <w:r>
-        <w:t>Além disso, o projeto aborda aspectos relacionados à segurança da informação, como políticas de senha, controle de privilégios, gerenciamento do ciclo de vida das contas e auditoria das atividades realizadas no ambiente. Também são utilizados diagramas UML para representar os processos e facilitar a compreensão das interações entre os diferentes atores envolvidos no gerenciamento das contas e recursos.</w:t>
-      </w:r>
-    </w:p>
-    <w:p>
-      <w:r>
-        <w:t xml:space="preserve">Portanto, o desenvolvimento deste trabalho busca contribuir para uma gestão mais estruturada do ambiente tecnológico da instituição, estabelecendo uma base para a padronização dos processos de administração de usuários, computadores e permissões. A proposta visa melhorar a organização do ambiente, facilitar as atividades da equipe responsável pela Tecnologia da </w:t>
-      </w:r>
-      <w:r>
-        <w:lastRenderedPageBreak/>
-        <w:t>Informação e fortalecer o controle e a segurança no acesso aos recursos institucionais.</w:t>
+        <w:t>computadores e permissões. A proposta visa melhorar a organização do ambiente, facilitar as atividades da equipe responsável pela Tecnologia da Informação e fortalecer o controle e a segurança no acesso aos recursos institucionais.</w:t>
       </w:r>
     </w:p>
     <w:p/>
@@ -2900,9 +3049,8 @@
           <w:numId w:val="12"/>
         </w:numPr>
       </w:pPr>
-      <w:bookmarkStart w:id="1" w:name="_Toc238152512"/>
-      <w:r>
-        <w:lastRenderedPageBreak/>
+      <w:bookmarkStart w:id="1" w:name="_Toc238763053"/>
+      <w:r>
         <w:t>Levantamento dos computadores</w:t>
       </w:r>
       <w:bookmarkEnd w:id="1"/>
@@ -3022,7 +3170,7 @@
           <w:numId w:val="12"/>
         </w:numPr>
       </w:pPr>
-      <w:bookmarkStart w:id="2" w:name="_Toc238152513"/>
+      <w:bookmarkStart w:id="2" w:name="_Toc238763054"/>
       <w:r>
         <w:lastRenderedPageBreak/>
         <w:t>Mapeamento dos setores da faculdade</w:t>
@@ -3534,7 +3682,7 @@
           <w:numId w:val="12"/>
         </w:numPr>
       </w:pPr>
-      <w:bookmarkStart w:id="3" w:name="_Toc238152514"/>
+      <w:bookmarkStart w:id="3" w:name="_Toc238763055"/>
       <w:r>
         <w:lastRenderedPageBreak/>
         <w:t xml:space="preserve">Mapeamento da </w:t>
@@ -4085,13 +4233,13 @@
           <w:numId w:val="12"/>
         </w:numPr>
       </w:pPr>
-      <w:bookmarkStart w:id="4" w:name="_Toc238152515"/>
+      <w:bookmarkStart w:id="4" w:name="_Toc238763056"/>
       <w:r>
         <w:lastRenderedPageBreak/>
-        <w:t>L</w:t>
-      </w:r>
-      <w:r>
-        <w:t>evantamento da infraestrutura de servidores e rede</w:t>
+        <w:t>I</w:t>
+      </w:r>
+      <w:r>
+        <w:t>nfraestrutura de servidores e rede</w:t>
       </w:r>
       <w:bookmarkEnd w:id="4"/>
     </w:p>
@@ -4425,7 +4573,7 @@
           <w:numId w:val="12"/>
         </w:numPr>
       </w:pPr>
-      <w:bookmarkStart w:id="5" w:name="_Toc238152516"/>
+      <w:bookmarkStart w:id="5" w:name="_Toc238763057"/>
       <w:r>
         <w:lastRenderedPageBreak/>
         <w:t>Identificando perfis de usuário</w:t>
@@ -4450,7 +4598,7 @@
       <w:pPr>
         <w:pStyle w:val="Heading2"/>
       </w:pPr>
-      <w:bookmarkStart w:id="6" w:name="_Toc238152517"/>
+      <w:bookmarkStart w:id="6" w:name="_Toc238763058"/>
       <w:r>
         <w:t>4.1 Objetivo da Definição de Perfis</w:t>
       </w:r>
@@ -4466,7 +4614,7 @@
       <w:pPr>
         <w:pStyle w:val="Heading2"/>
       </w:pPr>
-      <w:bookmarkStart w:id="7" w:name="_Toc238152518"/>
+      <w:bookmarkStart w:id="7" w:name="_Toc238763059"/>
       <w:r>
         <w:t>4.2 Perfil de Alunos</w:t>
       </w:r>
@@ -4482,7 +4630,7 @@
       <w:pPr>
         <w:pStyle w:val="Heading2"/>
       </w:pPr>
-      <w:bookmarkStart w:id="8" w:name="_Toc238152519"/>
+      <w:bookmarkStart w:id="8" w:name="_Toc238763060"/>
       <w:r>
         <w:t>4.3 Perfil de Professores</w:t>
       </w:r>
@@ -4498,7 +4646,7 @@
       <w:pPr>
         <w:pStyle w:val="Heading2"/>
       </w:pPr>
-      <w:bookmarkStart w:id="9" w:name="_Toc238152520"/>
+      <w:bookmarkStart w:id="9" w:name="_Toc238763061"/>
       <w:r>
         <w:t>4.4 Perfil Administrativo</w:t>
       </w:r>
@@ -4513,22 +4661,6 @@
         <w:t>compartilhadas do seu departamento e autenticação nos sistemas acadêmicos e administrativos da faculdade.</w:t>
       </w:r>
     </w:p>
-    <w:p/>
-    <w:p>
-      <w:pPr>
-        <w:pStyle w:val="Heading2"/>
-      </w:pPr>
-      <w:bookmarkStart w:id="10" w:name="_Toc238152521"/>
-      <w:r>
-        <w:t>4.5 Perfil de Computadores</w:t>
-      </w:r>
-      <w:bookmarkEnd w:id="10"/>
-    </w:p>
-    <w:p>
-      <w:r>
-        <w:t>Os computadores são considerados ativos críticos e devem ser organizados em OUs específicas para garantir aplicação de GPOs de segurança e configuração. O padrão de nomenclatura segue o formato SALA-PCXX, permitindo identificar claramente a localização física e a função da máquina. Exemplos:</w:t>
-      </w:r>
-    </w:p>
     <w:p>
       <w:pPr>
         <w:ind w:left="0" w:firstLine="0"/>
@@ -4536,27 +4668,22 @@
     </w:p>
     <w:p>
       <w:r>
-        <w:t>SALAXX-PC01 → computador da sala de aula XX.</w:t>
-      </w:r>
-    </w:p>
-    <w:p/>
-    <w:p>
-      <w:r>
-        <w:t>OU_Computadores_Administrativos: máquinas da Secretaria, Direção, Biblioteca, Suporte de TI e NAP, separadas por salas/setores.</w:t>
-      </w:r>
-    </w:p>
-    <w:p/>
-    <w:p>
-      <w:r>
-        <w:t>OU_Computadores_Acadêmicos: máquinas dos laboratórios de cada curso (GTI, GEV, GRH, DMD, etc.), organizadas por sala de laboratório.</w:t>
-      </w:r>
-    </w:p>
-    <w:p/>
-    <w:p>
-      <w:r>
         <w:t>As políticas aplicadas incluem bloqueio de instalação de softwares não autorizados, configuração de atualizações automáticas e inventário centralizado. Essa abordagem garante conformidade com ITIL (gestão de ativos e configuração) e COBIT (controle de acesso e segurança).</w:t>
       </w:r>
     </w:p>
+    <w:p/>
+    <w:p/>
+    <w:p/>
+    <w:p/>
+    <w:p/>
+    <w:p/>
+    <w:p/>
+    <w:p/>
+    <w:p/>
+    <w:p/>
+    <w:p/>
+    <w:p/>
+    <w:p/>
     <w:p/>
     <w:p/>
     <w:p/>
@@ -4585,15 +4712,14 @@
           <w:numId w:val="12"/>
         </w:numPr>
       </w:pPr>
-      <w:bookmarkStart w:id="11" w:name="_Toc238152522"/>
-      <w:r>
-        <w:lastRenderedPageBreak/>
+      <w:bookmarkStart w:id="10" w:name="_Toc238763063"/>
+      <w:r>
         <w:t xml:space="preserve">Políticas </w:t>
       </w:r>
       <w:r>
         <w:t>de Segurança</w:t>
       </w:r>
-      <w:bookmarkEnd w:id="11"/>
+      <w:bookmarkEnd w:id="10"/>
     </w:p>
     <w:p/>
     <w:p>
@@ -5054,6 +5180,7 @@
                 <w:b/>
                 <w:bCs/>
               </w:rPr>
+              <w:lastRenderedPageBreak/>
               <w:t>GRP_Alunos</w:t>
             </w:r>
           </w:p>
@@ -5564,12 +5691,6 @@
     <w:p/>
     <w:p/>
     <w:p/>
-    <w:p/>
-    <w:p>
-      <w:pPr>
-        <w:ind w:left="0" w:firstLine="0"/>
-      </w:pPr>
-    </w:p>
     <w:p>
       <w:pPr>
         <w:pStyle w:val="Heading1"/>
@@ -5578,27 +5699,25 @@
           <w:numId w:val="12"/>
         </w:numPr>
       </w:pPr>
-      <w:bookmarkStart w:id="12" w:name="_Toc238152523"/>
       <w:r>
         <w:lastRenderedPageBreak/>
-        <w:t>Estrutura de grupos e Ous</w:t>
-      </w:r>
-      <w:bookmarkEnd w:id="12"/>
-    </w:p>
-    <w:p/>
-    <w:p>
-      <w:r>
-        <w:t xml:space="preserve">No domínio </w:t>
-      </w:r>
-      <w:r>
-        <w:rPr>
-          <w:b/>
-          <w:bCs/>
-        </w:rPr>
-        <w:t>adm.fatecbarueri.local</w:t>
-      </w:r>
-      <w:r>
-        <w:t xml:space="preserve">, a Fatec Barueri foi organizada em dois ambientes de Active Directory: </w:t>
+        <w:t>Grupo de Usuários</w:t>
+      </w:r>
+    </w:p>
+    <w:p/>
+    <w:p>
+      <w:r>
+        <w:t xml:space="preserve">O objetivo é definir os grupos de usuários do Active Directory da Fatec Barueri, garantindo alinhamento às OUs </w:t>
+      </w:r>
+      <w:r>
+        <w:rPr>
+          <w:b/>
+          <w:bCs/>
+        </w:rPr>
+        <w:t>AD-ADM</w:t>
+      </w:r>
+      <w:r>
+        <w:t xml:space="preserve"> e </w:t>
       </w:r>
       <w:r>
         <w:rPr>
@@ -5608,6 +5727,46 @@
         <w:t>AD-ACAD</w:t>
       </w:r>
       <w:r>
+        <w:t>, às permissões planejadas e às nomenclaturas padronizadas.</w:t>
+      </w:r>
+    </w:p>
+    <w:p>
+      <w:r>
+        <w:t xml:space="preserve">Os perfis institucionais (alunos, professores, gestores, administrativos e TI) serão mapeados e associados às OUs corretas. Cada grupo terá permissões específicas conforme a matriz de acesso, seguindo o princípio do menor privilégio. A nomenclatura padronizada (ex.: </w:t>
+      </w:r>
+      <w:r>
+        <w:rPr>
+          <w:b/>
+          <w:bCs/>
+        </w:rPr>
+        <w:t>GRP_ALUNOS</w:t>
+      </w:r>
+      <w:r>
+        <w:t xml:space="preserve">, </w:t>
+      </w:r>
+      <w:r>
+        <w:rPr>
+          <w:b/>
+          <w:bCs/>
+        </w:rPr>
+        <w:t>GRP_PROFESSORES</w:t>
+      </w:r>
+      <w:r>
+        <w:t>) facilita a gestão e garante consistência.</w:t>
+      </w:r>
+    </w:p>
+    <w:p>
+      <w:r>
+        <w:t xml:space="preserve">Todos os grupos serão documentados e validados junto ao cliente antes da criação, atendendo ao </w:t>
+      </w:r>
+      <w:r>
+        <w:rPr>
+          <w:b/>
+          <w:bCs/>
+        </w:rPr>
+        <w:t>RF02</w:t>
+      </w:r>
+      <w:r>
         <w:t xml:space="preserve"> e </w:t>
       </w:r>
       <w:r>
@@ -5615,315 +5774,357 @@
           <w:b/>
           <w:bCs/>
         </w:rPr>
-        <w:t>AD-ADM</w:t>
+        <w:t>RNF-03</w:t>
       </w:r>
       <w:r>
         <w:t>.</w:t>
       </w:r>
     </w:p>
-    <w:p>
-      <w:pPr>
-        <w:numPr>
-          <w:ilvl w:val="0"/>
-          <w:numId w:val="23"/>
-        </w:numPr>
-      </w:pPr>
-      <w:r>
-        <w:t xml:space="preserve">O </w:t>
-      </w:r>
-      <w:r>
-        <w:rPr>
-          <w:b/>
-          <w:bCs/>
-        </w:rPr>
-        <w:t>AD-ACAD</w:t>
-      </w:r>
-      <w:r>
-        <w:t xml:space="preserve"> concentra usuários e computadores acadêmicos, com grupos de segurança separados por </w:t>
-      </w:r>
-      <w:r>
-        <w:rPr>
-          <w:b/>
-          <w:bCs/>
-        </w:rPr>
-        <w:t>cursos</w:t>
-      </w:r>
-      <w:r>
-        <w:t xml:space="preserve"> e perfis de </w:t>
-      </w:r>
-      <w:r>
-        <w:rPr>
-          <w:b/>
-          <w:bCs/>
-        </w:rPr>
-        <w:t>alunos e professores</w:t>
-      </w:r>
-      <w:r>
-        <w:t>.</w:t>
-      </w:r>
-    </w:p>
-    <w:p>
-      <w:pPr>
-        <w:numPr>
-          <w:ilvl w:val="0"/>
-          <w:numId w:val="23"/>
-        </w:numPr>
-      </w:pPr>
-      <w:r>
-        <w:t xml:space="preserve">O </w:t>
-      </w:r>
-      <w:r>
-        <w:rPr>
-          <w:b/>
-          <w:bCs/>
-        </w:rPr>
-        <w:t>AD-ADM</w:t>
-      </w:r>
-      <w:r>
-        <w:t xml:space="preserve"> concentra usuários e computadores administrativos, com grupos de segurança separados por </w:t>
-      </w:r>
-      <w:r>
-        <w:rPr>
-          <w:b/>
-          <w:bCs/>
-        </w:rPr>
-        <w:t>departamentos institucionais</w:t>
-      </w:r>
-      <w:r>
-        <w:t>, conforme a estrutura organizacional oficial da Fatec Barueri.</w:t>
-      </w:r>
-    </w:p>
-    <w:p/>
-    <w:p>
-      <w:r>
-        <w:t>DOMINIO: adm.fatecbarueri.local</w:t>
-      </w:r>
-    </w:p>
-    <w:p>
-      <w:r>
-        <w:t>|</w:t>
-      </w:r>
-    </w:p>
-    <w:p>
-      <w:r>
-        <w:t>|- AD-ACAD</w:t>
-      </w:r>
-    </w:p>
-    <w:p>
-      <w:r>
-        <w:t>|    |- OU_Usuarios</w:t>
-      </w:r>
-    </w:p>
-    <w:p>
-      <w:r>
-        <w:t>|    |- OU_Computadores</w:t>
-      </w:r>
-    </w:p>
-    <w:p>
-      <w:r>
-        <w:t>|    |      |- SALA XX</w:t>
-      </w:r>
-    </w:p>
-    <w:p>
-      <w:r>
-        <w:t>|    |- Grupos (Cursos)</w:t>
-      </w:r>
-    </w:p>
-    <w:p>
-      <w:r>
-        <w:t>|           |- GRP_Alunos</w:t>
-      </w:r>
-    </w:p>
-    <w:p>
-      <w:r>
-        <w:t>|           |- GRP_Professores</w:t>
-      </w:r>
-    </w:p>
-    <w:p>
-      <w:r>
-        <w:t>|           |- GRP_ComercioExterior</w:t>
-      </w:r>
-    </w:p>
-    <w:p>
-      <w:r>
-        <w:t>|           |- GRP_DesignMidiasDigitais</w:t>
-      </w:r>
-    </w:p>
-    <w:p>
-      <w:r>
-        <w:t>|           |- GRP_GestaoEventos</w:t>
-      </w:r>
-    </w:p>
-    <w:p>
-      <w:r>
-        <w:t>|           |- GRP_RecursosHumanos</w:t>
-      </w:r>
-    </w:p>
-    <w:p>
-      <w:r>
-        <w:t>|           |- GRP_TecnologiaInformacao</w:t>
-      </w:r>
-    </w:p>
-    <w:p>
-      <w:r>
-        <w:t>|           |- GRP_ComercioEletronico</w:t>
-      </w:r>
-    </w:p>
-    <w:p>
-      <w:r>
-        <w:t>|           |- GRP_NegociosPessoas</w:t>
-      </w:r>
-    </w:p>
-    <w:p>
-      <w:r>
-        <w:t>|           |- GRP_Logistica</w:t>
-      </w:r>
-    </w:p>
-    <w:p>
-      <w:r>
-        <w:t>|           |- GRP_GestaoEmpresarialEAD</w:t>
-      </w:r>
-    </w:p>
-    <w:p>
-      <w:r>
-        <w:t>|           |- GRP_TransporteTerrestre</w:t>
-      </w:r>
-    </w:p>
-    <w:p>
-      <w:r>
-        <w:t>|</w:t>
-      </w:r>
-    </w:p>
-    <w:p/>
-    <w:p/>
-    <w:p/>
-    <w:p>
-      <w:r>
-        <w:t>|- AD-ADM</w:t>
-      </w:r>
-    </w:p>
-    <w:p>
-      <w:r>
-        <w:lastRenderedPageBreak/>
-        <w:t xml:space="preserve">     |- OU_Usuarios</w:t>
-      </w:r>
-    </w:p>
-    <w:p>
-      <w:r>
-        <w:t xml:space="preserve">     |- OU_Computadores</w:t>
-      </w:r>
-    </w:p>
-    <w:p>
-      <w:r>
-        <w:t xml:space="preserve">     |</w:t>
-      </w:r>
-    </w:p>
-    <w:p>
-      <w:r>
-        <w:t xml:space="preserve">     |- Grupos (Departamentos)</w:t>
-      </w:r>
-    </w:p>
-    <w:p>
-      <w:r>
-        <w:t xml:space="preserve">            |- GRP_Congregacao</w:t>
-      </w:r>
-    </w:p>
-    <w:p>
-      <w:r>
-        <w:t xml:space="preserve">            |- GRP_Coordenacao</w:t>
-      </w:r>
-    </w:p>
-    <w:p>
-      <w:r>
-        <w:t xml:space="preserve">            |- GRP_ChefiaServicosAdministrativos</w:t>
-      </w:r>
-    </w:p>
-    <w:p>
-      <w:r>
-        <w:t xml:space="preserve">            |- GRP_ChefiaServicosAcademicos</w:t>
-      </w:r>
-    </w:p>
-    <w:p>
-      <w:r>
-        <w:t xml:space="preserve">            |- GRP_CoordenadoriasCursos</w:t>
-      </w:r>
-    </w:p>
-    <w:p>
-      <w:r>
-        <w:t xml:space="preserve">            |- GRP_OrientacaoPolo</w:t>
-      </w:r>
-    </w:p>
-    <w:p>
-      <w:r>
-        <w:t xml:space="preserve">            |- GRP_NucleosDocentesEstruturantes</w:t>
-      </w:r>
-    </w:p>
-    <w:p>
-      <w:r>
-        <w:t xml:space="preserve">            |- GRP_CorpoDocente</w:t>
-      </w:r>
-    </w:p>
-    <w:p>
-      <w:r>
-        <w:t xml:space="preserve">            |- GRP_AuxiliaresDocentes</w:t>
-      </w:r>
-    </w:p>
-    <w:p>
-      <w:r>
-        <w:t xml:space="preserve">            |- GRP_CorpoTecnicoAdministrativo</w:t>
-      </w:r>
-    </w:p>
-    <w:p>
-      <w:r>
-        <w:t xml:space="preserve">            |- GRP_ComissaoPropriaAvaliacao_CPA</w:t>
-      </w:r>
-    </w:p>
-    <w:p>
-      <w:r>
-        <w:t xml:space="preserve">            |- GRP_ComissaoInternaPrevencaoAcidentes_CIPA</w:t>
-      </w:r>
-    </w:p>
-    <w:p/>
-    <w:p>
-      <w:r>
-        <w:t xml:space="preserve">Essa organização garante clareza na gestão de acessos, aplicação segmentada de GPOs e conformidade com frameworks como </w:t>
-      </w:r>
-      <w:r>
-        <w:rPr>
-          <w:b/>
-          <w:bCs/>
-        </w:rPr>
-        <w:t>ITIL</w:t>
-      </w:r>
-      <w:r>
-        <w:t xml:space="preserve"> e </w:t>
-      </w:r>
-      <w:r>
-        <w:rPr>
-          <w:b/>
-          <w:bCs/>
-        </w:rPr>
-        <w:t>COBIT</w:t>
-      </w:r>
-      <w:r>
-        <w:t>, fortalecendo a governança digital da instituição.</w:t>
-      </w:r>
-    </w:p>
-    <w:p/>
-    <w:p/>
-    <w:p/>
-    <w:p/>
-    <w:p/>
-    <w:p/>
-    <w:p/>
-    <w:p/>
-    <w:p/>
-    <w:p/>
-    <w:p/>
-    <w:p/>
-    <w:p/>
-    <w:p/>
-    <w:p/>
+    <w:p/>
+    <w:tbl>
+      <w:tblPr>
+        <w:tblW w:w="0" w:type="auto"/>
+        <w:tblCellSpacing w:w="15" w:type="dxa"/>
+        <w:tblBorders>
+          <w:bottom w:val="single" w:sz="4" w:space="0" w:color="auto"/>
+          <w:insideH w:val="single" w:sz="4" w:space="0" w:color="auto"/>
+          <w:insideV w:val="single" w:sz="4" w:space="0" w:color="auto"/>
+        </w:tblBorders>
+        <w:tblLayout w:type="fixed"/>
+        <w:tblCellMar>
+          <w:top w:w="15" w:type="dxa"/>
+          <w:left w:w="15" w:type="dxa"/>
+          <w:bottom w:w="15" w:type="dxa"/>
+          <w:right w:w="15" w:type="dxa"/>
+        </w:tblCellMar>
+        <w:tblLook w:val="04A0" w:firstRow="1" w:lastRow="0" w:firstColumn="1" w:lastColumn="0" w:noHBand="0" w:noVBand="1"/>
+      </w:tblPr>
+      <w:tblGrid>
+        <w:gridCol w:w="2694"/>
+        <w:gridCol w:w="4677"/>
+        <w:gridCol w:w="1199"/>
+      </w:tblGrid>
+      <w:tr>
+        <w:trPr>
+          <w:tblHeader/>
+          <w:tblCellSpacing w:w="15" w:type="dxa"/>
+        </w:trPr>
+        <w:tc>
+          <w:tcPr>
+            <w:tcW w:w="2649" w:type="dxa"/>
+            <w:vAlign w:val="center"/>
+            <w:hideMark/>
+          </w:tcPr>
+          <w:p>
+            <w:pPr>
+              <w:rPr>
+                <w:b/>
+                <w:bCs/>
+              </w:rPr>
+            </w:pPr>
+            <w:r>
+              <w:rPr>
+                <w:b/>
+                <w:bCs/>
+              </w:rPr>
+              <w:t>OU / Grupo</w:t>
+            </w:r>
+          </w:p>
+        </w:tc>
+        <w:tc>
+          <w:tcPr>
+            <w:tcW w:w="4647" w:type="dxa"/>
+            <w:vAlign w:val="center"/>
+            <w:hideMark/>
+          </w:tcPr>
+          <w:p>
+            <w:pPr>
+              <w:rPr>
+                <w:b/>
+                <w:bCs/>
+              </w:rPr>
+            </w:pPr>
+            <w:r>
+              <w:rPr>
+                <w:b/>
+                <w:bCs/>
+              </w:rPr>
+              <w:t>Descrição / Aplicação</w:t>
+            </w:r>
+          </w:p>
+        </w:tc>
+        <w:tc>
+          <w:tcPr>
+            <w:tcW w:w="1154" w:type="dxa"/>
+            <w:vAlign w:val="center"/>
+            <w:hideMark/>
+          </w:tcPr>
+          <w:p>
+            <w:pPr>
+              <w:rPr>
+                <w:b/>
+                <w:bCs/>
+              </w:rPr>
+            </w:pPr>
+            <w:r>
+              <w:rPr>
+                <w:b/>
+                <w:bCs/>
+              </w:rPr>
+              <w:t>RF/RNF Associado</w:t>
+            </w:r>
+          </w:p>
+        </w:tc>
+      </w:tr>
+      <w:tr>
+        <w:trPr>
+          <w:tblCellSpacing w:w="15" w:type="dxa"/>
+        </w:trPr>
+        <w:tc>
+          <w:tcPr>
+            <w:tcW w:w="2649" w:type="dxa"/>
+            <w:vAlign w:val="center"/>
+            <w:hideMark/>
+          </w:tcPr>
+          <w:p>
+            <w:pPr>
+              <w:rPr>
+                <w:b/>
+                <w:bCs/>
+              </w:rPr>
+            </w:pPr>
+            <w:r>
+              <w:rPr>
+                <w:b/>
+                <w:bCs/>
+              </w:rPr>
+              <w:t>GRP_ALUNOS</w:t>
+            </w:r>
+          </w:p>
+        </w:tc>
+        <w:tc>
+          <w:tcPr>
+            <w:tcW w:w="4647" w:type="dxa"/>
+            <w:vAlign w:val="center"/>
+            <w:hideMark/>
+          </w:tcPr>
+          <w:p>
+            <w:r>
+              <w:t>Grupo geral de alunos, com acesso restrito a recursos acadêmicos.</w:t>
+            </w:r>
+          </w:p>
+        </w:tc>
+        <w:tc>
+          <w:tcPr>
+            <w:tcW w:w="1154" w:type="dxa"/>
+            <w:vAlign w:val="center"/>
+            <w:hideMark/>
+          </w:tcPr>
+          <w:p>
+            <w:r>
+              <w:t>RF02, RF03, RNF-03</w:t>
+            </w:r>
+          </w:p>
+        </w:tc>
+      </w:tr>
+      <w:tr>
+        <w:trPr>
+          <w:tblCellSpacing w:w="15" w:type="dxa"/>
+        </w:trPr>
+        <w:tc>
+          <w:tcPr>
+            <w:tcW w:w="2649" w:type="dxa"/>
+            <w:vAlign w:val="center"/>
+            <w:hideMark/>
+          </w:tcPr>
+          <w:p>
+            <w:pPr>
+              <w:rPr>
+                <w:b/>
+                <w:bCs/>
+              </w:rPr>
+            </w:pPr>
+            <w:r>
+              <w:rPr>
+                <w:b/>
+                <w:bCs/>
+              </w:rPr>
+              <w:t>GRP_PROFESSORES</w:t>
+            </w:r>
+          </w:p>
+        </w:tc>
+        <w:tc>
+          <w:tcPr>
+            <w:tcW w:w="4647" w:type="dxa"/>
+            <w:vAlign w:val="center"/>
+            <w:hideMark/>
+          </w:tcPr>
+          <w:p>
+            <w:r>
+              <w:t>Grupo geral de professores, com permissões ampliadas para ensino e compartilhamento.</w:t>
+            </w:r>
+          </w:p>
+        </w:tc>
+        <w:tc>
+          <w:tcPr>
+            <w:tcW w:w="1154" w:type="dxa"/>
+            <w:vAlign w:val="center"/>
+            <w:hideMark/>
+          </w:tcPr>
+          <w:p>
+            <w:r>
+              <w:t>RF02, RNF-03</w:t>
+            </w:r>
+          </w:p>
+        </w:tc>
+      </w:tr>
+      <w:tr>
+        <w:trPr>
+          <w:tblCellSpacing w:w="15" w:type="dxa"/>
+        </w:trPr>
+        <w:tc>
+          <w:tcPr>
+            <w:tcW w:w="2649" w:type="dxa"/>
+            <w:vAlign w:val="center"/>
+            <w:hideMark/>
+          </w:tcPr>
+          <w:p>
+            <w:pPr>
+              <w:rPr>
+                <w:b/>
+                <w:bCs/>
+              </w:rPr>
+            </w:pPr>
+            <w:r>
+              <w:rPr>
+                <w:b/>
+                <w:bCs/>
+              </w:rPr>
+              <w:t>GRP_CURSOS</w:t>
+            </w:r>
+          </w:p>
+        </w:tc>
+        <w:tc>
+          <w:tcPr>
+            <w:tcW w:w="4647" w:type="dxa"/>
+            <w:vAlign w:val="center"/>
+            <w:hideMark/>
+          </w:tcPr>
+          <w:p>
+            <w:r>
+              <w:t>Haverá grupos específicos para cada curso (ex.: Comércio Exterior, Design, Logística etc.), vinculados ao grupo de alunos e professores.</w:t>
+            </w:r>
+          </w:p>
+        </w:tc>
+        <w:tc>
+          <w:tcPr>
+            <w:tcW w:w="1154" w:type="dxa"/>
+            <w:vAlign w:val="center"/>
+            <w:hideMark/>
+          </w:tcPr>
+          <w:p>
+            <w:r>
+              <w:t>RF02, RNF-03</w:t>
+            </w:r>
+          </w:p>
+        </w:tc>
+      </w:tr>
+      <w:tr>
+        <w:trPr>
+          <w:tblCellSpacing w:w="15" w:type="dxa"/>
+        </w:trPr>
+        <w:tc>
+          <w:tcPr>
+            <w:tcW w:w="2649" w:type="dxa"/>
+            <w:vAlign w:val="center"/>
+            <w:hideMark/>
+          </w:tcPr>
+          <w:p>
+            <w:pPr>
+              <w:rPr>
+                <w:b/>
+                <w:bCs/>
+              </w:rPr>
+            </w:pPr>
+            <w:r>
+              <w:rPr>
+                <w:b/>
+                <w:bCs/>
+              </w:rPr>
+              <w:t>GRP_ADMINISTRATIVO</w:t>
+            </w:r>
+          </w:p>
+        </w:tc>
+        <w:tc>
+          <w:tcPr>
+            <w:tcW w:w="4647" w:type="dxa"/>
+            <w:vAlign w:val="center"/>
+            <w:hideMark/>
+          </w:tcPr>
+          <w:p>
+            <w:r>
+              <w:t>Grupo geral de funcionários administrativos, com acesso a sistemas internos e gestão.</w:t>
+            </w:r>
+          </w:p>
+        </w:tc>
+        <w:tc>
+          <w:tcPr>
+            <w:tcW w:w="1154" w:type="dxa"/>
+            <w:vAlign w:val="center"/>
+            <w:hideMark/>
+          </w:tcPr>
+          <w:p>
+            <w:r>
+              <w:t>RF02, RNF-03</w:t>
+            </w:r>
+          </w:p>
+        </w:tc>
+      </w:tr>
+    </w:tbl>
+    <w:p/>
+    <w:p>
+      <w:pPr>
+        <w:ind w:left="0" w:firstLine="0"/>
+      </w:pPr>
+    </w:p>
+    <w:p>
+      <w:pPr>
+        <w:ind w:left="0" w:firstLine="0"/>
+        <w:rPr>
+          <w:lang w:val="en-US"/>
+        </w:rPr>
+      </w:pPr>
+    </w:p>
+    <w:p>
+      <w:pPr>
+        <w:ind w:left="0" w:firstLine="0"/>
+      </w:pPr>
+    </w:p>
+    <w:p>
+      <w:pPr>
+        <w:ind w:left="0" w:firstLine="0"/>
+      </w:pPr>
+    </w:p>
+    <w:p>
+      <w:pPr>
+        <w:ind w:left="0" w:firstLine="0"/>
+      </w:pPr>
+    </w:p>
+    <w:p>
+      <w:pPr>
+        <w:ind w:left="0" w:firstLine="0"/>
+      </w:pPr>
+    </w:p>
+    <w:p>
+      <w:pPr>
+        <w:ind w:left="0" w:firstLine="0"/>
+      </w:pPr>
+    </w:p>
+    <w:p>
+      <w:pPr>
+        <w:ind w:left="0" w:firstLine="0"/>
+      </w:pPr>
+    </w:p>
     <w:p>
       <w:pPr>
         <w:pStyle w:val="Heading1"/>
@@ -5932,123 +6133,370 @@
           <w:numId w:val="12"/>
         </w:numPr>
       </w:pPr>
+      <w:bookmarkStart w:id="11" w:name="_Toc238763064"/>
       <w:r>
         <w:lastRenderedPageBreak/>
-        <w:t>Requisitos de Segurança</w:t>
-      </w:r>
-    </w:p>
-    <w:p/>
-    <w:p>
-      <w:r>
-        <w:t>Os requisitos de segurança do Active Directory da Fatec Barueri foram moldados em conjunto com a própria instituição, considerando suas necessidades acadêmicas e administrativas, além de referências internacionais como ISO/IEC 27001, NIST e o framework MITRE ATT&amp;CK, bem como a documentação oficial da Microsoft.</w:t>
-      </w:r>
-    </w:p>
-    <w:p>
-      <w:r>
-        <w:t>As principais políticas incluem:</w:t>
+        <w:t>Estrutura de grupos e Ous</w:t>
+      </w:r>
+      <w:bookmarkEnd w:id="11"/>
+    </w:p>
+    <w:p/>
+    <w:p>
+      <w:r>
+        <w:t xml:space="preserve">No domínio </w:t>
+      </w:r>
+      <w:r>
+        <w:rPr>
+          <w:b/>
+          <w:bCs/>
+        </w:rPr>
+        <w:t>adm.fatecbarueri.local</w:t>
+      </w:r>
+      <w:r>
+        <w:t xml:space="preserve">, a Fatec Barueri foi organizada em dois ambientes de Active Directory: </w:t>
+      </w:r>
+      <w:r>
+        <w:rPr>
+          <w:b/>
+          <w:bCs/>
+        </w:rPr>
+        <w:t>AD-ACAD</w:t>
+      </w:r>
+      <w:r>
+        <w:t xml:space="preserve"> e </w:t>
+      </w:r>
+      <w:r>
+        <w:rPr>
+          <w:b/>
+          <w:bCs/>
+        </w:rPr>
+        <w:t>AD-ADM</w:t>
+      </w:r>
+      <w:r>
+        <w:t>.</w:t>
       </w:r>
     </w:p>
     <w:p>
       <w:pPr>
         <w:numPr>
           <w:ilvl w:val="0"/>
-          <w:numId w:val="24"/>
+          <w:numId w:val="23"/>
         </w:numPr>
       </w:pPr>
       <w:r>
-        <w:t>Senhas Fortes: mínimo de 12 caracteres, incluindo letras maiúsculas, minúsculas, números e símbolos. As senhas expiram a cada 90 dias e devem ser trocadas no primeiro login.</w:t>
+        <w:t xml:space="preserve">O </w:t>
+      </w:r>
+      <w:r>
+        <w:rPr>
+          <w:b/>
+          <w:bCs/>
+        </w:rPr>
+        <w:t>AD-ACAD</w:t>
+      </w:r>
+      <w:r>
+        <w:t xml:space="preserve"> concentra usuários e computadores acadêmicos, com grupos de segurança separados por </w:t>
+      </w:r>
+      <w:r>
+        <w:rPr>
+          <w:b/>
+          <w:bCs/>
+        </w:rPr>
+        <w:t>cursos</w:t>
+      </w:r>
+      <w:r>
+        <w:t xml:space="preserve"> e perfis de </w:t>
+      </w:r>
+      <w:r>
+        <w:rPr>
+          <w:b/>
+          <w:bCs/>
+        </w:rPr>
+        <w:t>alunos e professores</w:t>
+      </w:r>
+      <w:r>
+        <w:t>.</w:t>
       </w:r>
     </w:p>
     <w:p>
       <w:pPr>
         <w:numPr>
           <w:ilvl w:val="0"/>
-          <w:numId w:val="24"/>
+          <w:numId w:val="23"/>
         </w:numPr>
       </w:pPr>
       <w:r>
-        <w:t>Bloqueio de Contas: após cinco tentativas consecutivas de login mal-sucedidas, prevenindo ataques de força bruta.</w:t>
-      </w:r>
-    </w:p>
-    <w:p>
-      <w:pPr>
-        <w:numPr>
-          <w:ilvl w:val="0"/>
-          <w:numId w:val="24"/>
-        </w:numPr>
-      </w:pPr>
-      <w:r>
-        <w:t>Restrições Administrativas: bloqueio do Editor de Registro, Prompt de Comando e Painel de Controle em laboratórios, além de impedir alterações na área de trabalho.</w:t>
-      </w:r>
-    </w:p>
-    <w:p>
-      <w:pPr>
-        <w:numPr>
-          <w:ilvl w:val="0"/>
-          <w:numId w:val="24"/>
-        </w:numPr>
-      </w:pPr>
-      <w:r>
-        <w:t>Auditoria de Acessos: todos os logins e falhas de autenticação são registrados em logs detalhados, com relatórios periódicos para análise da equipe de TI.</w:t>
-      </w:r>
-    </w:p>
-    <w:p>
-      <w:pPr>
-        <w:numPr>
-          <w:ilvl w:val="0"/>
-          <w:numId w:val="24"/>
-        </w:numPr>
-      </w:pPr>
-      <w:r>
-        <w:t>Controle de Softwares: bloqueio da instalação de programas sem privilégios administrativos e monitoramento do uso de dispositivos externos.</w:t>
-      </w:r>
-    </w:p>
-    <w:p>
-      <w:pPr>
-        <w:numPr>
-          <w:ilvl w:val="0"/>
-          <w:numId w:val="24"/>
-        </w:numPr>
-      </w:pPr>
-      <w:r>
-        <w:t>Sessões Ociosas: bloqueio automático após 1 hora de inatividade e desligamento fora do horário letivo (após 22h).</w:t>
-      </w:r>
-    </w:p>
-    <w:p>
-      <w:pPr>
-        <w:numPr>
-          <w:ilvl w:val="0"/>
-          <w:numId w:val="24"/>
-        </w:numPr>
-      </w:pPr>
-      <w:r>
-        <w:t>Atualizações Automáticas: aplicadas via GPO e monitoradas pelo Zabbix, garantindo conformidade.</w:t>
-      </w:r>
-    </w:p>
-    <w:p>
-      <w:pPr>
-        <w:numPr>
-          <w:ilvl w:val="0"/>
-          <w:numId w:val="24"/>
-        </w:numPr>
-      </w:pPr>
-      <w:r>
-        <w:t>Expurgo de Contas: bloqueio após 90 dias de inatividade e desativação automática após 3 meses, com registro em relatórios de auditoria.</w:t>
-      </w:r>
-    </w:p>
-    <w:p>
-      <w:r>
-        <w:t>Essa abordagem, construída em parceria com a Fatec Barueri, garante o princípio do menor privilégio, fortalece a governança digital e assegura conformidade com frameworks de segurança, sem necessidade de file store.</w:t>
-      </w:r>
-    </w:p>
-    <w:p/>
-    <w:p/>
-    <w:p/>
-    <w:p/>
-    <w:p/>
-    <w:p/>
-    <w:p/>
-    <w:p/>
+        <w:t xml:space="preserve">O </w:t>
+      </w:r>
+      <w:r>
+        <w:rPr>
+          <w:b/>
+          <w:bCs/>
+        </w:rPr>
+        <w:t>AD-ADM</w:t>
+      </w:r>
+      <w:r>
+        <w:t xml:space="preserve"> concentra usuários e computadores administrativos, com grupos de segurança separados por </w:t>
+      </w:r>
+      <w:r>
+        <w:rPr>
+          <w:b/>
+          <w:bCs/>
+        </w:rPr>
+        <w:t>departamentos institucionais</w:t>
+      </w:r>
+      <w:r>
+        <w:t>, conforme a estrutura organizacional oficial da Fatec Barueri.</w:t>
+      </w:r>
+    </w:p>
+    <w:p/>
+    <w:p>
+      <w:r>
+        <w:t>DOMINIO: adm.fatecbarueri.local</w:t>
+      </w:r>
+    </w:p>
+    <w:p>
+      <w:r>
+        <w:t>|</w:t>
+      </w:r>
+    </w:p>
+    <w:p>
+      <w:r>
+        <w:t>|- AD-ACAD</w:t>
+      </w:r>
+    </w:p>
+    <w:p>
+      <w:r>
+        <w:t>|    |- OU_Usuarios</w:t>
+      </w:r>
+    </w:p>
+    <w:p>
+      <w:r>
+        <w:t>|    |- OU_Computadores</w:t>
+      </w:r>
+    </w:p>
+    <w:p>
+      <w:r>
+        <w:t>|    |      |- SALA XX</w:t>
+      </w:r>
+    </w:p>
+    <w:p>
+      <w:r>
+        <w:t>|    |- Grupos (Cursos)</w:t>
+      </w:r>
+    </w:p>
+    <w:p>
+      <w:r>
+        <w:t>|           |- GRP_Alunos</w:t>
+      </w:r>
+    </w:p>
+    <w:p>
+      <w:r>
+        <w:t>|           |- GRP_Professores</w:t>
+      </w:r>
+    </w:p>
+    <w:p>
+      <w:r>
+        <w:t>|           |- GRP_ComercioExterior</w:t>
+      </w:r>
+    </w:p>
+    <w:p>
+      <w:r>
+        <w:t>|           |- GRP_DesignMidiasDigitais</w:t>
+      </w:r>
+    </w:p>
+    <w:p>
+      <w:r>
+        <w:t>|           |- GRP_GestaoEventos</w:t>
+      </w:r>
+    </w:p>
+    <w:p>
+      <w:r>
+        <w:t>|           |- GRP_RecursosHumanos</w:t>
+      </w:r>
+    </w:p>
+    <w:p>
+      <w:r>
+        <w:t>|           |- GRP_TecnologiaInformacao</w:t>
+      </w:r>
+    </w:p>
+    <w:p>
+      <w:r>
+        <w:t>|           |- GRP_ComercioEletronico</w:t>
+      </w:r>
+    </w:p>
+    <w:p>
+      <w:r>
+        <w:t>|           |- GRP_NegociosPessoas</w:t>
+      </w:r>
+    </w:p>
+    <w:p>
+      <w:r>
+        <w:t>|           |- GRP_Logistica</w:t>
+      </w:r>
+    </w:p>
+    <w:p>
+      <w:r>
+        <w:t>|           |- GRP_GestaoEmpresarialEAD</w:t>
+      </w:r>
+    </w:p>
+    <w:p>
+      <w:r>
+        <w:t>|           |- GRP_TransporteTerrestre</w:t>
+      </w:r>
+    </w:p>
+    <w:p>
+      <w:r>
+        <w:t>|</w:t>
+      </w:r>
+    </w:p>
+    <w:p>
+      <w:pPr>
+        <w:ind w:left="0" w:firstLine="0"/>
+      </w:pPr>
+    </w:p>
+    <w:p>
+      <w:pPr>
+        <w:ind w:left="0" w:firstLine="0"/>
+      </w:pPr>
+    </w:p>
+    <w:p>
+      <w:pPr>
+        <w:ind w:left="0" w:firstLine="0"/>
+      </w:pPr>
+    </w:p>
+    <w:p>
+      <w:pPr>
+        <w:ind w:left="0" w:firstLine="0"/>
+      </w:pPr>
+    </w:p>
+    <w:p>
+      <w:r>
+        <w:lastRenderedPageBreak/>
+        <w:t>|- AD-ADM</w:t>
+      </w:r>
+    </w:p>
+    <w:p>
+      <w:r>
+        <w:t xml:space="preserve">     |- OU_Usuarios</w:t>
+      </w:r>
+    </w:p>
+    <w:p>
+      <w:r>
+        <w:t xml:space="preserve">     |- OU_Computadores</w:t>
+      </w:r>
+    </w:p>
+    <w:p>
+      <w:r>
+        <w:t xml:space="preserve">     |</w:t>
+      </w:r>
+    </w:p>
+    <w:p>
+      <w:r>
+        <w:t xml:space="preserve">     |- Grupos (Departamentos)</w:t>
+      </w:r>
+    </w:p>
+    <w:p>
+      <w:r>
+        <w:t xml:space="preserve">            |- GRP_Congregacao</w:t>
+      </w:r>
+    </w:p>
+    <w:p>
+      <w:r>
+        <w:t xml:space="preserve">            |- GRP_Coordenacao</w:t>
+      </w:r>
+    </w:p>
+    <w:p>
+      <w:r>
+        <w:t xml:space="preserve">            |- GRP_ChefiaServicosAdministrativos</w:t>
+      </w:r>
+    </w:p>
+    <w:p>
+      <w:r>
+        <w:t xml:space="preserve">            |- GRP_ChefiaServicosAcademicos</w:t>
+      </w:r>
+    </w:p>
+    <w:p>
+      <w:r>
+        <w:t xml:space="preserve">            |- GRP_CoordenadoriasCursos</w:t>
+      </w:r>
+    </w:p>
+    <w:p>
+      <w:r>
+        <w:t xml:space="preserve">            |- GRP_OrientacaoPolo</w:t>
+      </w:r>
+    </w:p>
+    <w:p>
+      <w:r>
+        <w:t xml:space="preserve">            |- GRP_NucleosDocentesEstruturantes</w:t>
+      </w:r>
+    </w:p>
+    <w:p>
+      <w:r>
+        <w:t xml:space="preserve">            |- GRP_CorpoDocente</w:t>
+      </w:r>
+    </w:p>
+    <w:p>
+      <w:r>
+        <w:t xml:space="preserve">            |- GRP_AuxiliaresDocentes</w:t>
+      </w:r>
+    </w:p>
+    <w:p>
+      <w:r>
+        <w:t xml:space="preserve">            |- GRP_CorpoTecnicoAdministrativo</w:t>
+      </w:r>
+    </w:p>
+    <w:p>
+      <w:r>
+        <w:t xml:space="preserve">            |- GRP_ComissaoPropriaAvaliacao_CPA</w:t>
+      </w:r>
+    </w:p>
+    <w:p>
+      <w:r>
+        <w:t xml:space="preserve">            |- GRP_ComissaoInternaPrevencaoAcidentes_CIPA</w:t>
+      </w:r>
+    </w:p>
+    <w:p/>
+    <w:p>
+      <w:r>
+        <w:t xml:space="preserve">Essa organização garante clareza na gestão de acessos, aplicação segmentada de GPOs e conformidade com frameworks como </w:t>
+      </w:r>
+      <w:r>
+        <w:rPr>
+          <w:b/>
+          <w:bCs/>
+        </w:rPr>
+        <w:t>ITIL</w:t>
+      </w:r>
+      <w:r>
+        <w:t xml:space="preserve"> e </w:t>
+      </w:r>
+      <w:r>
+        <w:rPr>
+          <w:b/>
+          <w:bCs/>
+        </w:rPr>
+        <w:t>COBIT</w:t>
+      </w:r>
+      <w:r>
+        <w:t>, fortalecendo a governança digital da instituição.</w:t>
+      </w:r>
+    </w:p>
+    <w:p/>
+    <w:p/>
+    <w:p/>
+    <w:p/>
+    <w:p/>
+    <w:p/>
+    <w:p/>
+    <w:p/>
+    <w:p/>
+    <w:p/>
+    <w:p/>
+    <w:p>
+      <w:pPr>
+        <w:ind w:left="0" w:firstLine="0"/>
+      </w:pPr>
+    </w:p>
     <w:p>
       <w:pPr>
         <w:pStyle w:val="Heading1"/>
@@ -6057,25 +6505,202 @@
           <w:numId w:val="12"/>
         </w:numPr>
       </w:pPr>
+      <w:bookmarkStart w:id="12" w:name="_Toc238763065"/>
+      <w:r>
+        <w:t>Requisitos de Segurança</w:t>
+      </w:r>
+      <w:bookmarkEnd w:id="12"/>
+    </w:p>
+    <w:p/>
+    <w:p>
       <w:r>
         <w:lastRenderedPageBreak/>
+        <w:t>Os requisitos de segurança do Active Directory da Fatec Barueri foram moldados em conjunto com a própria instituição, considerando suas necessidades acadêmicas e administrativas, além de referências internacionais como ISO/IEC 27001, NIST e o framework MITRE ATT&amp;CK, bem como a documentação oficial da Microsoft.</w:t>
+      </w:r>
+    </w:p>
+    <w:p>
+      <w:r>
+        <w:t>As principais políticas incluem:</w:t>
+      </w:r>
+    </w:p>
+    <w:p>
+      <w:pPr>
+        <w:numPr>
+          <w:ilvl w:val="0"/>
+          <w:numId w:val="24"/>
+        </w:numPr>
+      </w:pPr>
+      <w:r>
+        <w:t>Senhas Fortes: mínimo de 12 caracteres, incluindo letras maiúsculas, minúsculas, números e símbolos. As senhas expiram a cada 90 dias e devem ser trocadas no primeiro login.</w:t>
+      </w:r>
+    </w:p>
+    <w:p>
+      <w:pPr>
+        <w:numPr>
+          <w:ilvl w:val="0"/>
+          <w:numId w:val="24"/>
+        </w:numPr>
+      </w:pPr>
+      <w:r>
+        <w:t>Bloqueio de Contas: após cinco tentativas consecutivas de login mal-sucedidas, prevenindo ataques de força bruta.</w:t>
+      </w:r>
+    </w:p>
+    <w:p>
+      <w:pPr>
+        <w:numPr>
+          <w:ilvl w:val="0"/>
+          <w:numId w:val="24"/>
+        </w:numPr>
+      </w:pPr>
+      <w:r>
+        <w:t>Restrições Administrativas: bloqueio do Editor de Registro, Prompt de Comando e Painel de Controle em laboratórios, além de impedir alterações na área de trabalho.</w:t>
+      </w:r>
+    </w:p>
+    <w:p>
+      <w:pPr>
+        <w:numPr>
+          <w:ilvl w:val="0"/>
+          <w:numId w:val="24"/>
+        </w:numPr>
+      </w:pPr>
+      <w:r>
+        <w:t>Auditoria de Acessos: todos os logins e falhas de autenticação são registrados em logs detalhados, com relatórios periódicos para análise da equipe de TI.</w:t>
+      </w:r>
+    </w:p>
+    <w:p>
+      <w:pPr>
+        <w:numPr>
+          <w:ilvl w:val="0"/>
+          <w:numId w:val="24"/>
+        </w:numPr>
+      </w:pPr>
+      <w:r>
+        <w:t>Controle de Softwares: bloqueio da instalação de programas sem privilégios administrativos e monitoramento do uso de dispositivos externos.</w:t>
+      </w:r>
+    </w:p>
+    <w:p>
+      <w:pPr>
+        <w:numPr>
+          <w:ilvl w:val="0"/>
+          <w:numId w:val="24"/>
+        </w:numPr>
+      </w:pPr>
+      <w:r>
+        <w:t>Sessões Ociosas: bloqueio automático após 1 hora de inatividade e desligamento fora do horário letivo (após 22h).</w:t>
+      </w:r>
+    </w:p>
+    <w:p>
+      <w:pPr>
+        <w:numPr>
+          <w:ilvl w:val="0"/>
+          <w:numId w:val="24"/>
+        </w:numPr>
+      </w:pPr>
+      <w:r>
+        <w:t>Atualizações Automáticas: aplicadas via GPO e monitoradas pelo Zabbix, garantindo conformidade.</w:t>
+      </w:r>
+    </w:p>
+    <w:p>
+      <w:pPr>
+        <w:numPr>
+          <w:ilvl w:val="0"/>
+          <w:numId w:val="24"/>
+        </w:numPr>
+      </w:pPr>
+      <w:r>
+        <w:t>Expurgo de Contas: bloqueio após 90 dias de inatividade e desativação automática após 3 meses, com registro em relatórios de auditoria.</w:t>
+      </w:r>
+    </w:p>
+    <w:p>
+      <w:r>
+        <w:t>Essa abordagem, construída em parceria com a Fatec Barueri, garante o princípio do menor privilégio, fortalece a governança digital e assegura conformidade com frameworks de segurança, sem necessidade de file store.</w:t>
+      </w:r>
+    </w:p>
+    <w:p/>
+    <w:p/>
+    <w:p/>
+    <w:p/>
+    <w:p/>
+    <w:p/>
+    <w:p>
+      <w:pPr>
+        <w:ind w:left="0" w:firstLine="0"/>
+      </w:pPr>
+    </w:p>
+    <w:p>
+      <w:pPr>
+        <w:ind w:left="0" w:firstLine="0"/>
+      </w:pPr>
+    </w:p>
+    <w:p>
+      <w:pPr>
+        <w:pStyle w:val="Heading1"/>
+        <w:numPr>
+          <w:ilvl w:val="0"/>
+          <w:numId w:val="12"/>
+        </w:numPr>
+      </w:pPr>
+      <w:bookmarkStart w:id="13" w:name="_Toc238763066"/>
+      <w:r>
         <w:t>Políticas de segurança (GPOs)</w:t>
       </w:r>
-    </w:p>
-    <w:p/>
-    <w:p>
-      <w:r>
-        <w:t>As políticas de segurança do Active Directory da Fatec Barueri foram planejadas em conjunto com a instituição, tomando como referência o documento RF-10 (Requisitos Não Funcionais), normas internacionais de segurança (ISO/IEC 27001, NIST) e boas práticas da Microsoft.</w:t>
-      </w:r>
-    </w:p>
-    <w:p>
-      <w:r>
-        <w:t>O objetivo é assegurar proteção contra acessos indevidos, uso incorreto de recursos e falhas de conformidade. Para isso, foram definidas regras de login e senha, bloqueio de contas após tentativas inválidas, restrições de dispositivos e softwares, auditoria de acessos com relatórios periódicos, aplicação do princípio do menor privilégio e centralização das permissões administrativas no grupo de TI.</w:t>
-      </w:r>
-    </w:p>
-    <w:p>
-      <w:r>
-        <w:t>Além disso, foram estabelecidas medidas de controle de sessões ociosas e desligamento automático fora do horário letivo, garantindo economia de energia e maior segurança. Todas as políticas foram registradas em tabela e documentadas para garantir rastreabilidade, conformidade e governança digital, fortalecendo a segurança do ambiente acadêmico e administrativo da Fatec Barueri.</w:t>
+      <w:bookmarkEnd w:id="13"/>
+    </w:p>
+    <w:p/>
+    <w:p>
+      <w:r>
+        <w:lastRenderedPageBreak/>
+        <w:t xml:space="preserve">As políticas de segurança do Active Directory da Fatec Barueri foram planejadas com base nos </w:t>
+      </w:r>
+      <w:r>
+        <w:rPr>
+          <w:b/>
+          <w:bCs/>
+        </w:rPr>
+        <w:t>Requisitos Funcionais (RFs)</w:t>
+      </w:r>
+      <w:r>
+        <w:t xml:space="preserve"> e </w:t>
+      </w:r>
+      <w:r>
+        <w:rPr>
+          <w:b/>
+          <w:bCs/>
+        </w:rPr>
+        <w:t>Não Funcionais (RNFs)</w:t>
+      </w:r>
+      <w:r>
+        <w:t xml:space="preserve">, garantindo alinhamento às boas práticas da Microsoft e aos frameworks de governança </w:t>
+      </w:r>
+      <w:r>
+        <w:rPr>
+          <w:b/>
+          <w:bCs/>
+        </w:rPr>
+        <w:t>ITIL</w:t>
+      </w:r>
+      <w:r>
+        <w:t xml:space="preserve"> e </w:t>
+      </w:r>
+      <w:r>
+        <w:rPr>
+          <w:b/>
+          <w:bCs/>
+        </w:rPr>
+        <w:t>COBIT</w:t>
+      </w:r>
+      <w:r>
+        <w:t>.</w:t>
+      </w:r>
+    </w:p>
+    <w:p>
+      <w:r>
+        <w:t>O objetivo é assegurar proteção contra acessos indevidos, uso incorreto de recursos e falhas de conformidade. As políticas definidas incluem regras de login e senha, bloqueio de contas após tentativas inválidas, auditoria de acessos com relatórios periódicos, aplicação do princípio do menor privilégio e centralização das permissões administrativas no grupo de TI.</w:t>
+      </w:r>
+    </w:p>
+    <w:p>
+      <w:r>
+        <w:t>Além disso, foram estabelecidas medidas de controle de sessões ociosas, desligamento automático fora do horário letivo e personalização visual por perfil, garantindo que cada grupo de usuários (Aluno, Professor, Administrativo e TI) tenha um papel de parede padrão aplicado via GPO.</w:t>
       </w:r>
     </w:p>
     <w:p/>
@@ -6084,6 +6709,7 @@
         <w:tblW w:w="0" w:type="auto"/>
         <w:tblCellSpacing w:w="15" w:type="dxa"/>
         <w:tblBorders>
+          <w:bottom w:val="single" w:sz="4" w:space="0" w:color="auto"/>
           <w:insideH w:val="single" w:sz="4" w:space="0" w:color="auto"/>
           <w:insideV w:val="single" w:sz="4" w:space="0" w:color="auto"/>
         </w:tblBorders>
@@ -6096,9 +6722,9 @@
         <w:tblLook w:val="04A0" w:firstRow="1" w:lastRow="0" w:firstColumn="1" w:lastColumn="0" w:noHBand="0" w:noVBand="1"/>
       </w:tblPr>
       <w:tblGrid>
-        <w:gridCol w:w="2157"/>
-        <w:gridCol w:w="1970"/>
-        <w:gridCol w:w="4443"/>
+        <w:gridCol w:w="2284"/>
+        <w:gridCol w:w="4976"/>
+        <w:gridCol w:w="1310"/>
       </w:tblGrid>
       <w:tr>
         <w:trPr>
@@ -6107,46 +6733,67 @@
         </w:trPr>
         <w:tc>
           <w:tcPr>
-            <w:tcW w:w="0" w:type="auto"/>
+            <w:tcW w:w="2239" w:type="dxa"/>
             <w:vAlign w:val="center"/>
             <w:hideMark/>
           </w:tcPr>
           <w:p>
             <w:pPr>
-              <w:ind w:left="0" w:firstLine="0"/>
+              <w:rPr>
+                <w:b/>
+                <w:bCs/>
+              </w:rPr>
             </w:pPr>
             <w:r>
-              <w:t>Categoria</w:t>
-            </w:r>
-          </w:p>
-        </w:tc>
-        <w:tc>
-          <w:tcPr>
-            <w:tcW w:w="0" w:type="auto"/>
+              <w:rPr>
+                <w:b/>
+                <w:bCs/>
+              </w:rPr>
+              <w:t>Política</w:t>
+            </w:r>
+          </w:p>
+        </w:tc>
+        <w:tc>
+          <w:tcPr>
+            <w:tcW w:w="4946" w:type="dxa"/>
             <w:vAlign w:val="center"/>
             <w:hideMark/>
           </w:tcPr>
           <w:p>
             <w:pPr>
-              <w:ind w:left="0" w:firstLine="0"/>
+              <w:rPr>
+                <w:b/>
+                <w:bCs/>
+              </w:rPr>
             </w:pPr>
             <w:r>
-              <w:t>Política</w:t>
-            </w:r>
-          </w:p>
-        </w:tc>
-        <w:tc>
-          <w:tcPr>
-            <w:tcW w:w="0" w:type="auto"/>
+              <w:rPr>
+                <w:b/>
+                <w:bCs/>
+              </w:rPr>
+              <w:t>Descrição / Aplicação</w:t>
+            </w:r>
+          </w:p>
+        </w:tc>
+        <w:tc>
+          <w:tcPr>
+            <w:tcW w:w="1265" w:type="dxa"/>
             <w:vAlign w:val="center"/>
             <w:hideMark/>
           </w:tcPr>
           <w:p>
             <w:pPr>
-              <w:ind w:left="0" w:firstLine="0"/>
+              <w:rPr>
+                <w:b/>
+                <w:bCs/>
+              </w:rPr>
             </w:pPr>
             <w:r>
-              <w:t>Descrição / Aplicação</w:t>
+              <w:rPr>
+                <w:b/>
+                <w:bCs/>
+              </w:rPr>
+              <w:t>RF/RNF Associado</w:t>
             </w:r>
           </w:p>
         </w:tc>
@@ -6157,26 +6804,11 @@
         </w:trPr>
         <w:tc>
           <w:tcPr>
-            <w:tcW w:w="0" w:type="auto"/>
-            <w:vAlign w:val="center"/>
-            <w:hideMark/>
-          </w:tcPr>
-          <w:p>
-            <w:r>
-              <w:t>Login e Senhas</w:t>
-            </w:r>
-          </w:p>
-        </w:tc>
-        <w:tc>
-          <w:tcPr>
-            <w:tcW w:w="0" w:type="auto"/>
-            <w:vAlign w:val="center"/>
-            <w:hideMark/>
-          </w:tcPr>
-          <w:p>
-            <w:pPr>
-              <w:ind w:left="0" w:firstLine="0"/>
-            </w:pPr>
+            <w:tcW w:w="2239" w:type="dxa"/>
+            <w:vAlign w:val="center"/>
+            <w:hideMark/>
+          </w:tcPr>
+          <w:p>
             <w:r>
               <w:t>Senhas fortes</w:t>
             </w:r>
@@ -6184,16 +6816,25 @@
         </w:tc>
         <w:tc>
           <w:tcPr>
-            <w:tcW w:w="0" w:type="auto"/>
-            <w:vAlign w:val="center"/>
-            <w:hideMark/>
-          </w:tcPr>
-          <w:p>
-            <w:pPr>
-              <w:ind w:left="0" w:firstLine="0"/>
-            </w:pPr>
-            <w:r>
-              <w:t>Mínimo de 12 caracteres, incluindo maiúsculas, minúsculas, números e símbolos</w:t>
+            <w:tcW w:w="4946" w:type="dxa"/>
+            <w:vAlign w:val="center"/>
+            <w:hideMark/>
+          </w:tcPr>
+          <w:p>
+            <w:r>
+              <w:t>Senhas com mínimo de 12 caracteres, incluindo maiúsculas, minúsculas, números e símbolos. Troca obrigatória no primeiro login.</w:t>
+            </w:r>
+          </w:p>
+        </w:tc>
+        <w:tc>
+          <w:tcPr>
+            <w:tcW w:w="1265" w:type="dxa"/>
+            <w:vAlign w:val="center"/>
+            <w:hideMark/>
+          </w:tcPr>
+          <w:p>
+            <w:r>
+              <w:t>RF03, RNF-02</w:t>
             </w:r>
           </w:p>
         </w:tc>
@@ -6204,43 +6845,37 @@
         </w:trPr>
         <w:tc>
           <w:tcPr>
-            <w:tcW w:w="0" w:type="auto"/>
-            <w:vAlign w:val="center"/>
-            <w:hideMark/>
-          </w:tcPr>
-          <w:p>
-            <w:pPr>
-              <w:ind w:left="0" w:firstLine="0"/>
-            </w:pPr>
-          </w:p>
-        </w:tc>
-        <w:tc>
-          <w:tcPr>
-            <w:tcW w:w="0" w:type="auto"/>
-            <w:vAlign w:val="center"/>
-            <w:hideMark/>
-          </w:tcPr>
-          <w:p>
-            <w:pPr>
-              <w:ind w:left="0" w:firstLine="0"/>
-            </w:pPr>
-            <w:r>
-              <w:t>Expiração periódica</w:t>
-            </w:r>
-          </w:p>
-        </w:tc>
-        <w:tc>
-          <w:tcPr>
-            <w:tcW w:w="0" w:type="auto"/>
-            <w:vAlign w:val="center"/>
-            <w:hideMark/>
-          </w:tcPr>
-          <w:p>
-            <w:pPr>
-              <w:ind w:left="0" w:firstLine="0"/>
-            </w:pPr>
-            <w:r>
-              <w:t>Redefinição obrigatória a cada 90 dias</w:t>
+            <w:tcW w:w="2239" w:type="dxa"/>
+            <w:vAlign w:val="center"/>
+            <w:hideMark/>
+          </w:tcPr>
+          <w:p>
+            <w:r>
+              <w:t>Bloqueio de contas</w:t>
+            </w:r>
+          </w:p>
+        </w:tc>
+        <w:tc>
+          <w:tcPr>
+            <w:tcW w:w="4946" w:type="dxa"/>
+            <w:vAlign w:val="center"/>
+            <w:hideMark/>
+          </w:tcPr>
+          <w:p>
+            <w:r>
+              <w:t>Bloqueio automático após 5 tentativas inválidas consecutivas.</w:t>
+            </w:r>
+          </w:p>
+        </w:tc>
+        <w:tc>
+          <w:tcPr>
+            <w:tcW w:w="1265" w:type="dxa"/>
+            <w:vAlign w:val="center"/>
+            <w:hideMark/>
+          </w:tcPr>
+          <w:p>
+            <w:r>
+              <w:t>RF03, RNF-02</w:t>
             </w:r>
           </w:p>
         </w:tc>
@@ -6251,43 +6886,37 @@
         </w:trPr>
         <w:tc>
           <w:tcPr>
-            <w:tcW w:w="0" w:type="auto"/>
-            <w:vAlign w:val="center"/>
-            <w:hideMark/>
-          </w:tcPr>
-          <w:p>
-            <w:pPr>
-              <w:ind w:left="0" w:firstLine="0"/>
-            </w:pPr>
-          </w:p>
-        </w:tc>
-        <w:tc>
-          <w:tcPr>
-            <w:tcW w:w="0" w:type="auto"/>
-            <w:vAlign w:val="center"/>
-            <w:hideMark/>
-          </w:tcPr>
-          <w:p>
-            <w:pPr>
-              <w:ind w:left="0" w:firstLine="0"/>
-            </w:pPr>
-            <w:r>
-              <w:t>Troca inicial</w:t>
-            </w:r>
-          </w:p>
-        </w:tc>
-        <w:tc>
-          <w:tcPr>
-            <w:tcW w:w="0" w:type="auto"/>
-            <w:vAlign w:val="center"/>
-            <w:hideMark/>
-          </w:tcPr>
-          <w:p>
-            <w:pPr>
-              <w:ind w:left="0" w:firstLine="0"/>
-            </w:pPr>
-            <w:r>
-              <w:t>Senha gerada deve ser alterada no primeiro login</w:t>
+            <w:tcW w:w="2239" w:type="dxa"/>
+            <w:vAlign w:val="center"/>
+            <w:hideMark/>
+          </w:tcPr>
+          <w:p>
+            <w:r>
+              <w:t>Registro de acessos</w:t>
+            </w:r>
+          </w:p>
+        </w:tc>
+        <w:tc>
+          <w:tcPr>
+            <w:tcW w:w="4946" w:type="dxa"/>
+            <w:vAlign w:val="center"/>
+            <w:hideMark/>
+          </w:tcPr>
+          <w:p>
+            <w:r>
+              <w:t>Monitoramento de logins, falhas de autenticação e acessos críticos.</w:t>
+            </w:r>
+          </w:p>
+        </w:tc>
+        <w:tc>
+          <w:tcPr>
+            <w:tcW w:w="1265" w:type="dxa"/>
+            <w:vAlign w:val="center"/>
+            <w:hideMark/>
+          </w:tcPr>
+          <w:p>
+            <w:r>
+              <w:t>RF06, RNF-06</w:t>
             </w:r>
           </w:p>
         </w:tc>
@@ -6298,43 +6927,37 @@
         </w:trPr>
         <w:tc>
           <w:tcPr>
-            <w:tcW w:w="0" w:type="auto"/>
-            <w:vAlign w:val="center"/>
-            <w:hideMark/>
-          </w:tcPr>
-          <w:p>
-            <w:pPr>
-              <w:ind w:left="0" w:firstLine="0"/>
-            </w:pPr>
-          </w:p>
-        </w:tc>
-        <w:tc>
-          <w:tcPr>
-            <w:tcW w:w="0" w:type="auto"/>
-            <w:vAlign w:val="center"/>
-            <w:hideMark/>
-          </w:tcPr>
-          <w:p>
-            <w:pPr>
-              <w:ind w:left="0" w:firstLine="0"/>
-            </w:pPr>
-            <w:r>
-              <w:t>Bloqueio de contas</w:t>
-            </w:r>
-          </w:p>
-        </w:tc>
-        <w:tc>
-          <w:tcPr>
-            <w:tcW w:w="0" w:type="auto"/>
-            <w:vAlign w:val="center"/>
-            <w:hideMark/>
-          </w:tcPr>
-          <w:p>
-            <w:pPr>
-              <w:ind w:left="0" w:firstLine="0"/>
-            </w:pPr>
-            <w:r>
-              <w:t>Bloqueio automático após 5 tentativas inválidas</w:t>
+            <w:tcW w:w="2239" w:type="dxa"/>
+            <w:vAlign w:val="center"/>
+            <w:hideMark/>
+          </w:tcPr>
+          <w:p>
+            <w:r>
+              <w:t>Relatórios periódicos</w:t>
+            </w:r>
+          </w:p>
+        </w:tc>
+        <w:tc>
+          <w:tcPr>
+            <w:tcW w:w="4946" w:type="dxa"/>
+            <w:vAlign w:val="center"/>
+            <w:hideMark/>
+          </w:tcPr>
+          <w:p>
+            <w:r>
+              <w:t>Relatórios mensais consolidados para análise da equipe de TI.</w:t>
+            </w:r>
+          </w:p>
+        </w:tc>
+        <w:tc>
+          <w:tcPr>
+            <w:tcW w:w="1265" w:type="dxa"/>
+            <w:vAlign w:val="center"/>
+            <w:hideMark/>
+          </w:tcPr>
+          <w:p>
+            <w:r>
+              <w:t>RF06, RNF-06</w:t>
             </w:r>
           </w:p>
         </w:tc>
@@ -6345,46 +6968,37 @@
         </w:trPr>
         <w:tc>
           <w:tcPr>
-            <w:tcW w:w="0" w:type="auto"/>
-            <w:vAlign w:val="center"/>
-            <w:hideMark/>
-          </w:tcPr>
-          <w:p>
-            <w:pPr>
-              <w:ind w:left="0" w:firstLine="0"/>
-            </w:pPr>
-            <w:r>
-              <w:t>Restrições de Dispositivos</w:t>
-            </w:r>
-          </w:p>
-        </w:tc>
-        <w:tc>
-          <w:tcPr>
-            <w:tcW w:w="0" w:type="auto"/>
-            <w:vAlign w:val="center"/>
-            <w:hideMark/>
-          </w:tcPr>
-          <w:p>
-            <w:pPr>
-              <w:ind w:left="0" w:firstLine="0"/>
-            </w:pPr>
-            <w:r>
-              <w:t>Bloqueio de USBs</w:t>
-            </w:r>
-          </w:p>
-        </w:tc>
-        <w:tc>
-          <w:tcPr>
-            <w:tcW w:w="0" w:type="auto"/>
-            <w:vAlign w:val="center"/>
-            <w:hideMark/>
-          </w:tcPr>
-          <w:p>
-            <w:pPr>
-              <w:ind w:left="0" w:firstLine="0"/>
-            </w:pPr>
-            <w:r>
-              <w:t>Impedir uso de dispositivos externos não autorizados</w:t>
+            <w:tcW w:w="2239" w:type="dxa"/>
+            <w:vAlign w:val="center"/>
+            <w:hideMark/>
+          </w:tcPr>
+          <w:p>
+            <w:r>
+              <w:t>Menor privilégio</w:t>
+            </w:r>
+          </w:p>
+        </w:tc>
+        <w:tc>
+          <w:tcPr>
+            <w:tcW w:w="4946" w:type="dxa"/>
+            <w:vAlign w:val="center"/>
+            <w:hideMark/>
+          </w:tcPr>
+          <w:p>
+            <w:r>
+              <w:t>Usuários comuns sem acesso a ferramentas críticas (CMD, Registro, Painel de Controle).</w:t>
+            </w:r>
+          </w:p>
+        </w:tc>
+        <w:tc>
+          <w:tcPr>
+            <w:tcW w:w="1265" w:type="dxa"/>
+            <w:vAlign w:val="center"/>
+            <w:hideMark/>
+          </w:tcPr>
+          <w:p>
+            <w:r>
+              <w:t>RF02, RNF-03</w:t>
             </w:r>
           </w:p>
         </w:tc>
@@ -6395,43 +7009,37 @@
         </w:trPr>
         <w:tc>
           <w:tcPr>
-            <w:tcW w:w="0" w:type="auto"/>
-            <w:vAlign w:val="center"/>
-            <w:hideMark/>
-          </w:tcPr>
-          <w:p>
-            <w:pPr>
-              <w:ind w:left="0" w:firstLine="0"/>
-            </w:pPr>
-          </w:p>
-        </w:tc>
-        <w:tc>
-          <w:tcPr>
-            <w:tcW w:w="0" w:type="auto"/>
-            <w:vAlign w:val="center"/>
-            <w:hideMark/>
-          </w:tcPr>
-          <w:p>
-            <w:pPr>
-              <w:ind w:left="0" w:firstLine="0"/>
-            </w:pPr>
-            <w:r>
-              <w:t>Controle de softwares</w:t>
-            </w:r>
-          </w:p>
-        </w:tc>
-        <w:tc>
-          <w:tcPr>
-            <w:tcW w:w="0" w:type="auto"/>
-            <w:vAlign w:val="center"/>
-            <w:hideMark/>
-          </w:tcPr>
-          <w:p>
-            <w:pPr>
-              <w:ind w:left="0" w:firstLine="0"/>
-            </w:pPr>
-            <w:r>
-              <w:t>Bloquear instalação sem privilégios administrativos</w:t>
+            <w:tcW w:w="2239" w:type="dxa"/>
+            <w:vAlign w:val="center"/>
+            <w:hideMark/>
+          </w:tcPr>
+          <w:p>
+            <w:r>
+              <w:t>Centralização no TI</w:t>
+            </w:r>
+          </w:p>
+        </w:tc>
+        <w:tc>
+          <w:tcPr>
+            <w:tcW w:w="4946" w:type="dxa"/>
+            <w:vAlign w:val="center"/>
+            <w:hideMark/>
+          </w:tcPr>
+          <w:p>
+            <w:r>
+              <w:t>Apenas grupo de TI com privilégios administrativos.</w:t>
+            </w:r>
+          </w:p>
+        </w:tc>
+        <w:tc>
+          <w:tcPr>
+            <w:tcW w:w="1265" w:type="dxa"/>
+            <w:vAlign w:val="center"/>
+            <w:hideMark/>
+          </w:tcPr>
+          <w:p>
+            <w:r>
+              <w:t>RF02, RNF-03</w:t>
             </w:r>
           </w:p>
         </w:tc>
@@ -6442,46 +7050,37 @@
         </w:trPr>
         <w:tc>
           <w:tcPr>
-            <w:tcW w:w="0" w:type="auto"/>
-            <w:vAlign w:val="center"/>
-            <w:hideMark/>
-          </w:tcPr>
-          <w:p>
-            <w:pPr>
-              <w:ind w:left="0" w:firstLine="0"/>
-            </w:pPr>
-            <w:r>
-              <w:t>Auditoria e Logs</w:t>
-            </w:r>
-          </w:p>
-        </w:tc>
-        <w:tc>
-          <w:tcPr>
-            <w:tcW w:w="0" w:type="auto"/>
-            <w:vAlign w:val="center"/>
-            <w:hideMark/>
-          </w:tcPr>
-          <w:p>
-            <w:pPr>
-              <w:ind w:left="0" w:firstLine="0"/>
-            </w:pPr>
-            <w:r>
-              <w:t>Registro de acessos</w:t>
-            </w:r>
-          </w:p>
-        </w:tc>
-        <w:tc>
-          <w:tcPr>
-            <w:tcW w:w="0" w:type="auto"/>
-            <w:vAlign w:val="center"/>
-            <w:hideMark/>
-          </w:tcPr>
-          <w:p>
-            <w:pPr>
-              <w:ind w:left="0" w:firstLine="0"/>
-            </w:pPr>
-            <w:r>
-              <w:t>Monitorar logins, falhas de autenticação e acessos críticos</w:t>
+            <w:tcW w:w="2239" w:type="dxa"/>
+            <w:vAlign w:val="center"/>
+            <w:hideMark/>
+          </w:tcPr>
+          <w:p>
+            <w:r>
+              <w:t>Sessões ociosas</w:t>
+            </w:r>
+          </w:p>
+        </w:tc>
+        <w:tc>
+          <w:tcPr>
+            <w:tcW w:w="4946" w:type="dxa"/>
+            <w:vAlign w:val="center"/>
+            <w:hideMark/>
+          </w:tcPr>
+          <w:p>
+            <w:r>
+              <w:t>Bloqueio automático após 1h de inatividade, exigindo novo login.</w:t>
+            </w:r>
+          </w:p>
+        </w:tc>
+        <w:tc>
+          <w:tcPr>
+            <w:tcW w:w="1265" w:type="dxa"/>
+            <w:vAlign w:val="center"/>
+            <w:hideMark/>
+          </w:tcPr>
+          <w:p>
+            <w:r>
+              <w:t>RF03, RNF-07</w:t>
             </w:r>
           </w:p>
         </w:tc>
@@ -6492,43 +7091,37 @@
         </w:trPr>
         <w:tc>
           <w:tcPr>
-            <w:tcW w:w="0" w:type="auto"/>
-            <w:vAlign w:val="center"/>
-            <w:hideMark/>
-          </w:tcPr>
-          <w:p>
-            <w:pPr>
-              <w:ind w:left="0" w:firstLine="0"/>
-            </w:pPr>
-          </w:p>
-        </w:tc>
-        <w:tc>
-          <w:tcPr>
-            <w:tcW w:w="0" w:type="auto"/>
-            <w:vAlign w:val="center"/>
-            <w:hideMark/>
-          </w:tcPr>
-          <w:p>
-            <w:pPr>
-              <w:ind w:left="0" w:firstLine="0"/>
-            </w:pPr>
-            <w:r>
-              <w:t>Relatórios periódicos</w:t>
-            </w:r>
-          </w:p>
-        </w:tc>
-        <w:tc>
-          <w:tcPr>
-            <w:tcW w:w="0" w:type="auto"/>
-            <w:vAlign w:val="center"/>
-            <w:hideMark/>
-          </w:tcPr>
-          <w:p>
-            <w:pPr>
-              <w:ind w:left="0" w:firstLine="0"/>
-            </w:pPr>
-            <w:r>
-              <w:t>Geração de relatórios mensais para análise da equipe de TI</w:t>
+            <w:tcW w:w="2239" w:type="dxa"/>
+            <w:vAlign w:val="center"/>
+            <w:hideMark/>
+          </w:tcPr>
+          <w:p>
+            <w:r>
+              <w:t>Desligamento automático</w:t>
+            </w:r>
+          </w:p>
+        </w:tc>
+        <w:tc>
+          <w:tcPr>
+            <w:tcW w:w="4946" w:type="dxa"/>
+            <w:vAlign w:val="center"/>
+            <w:hideMark/>
+          </w:tcPr>
+          <w:p>
+            <w:r>
+              <w:t>Desligamento das máquinas fora do horário letivo (após 22h).</w:t>
+            </w:r>
+          </w:p>
+        </w:tc>
+        <w:tc>
+          <w:tcPr>
+            <w:tcW w:w="1265" w:type="dxa"/>
+            <w:vAlign w:val="center"/>
+            <w:hideMark/>
+          </w:tcPr>
+          <w:p>
+            <w:r>
+              <w:t>RF03, RNF-07</w:t>
             </w:r>
           </w:p>
         </w:tc>
@@ -6539,191 +7132,37 @@
         </w:trPr>
         <w:tc>
           <w:tcPr>
-            <w:tcW w:w="0" w:type="auto"/>
-            <w:vAlign w:val="center"/>
-            <w:hideMark/>
-          </w:tcPr>
-          <w:p>
-            <w:pPr>
-              <w:ind w:left="0" w:firstLine="0"/>
-            </w:pPr>
-            <w:r>
-              <w:lastRenderedPageBreak/>
-              <w:t>Permissões Administrativas</w:t>
-            </w:r>
-          </w:p>
-        </w:tc>
-        <w:tc>
-          <w:tcPr>
-            <w:tcW w:w="0" w:type="auto"/>
-            <w:vAlign w:val="center"/>
-            <w:hideMark/>
-          </w:tcPr>
-          <w:p>
-            <w:pPr>
-              <w:ind w:left="0" w:firstLine="0"/>
-            </w:pPr>
-            <w:r>
-              <w:t>Menor privilégio</w:t>
-            </w:r>
-          </w:p>
-        </w:tc>
-        <w:tc>
-          <w:tcPr>
-            <w:tcW w:w="0" w:type="auto"/>
-            <w:vAlign w:val="center"/>
-            <w:hideMark/>
-          </w:tcPr>
-          <w:p>
-            <w:pPr>
-              <w:ind w:left="0" w:firstLine="0"/>
-            </w:pPr>
-            <w:r>
-              <w:t>Usuários comuns sem acesso a ferramentas críticas (Prompt, Registro, Painel de Controle)</w:t>
-            </w:r>
-          </w:p>
-        </w:tc>
-      </w:tr>
-      <w:tr>
-        <w:trPr>
-          <w:tblCellSpacing w:w="15" w:type="dxa"/>
-        </w:trPr>
-        <w:tc>
-          <w:tcPr>
-            <w:tcW w:w="0" w:type="auto"/>
-            <w:vAlign w:val="center"/>
-            <w:hideMark/>
-          </w:tcPr>
-          <w:p>
-            <w:pPr>
-              <w:ind w:left="0" w:firstLine="0"/>
-            </w:pPr>
-          </w:p>
-        </w:tc>
-        <w:tc>
-          <w:tcPr>
-            <w:tcW w:w="0" w:type="auto"/>
-            <w:vAlign w:val="center"/>
-            <w:hideMark/>
-          </w:tcPr>
-          <w:p>
-            <w:pPr>
-              <w:ind w:left="0" w:firstLine="0"/>
-            </w:pPr>
-            <w:r>
-              <w:t>Centralização no TI</w:t>
-            </w:r>
-          </w:p>
-        </w:tc>
-        <w:tc>
-          <w:tcPr>
-            <w:tcW w:w="0" w:type="auto"/>
-            <w:vAlign w:val="center"/>
-            <w:hideMark/>
-          </w:tcPr>
-          <w:p>
-            <w:pPr>
-              <w:ind w:left="0" w:firstLine="0"/>
-            </w:pPr>
-            <w:r>
-              <w:t>Apenas grupo de TI com privilégios administrativos</w:t>
-            </w:r>
-          </w:p>
-        </w:tc>
-      </w:tr>
-      <w:tr>
-        <w:trPr>
-          <w:tblCellSpacing w:w="15" w:type="dxa"/>
-        </w:trPr>
-        <w:tc>
-          <w:tcPr>
-            <w:tcW w:w="0" w:type="auto"/>
-            <w:vAlign w:val="center"/>
-            <w:hideMark/>
-          </w:tcPr>
-          <w:p>
-            <w:pPr>
-              <w:ind w:left="0" w:firstLine="0"/>
-            </w:pPr>
-            <w:r>
-              <w:t>Sessões e Uso</w:t>
-            </w:r>
-          </w:p>
-        </w:tc>
-        <w:tc>
-          <w:tcPr>
-            <w:tcW w:w="0" w:type="auto"/>
-            <w:vAlign w:val="center"/>
-            <w:hideMark/>
-          </w:tcPr>
-          <w:p>
-            <w:pPr>
-              <w:ind w:left="0" w:firstLine="0"/>
-            </w:pPr>
-            <w:r>
-              <w:t>Sessões ociosas</w:t>
-            </w:r>
-          </w:p>
-        </w:tc>
-        <w:tc>
-          <w:tcPr>
-            <w:tcW w:w="0" w:type="auto"/>
-            <w:vAlign w:val="center"/>
-            <w:hideMark/>
-          </w:tcPr>
-          <w:p>
-            <w:pPr>
-              <w:ind w:left="0" w:firstLine="0"/>
-            </w:pPr>
-            <w:r>
-              <w:t>Bloqueio automático após 1 hora de inatividade</w:t>
-            </w:r>
-          </w:p>
-        </w:tc>
-      </w:tr>
-      <w:tr>
-        <w:trPr>
-          <w:tblCellSpacing w:w="15" w:type="dxa"/>
-        </w:trPr>
-        <w:tc>
-          <w:tcPr>
-            <w:tcW w:w="0" w:type="auto"/>
-            <w:vAlign w:val="center"/>
-            <w:hideMark/>
-          </w:tcPr>
-          <w:p>
-            <w:pPr>
-              <w:ind w:left="0" w:firstLine="0"/>
-            </w:pPr>
-          </w:p>
-        </w:tc>
-        <w:tc>
-          <w:tcPr>
-            <w:tcW w:w="0" w:type="auto"/>
-            <w:vAlign w:val="center"/>
-            <w:hideMark/>
-          </w:tcPr>
-          <w:p>
-            <w:pPr>
-              <w:ind w:left="0" w:firstLine="0"/>
-            </w:pPr>
-            <w:r>
-              <w:t>Desligamento automático</w:t>
-            </w:r>
-          </w:p>
-        </w:tc>
-        <w:tc>
-          <w:tcPr>
-            <w:tcW w:w="0" w:type="auto"/>
-            <w:vAlign w:val="center"/>
-            <w:hideMark/>
-          </w:tcPr>
-          <w:p>
-            <w:pPr>
-              <w:ind w:left="0" w:firstLine="0"/>
-            </w:pPr>
-            <w:r>
-              <w:t>Desligamento fora do horário letivo (após 22h)</w:t>
+            <w:tcW w:w="2239" w:type="dxa"/>
+            <w:vAlign w:val="center"/>
+            <w:hideMark/>
+          </w:tcPr>
+          <w:p>
+            <w:r>
+              <w:t>Papel de parede por perfil</w:t>
+            </w:r>
+          </w:p>
+        </w:tc>
+        <w:tc>
+          <w:tcPr>
+            <w:tcW w:w="4946" w:type="dxa"/>
+            <w:vAlign w:val="center"/>
+            <w:hideMark/>
+          </w:tcPr>
+          <w:p>
+            <w:r>
+              <w:t>Cada perfil (Aluno, Professor, Administrativo, TI) terá um papel de parede padrão definido via GPO.</w:t>
+            </w:r>
+          </w:p>
+        </w:tc>
+        <w:tc>
+          <w:tcPr>
+            <w:tcW w:w="1265" w:type="dxa"/>
+            <w:vAlign w:val="center"/>
+            <w:hideMark/>
+          </w:tcPr>
+          <w:p>
+            <w:r>
+              <w:t>RF03, RNF-07</w:t>
             </w:r>
           </w:p>
         </w:tc>
@@ -7737,7 +8176,7 @@
   <w:abstractNum w:abstractNumId="5" w15:restartNumberingAfterBreak="0">
     <w:nsid w:val="13E43B28"/>
     <w:multiLevelType w:val="hybridMultilevel"/>
-    <w:tmpl w:val="9234487E"/>
+    <w:tmpl w:val="CA3E5C6C"/>
     <w:lvl w:ilvl="0" w:tplc="0416000F">
       <w:start w:val="1"/>
       <w:numFmt w:val="decimal"/>

</xml_diff>